<commit_message>
update analysis with references
</commit_message>
<xml_diff>
--- a/04-Ethics/01_Ethics_Packet_2026.docx
+++ b/04-Ethics/01_Ethics_Packet_2026.docx
@@ -1,6 +1,6 @@
 
 <file path=word/document.xml><?xml version="1.0" encoding="utf-8"?>
-<w:document xmlns:wpc="http://schemas.microsoft.com/office/word/2010/wordprocessingCanvas" xmlns:cx="http://schemas.microsoft.com/office/drawing/2014/chartex" xmlns:cx1="http://schemas.microsoft.com/office/drawing/2015/9/8/chartex" xmlns:cx2="http://schemas.microsoft.com/office/drawing/2015/10/21/chartex" xmlns:cx3="http://schemas.microsoft.com/office/drawing/2016/5/9/chartex" xmlns:cx4="http://schemas.microsoft.com/office/drawing/2016/5/10/chartex" xmlns:cx5="http://schemas.microsoft.com/office/drawing/2016/5/11/chartex" xmlns:cx6="http://schemas.microsoft.com/office/drawing/2016/5/12/chartex" xmlns:cx7="http://schemas.microsoft.com/office/drawing/2016/5/13/chartex" xmlns:cx8="http://schemas.microsoft.com/office/drawing/2016/5/14/chartex" xmlns:mc="http://schemas.openxmlformats.org/markup-compatibility/2006" xmlns:aink="http://schemas.microsoft.com/office/drawing/2016/ink" xmlns:am3d="http://schemas.microsoft.com/office/drawing/2017/model3d" xmlns:o="urn:schemas-microsoft-com:office:office" xmlns:oel="http://schemas.microsoft.com/office/2019/extlst" xmlns:r="http://schemas.openxmlformats.org/officeDocument/2006/relationships" xmlns:m="http://schemas.openxmlformats.org/officeDocument/2006/math" xmlns:v="urn:schemas-microsoft-com:vml" xmlns:wp14="http://schemas.microsoft.com/office/word/2010/wordprocessingDrawing" xmlns:wp="http://schemas.openxmlformats.org/drawingml/2006/wordprocessingDrawing" xmlns:w10="urn:schemas-microsoft-com:office:word" xmlns:w="http://schemas.openxmlformats.org/wordprocessingml/2006/main" xmlns:w14="http://schemas.microsoft.com/office/word/2010/wordml" xmlns:w15="http://schemas.microsoft.com/office/word/2012/wordml" xmlns:w16cex="http://schemas.microsoft.com/office/word/2018/wordml/cex" xmlns:w16cid="http://schemas.microsoft.com/office/word/2016/wordml/cid" xmlns:w16="http://schemas.microsoft.com/office/word/2018/wordml" xmlns:w16du="http://schemas.microsoft.com/office/word/2023/wordml/word16du" xmlns:w16sdtdh="http://schemas.microsoft.com/office/word/2020/wordml/sdtdatahash" xmlns:w16sdtfl="http://schemas.microsoft.com/office/word/2024/wordml/sdtformatlock" xmlns:w16se="http://schemas.microsoft.com/office/word/2015/wordml/symex" xmlns:wpg="http://schemas.microsoft.com/office/word/2010/wordprocessingGroup" xmlns:wpi="http://schemas.microsoft.com/office/word/2010/wordprocessingInk" xmlns:wne="http://schemas.microsoft.com/office/word/2006/wordml" xmlns:wps="http://schemas.microsoft.com/office/word/2010/wordprocessingShape" mc:Ignorable="w14 w15 w16se w16cid w16 w16cex w16sdtdh w16sdtfl w16du wp14">
+<w:document xmlns:wpc="http://schemas.microsoft.com/office/word/2010/wordprocessingCanvas" xmlns:cx="http://schemas.microsoft.com/office/drawing/2014/chartex" xmlns:cx1="http://schemas.microsoft.com/office/drawing/2015/9/8/chartex" xmlns:cx2="http://schemas.microsoft.com/office/drawing/2015/10/21/chartex" xmlns:cx3="http://schemas.microsoft.com/office/drawing/2016/5/9/chartex" xmlns:cx4="http://schemas.microsoft.com/office/drawing/2016/5/10/chartex" xmlns:cx5="http://schemas.microsoft.com/office/drawing/2016/5/11/chartex" xmlns:cx6="http://schemas.microsoft.com/office/drawing/2016/5/12/chartex" xmlns:cx7="http://schemas.microsoft.com/office/drawing/2016/5/13/chartex" xmlns:cx8="http://schemas.microsoft.com/office/drawing/2016/5/14/chartex" xmlns:mc="http://schemas.openxmlformats.org/markup-compatibility/2006" xmlns:m="http://schemas.openxmlformats.org/officeDocument/2006/math" xmlns:aink="http://schemas.microsoft.com/office/drawing/2016/ink" xmlns:am3d="http://schemas.microsoft.com/office/drawing/2017/model3d" xmlns:oel="http://schemas.microsoft.com/office/2019/extlst" xmlns:r="http://schemas.openxmlformats.org/officeDocument/2006/relationships" xmlns:wp14="http://schemas.microsoft.com/office/word/2010/wordprocessingDrawing" xmlns:wp="http://schemas.openxmlformats.org/drawingml/2006/wordprocessingDrawing" xmlns:wpg="http://schemas.microsoft.com/office/word/2010/wordprocessingGroup" xmlns:wpi="http://schemas.microsoft.com/office/word/2010/wordprocessingInk" xmlns:wps="http://schemas.microsoft.com/office/word/2010/wordprocessingShape" xmlns:o="urn:schemas-microsoft-com:office:office" xmlns:v="urn:schemas-microsoft-com:vml" xmlns:w10="urn:schemas-microsoft-com:office:word" xmlns:w="http://schemas.openxmlformats.org/wordprocessingml/2006/main" xmlns:w14="http://schemas.microsoft.com/office/word/2010/wordml" xmlns:w15="http://schemas.microsoft.com/office/word/2012/wordml" xmlns:w16cei="http://schemas.microsoft.com/office/word/2026/wordml/cei" xmlns:w16cex="http://schemas.microsoft.com/office/word/2018/wordml/cex" xmlns:w16cid="http://schemas.microsoft.com/office/word/2016/wordml/cid" xmlns:w16="http://schemas.microsoft.com/office/word/2018/wordml" xmlns:w16sdtdh="http://schemas.microsoft.com/office/word/2020/wordml/sdtdatahash" xmlns:w16sdtfl="http://schemas.microsoft.com/office/word/2024/wordml/sdtformatlock" xmlns:w16se="http://schemas.microsoft.com/office/word/2015/wordml/symex" xmlns:w16du="http://schemas.microsoft.com/office/word/2023/wordml/word16du" xmlns:wne="http://schemas.microsoft.com/office/word/2006/wordml" mc:Ignorable="w14 w15 w16se w16cid w16 w16cex w16sdtdh w16sdtfl w16du wp14">
   <w:body>
     <w:p>
       <w:pPr>
@@ -85,7 +85,7 @@
               <w:tab w:val="right" w:leader="dot" w:pos="9010"/>
             </w:tabs>
             <w:rPr>
-              <w:rFonts w:asciiTheme="minorHAnsi" w:eastAsiaTheme="minorEastAsia" w:hAnsiTheme="minorHAnsi" w:cstheme="minorBidi"/>
+              <w:rFonts w:ascii="Arial" w:eastAsiaTheme="minorEastAsia" w:hAnsi="Arial" w:cs="Arial"/>
               <w:noProof/>
               <w:kern w:val="2"/>
               <w14:ligatures w14:val="standardContextual"/>
@@ -127,7 +127,7 @@
               <w:tab w:val="right" w:leader="dot" w:pos="9010"/>
             </w:tabs>
             <w:rPr>
-              <w:rFonts w:asciiTheme="minorHAnsi" w:eastAsiaTheme="minorEastAsia" w:hAnsiTheme="minorHAnsi" w:cstheme="minorBidi"/>
+              <w:rFonts w:ascii="Arial" w:eastAsiaTheme="minorEastAsia" w:hAnsi="Arial" w:cs="Arial"/>
               <w:noProof/>
               <w:kern w:val="2"/>
               <w14:ligatures w14:val="standardContextual"/>
@@ -151,7 +151,7 @@
               <w:tab w:val="right" w:leader="dot" w:pos="9010"/>
             </w:tabs>
             <w:rPr>
-              <w:rFonts w:asciiTheme="minorHAnsi" w:eastAsiaTheme="minorEastAsia" w:hAnsiTheme="minorHAnsi" w:cstheme="minorBidi"/>
+              <w:rFonts w:ascii="Arial" w:eastAsiaTheme="minorEastAsia" w:hAnsi="Arial" w:cs="Arial"/>
               <w:noProof/>
               <w:kern w:val="2"/>
               <w14:ligatures w14:val="standardContextual"/>
@@ -175,7 +175,7 @@
               <w:tab w:val="right" w:leader="dot" w:pos="9010"/>
             </w:tabs>
             <w:rPr>
-              <w:rFonts w:asciiTheme="minorHAnsi" w:eastAsiaTheme="minorEastAsia" w:hAnsiTheme="minorHAnsi" w:cstheme="minorBidi"/>
+              <w:rFonts w:ascii="Arial" w:eastAsiaTheme="minorEastAsia" w:hAnsi="Arial" w:cs="Arial"/>
               <w:noProof/>
               <w:kern w:val="2"/>
               <w14:ligatures w14:val="standardContextual"/>
@@ -199,7 +199,7 @@
               <w:tab w:val="right" w:leader="dot" w:pos="9010"/>
             </w:tabs>
             <w:rPr>
-              <w:rFonts w:asciiTheme="minorHAnsi" w:eastAsiaTheme="minorEastAsia" w:hAnsiTheme="minorHAnsi" w:cstheme="minorBidi"/>
+              <w:rFonts w:ascii="Arial" w:eastAsiaTheme="minorEastAsia" w:hAnsi="Arial" w:cs="Arial"/>
               <w:noProof/>
               <w:kern w:val="2"/>
               <w14:ligatures w14:val="standardContextual"/>
@@ -223,7 +223,7 @@
               <w:tab w:val="right" w:leader="dot" w:pos="9010"/>
             </w:tabs>
             <w:rPr>
-              <w:rFonts w:asciiTheme="minorHAnsi" w:eastAsiaTheme="minorEastAsia" w:hAnsiTheme="minorHAnsi" w:cstheme="minorBidi"/>
+              <w:rFonts w:ascii="Arial" w:eastAsiaTheme="minorEastAsia" w:hAnsi="Arial" w:cs="Arial"/>
               <w:noProof/>
               <w:kern w:val="2"/>
               <w14:ligatures w14:val="standardContextual"/>
@@ -247,7 +247,7 @@
               <w:tab w:val="right" w:leader="dot" w:pos="9010"/>
             </w:tabs>
             <w:rPr>
-              <w:rFonts w:asciiTheme="minorHAnsi" w:eastAsiaTheme="minorEastAsia" w:hAnsiTheme="minorHAnsi" w:cstheme="minorBidi"/>
+              <w:rFonts w:ascii="Arial" w:eastAsiaTheme="minorEastAsia" w:hAnsi="Arial" w:cs="Arial"/>
               <w:noProof/>
               <w:kern w:val="2"/>
               <w14:ligatures w14:val="standardContextual"/>
@@ -271,7 +271,7 @@
               <w:tab w:val="right" w:leader="dot" w:pos="9010"/>
             </w:tabs>
             <w:rPr>
-              <w:rFonts w:asciiTheme="minorHAnsi" w:eastAsiaTheme="minorEastAsia" w:hAnsiTheme="minorHAnsi" w:cstheme="minorBidi"/>
+              <w:rFonts w:ascii="Arial" w:eastAsiaTheme="minorEastAsia" w:hAnsi="Arial" w:cs="Arial"/>
               <w:noProof/>
               <w:kern w:val="2"/>
               <w14:ligatures w14:val="standardContextual"/>
@@ -295,7 +295,7 @@
               <w:tab w:val="right" w:leader="dot" w:pos="9010"/>
             </w:tabs>
             <w:rPr>
-              <w:rFonts w:asciiTheme="minorHAnsi" w:eastAsiaTheme="minorEastAsia" w:hAnsiTheme="minorHAnsi" w:cstheme="minorBidi"/>
+              <w:rFonts w:ascii="Arial" w:eastAsiaTheme="minorEastAsia" w:hAnsi="Arial" w:cs="Arial"/>
               <w:noProof/>
               <w:kern w:val="2"/>
               <w14:ligatures w14:val="standardContextual"/>
@@ -319,7 +319,7 @@
               <w:tab w:val="right" w:leader="dot" w:pos="9010"/>
             </w:tabs>
             <w:rPr>
-              <w:rFonts w:asciiTheme="minorHAnsi" w:eastAsiaTheme="minorEastAsia" w:hAnsiTheme="minorHAnsi" w:cstheme="minorBidi"/>
+              <w:rFonts w:ascii="Arial" w:eastAsiaTheme="minorEastAsia" w:hAnsi="Arial" w:cs="Arial"/>
               <w:noProof/>
               <w:kern w:val="2"/>
               <w14:ligatures w14:val="standardContextual"/>
@@ -343,7 +343,7 @@
               <w:tab w:val="right" w:leader="dot" w:pos="9010"/>
             </w:tabs>
             <w:rPr>
-              <w:rFonts w:asciiTheme="minorHAnsi" w:eastAsiaTheme="minorEastAsia" w:hAnsiTheme="minorHAnsi" w:cstheme="minorBidi"/>
+              <w:rFonts w:ascii="Arial" w:eastAsiaTheme="minorEastAsia" w:hAnsi="Arial" w:cs="Arial"/>
               <w:noProof/>
               <w:kern w:val="2"/>
               <w14:ligatures w14:val="standardContextual"/>
@@ -367,7 +367,7 @@
               <w:tab w:val="right" w:leader="dot" w:pos="9010"/>
             </w:tabs>
             <w:rPr>
-              <w:rFonts w:asciiTheme="minorHAnsi" w:eastAsiaTheme="minorEastAsia" w:hAnsiTheme="minorHAnsi" w:cstheme="minorBidi"/>
+              <w:rFonts w:ascii="Arial" w:eastAsiaTheme="minorEastAsia" w:hAnsi="Arial" w:cs="Arial"/>
               <w:noProof/>
               <w:kern w:val="2"/>
               <w14:ligatures w14:val="standardContextual"/>
@@ -391,7 +391,7 @@
               <w:tab w:val="right" w:leader="dot" w:pos="9010"/>
             </w:tabs>
             <w:rPr>
-              <w:rFonts w:asciiTheme="minorHAnsi" w:eastAsiaTheme="minorEastAsia" w:hAnsiTheme="minorHAnsi" w:cstheme="minorBidi"/>
+              <w:rFonts w:ascii="Arial" w:eastAsiaTheme="minorEastAsia" w:hAnsi="Arial" w:cs="Arial"/>
               <w:noProof/>
               <w:kern w:val="2"/>
               <w14:ligatures w14:val="standardContextual"/>
@@ -415,7 +415,7 @@
               <w:tab w:val="right" w:leader="dot" w:pos="9010"/>
             </w:tabs>
             <w:rPr>
-              <w:rFonts w:asciiTheme="minorHAnsi" w:eastAsiaTheme="minorEastAsia" w:hAnsiTheme="minorHAnsi" w:cstheme="minorBidi"/>
+              <w:rFonts w:ascii="Arial" w:eastAsiaTheme="minorEastAsia" w:hAnsi="Arial" w:cs="Arial"/>
               <w:noProof/>
               <w:kern w:val="2"/>
               <w14:ligatures w14:val="standardContextual"/>
@@ -439,7 +439,7 @@
               <w:tab w:val="right" w:leader="dot" w:pos="9010"/>
             </w:tabs>
             <w:rPr>
-              <w:rFonts w:asciiTheme="minorHAnsi" w:eastAsiaTheme="minorEastAsia" w:hAnsiTheme="minorHAnsi" w:cstheme="minorBidi"/>
+              <w:rFonts w:ascii="Arial" w:eastAsiaTheme="minorEastAsia" w:hAnsi="Arial" w:cs="Arial"/>
               <w:noProof/>
               <w:kern w:val="2"/>
               <w14:ligatures w14:val="standardContextual"/>
@@ -463,7 +463,7 @@
               <w:tab w:val="right" w:leader="dot" w:pos="9010"/>
             </w:tabs>
             <w:rPr>
-              <w:rFonts w:asciiTheme="minorHAnsi" w:eastAsiaTheme="minorEastAsia" w:hAnsiTheme="minorHAnsi" w:cstheme="minorBidi"/>
+              <w:rFonts w:ascii="Arial" w:eastAsiaTheme="minorEastAsia" w:hAnsi="Arial" w:cs="Arial"/>
               <w:noProof/>
               <w:kern w:val="2"/>
               <w14:ligatures w14:val="standardContextual"/>
@@ -487,7 +487,7 @@
               <w:tab w:val="right" w:leader="dot" w:pos="9010"/>
             </w:tabs>
             <w:rPr>
-              <w:rFonts w:asciiTheme="minorHAnsi" w:eastAsiaTheme="minorEastAsia" w:hAnsiTheme="minorHAnsi" w:cstheme="minorBidi"/>
+              <w:rFonts w:ascii="Arial" w:eastAsiaTheme="minorEastAsia" w:hAnsi="Arial" w:cs="Arial"/>
               <w:noProof/>
               <w:kern w:val="2"/>
               <w14:ligatures w14:val="standardContextual"/>
@@ -511,7 +511,7 @@
               <w:tab w:val="right" w:leader="dot" w:pos="9010"/>
             </w:tabs>
             <w:rPr>
-              <w:rFonts w:asciiTheme="minorHAnsi" w:eastAsiaTheme="minorEastAsia" w:hAnsiTheme="minorHAnsi" w:cstheme="minorBidi"/>
+              <w:rFonts w:ascii="Arial" w:eastAsiaTheme="minorEastAsia" w:hAnsi="Arial" w:cs="Arial"/>
               <w:noProof/>
               <w:kern w:val="2"/>
               <w14:ligatures w14:val="standardContextual"/>
@@ -762,13 +762,6 @@
           <w:szCs w:val="22"/>
         </w:rPr>
         <w:tab/>
-      </w:r>
-      <w:r>
-        <w:rPr>
-          <w:rFonts w:ascii="Arial" w:eastAsia="Arial" w:hAnsi="Arial" w:cs="Arial"/>
-          <w:sz w:val="22"/>
-          <w:szCs w:val="22"/>
-        </w:rPr>
         <w:t>X Adults (18 years of age or older)</w:t>
       </w:r>
     </w:p>
@@ -923,6 +916,48 @@
         </w:rPr>
         <w:tab/>
         <w:t xml:space="preserve">X Other: </w:t>
+      </w:r>
+      <w:r>
+        <w:rPr>
+          <w:rFonts w:ascii="Arial" w:eastAsia="Arial" w:hAnsi="Arial" w:cs="Arial"/>
+          <w:sz w:val="22"/>
+          <w:szCs w:val="22"/>
+        </w:rPr>
+        <w:t xml:space="preserve">Sampling platforms like </w:t>
+      </w:r>
+      <w:proofErr w:type="spellStart"/>
+      <w:r>
+        <w:rPr>
+          <w:rFonts w:ascii="Arial" w:eastAsia="Arial" w:hAnsi="Arial" w:cs="Arial"/>
+          <w:sz w:val="22"/>
+          <w:szCs w:val="22"/>
+        </w:rPr>
+        <w:t>Besample</w:t>
+      </w:r>
+      <w:proofErr w:type="spellEnd"/>
+      <w:r>
+        <w:rPr>
+          <w:rFonts w:ascii="Arial" w:eastAsia="Arial" w:hAnsi="Arial" w:cs="Arial"/>
+          <w:sz w:val="22"/>
+          <w:szCs w:val="22"/>
+        </w:rPr>
+        <w:t xml:space="preserve"> Prolific, et</w:t>
+      </w:r>
+      <w:r>
+        <w:rPr>
+          <w:rFonts w:ascii="Arial" w:eastAsia="Arial" w:hAnsi="Arial" w:cs="Arial"/>
+          <w:sz w:val="22"/>
+          <w:szCs w:val="22"/>
+        </w:rPr>
+        <w:t>c</w:t>
+      </w:r>
+      <w:r>
+        <w:rPr>
+          <w:rFonts w:ascii="Arial" w:eastAsia="Arial" w:hAnsi="Arial" w:cs="Arial"/>
+          <w:sz w:val="22"/>
+          <w:szCs w:val="22"/>
+        </w:rPr>
+        <w:t>.</w:t>
       </w:r>
     </w:p>
     <w:p>
@@ -1011,13 +1046,24 @@
       <w:pPr>
         <w:rPr>
           <w:rFonts w:ascii="Arial" w:eastAsia="Arial" w:hAnsi="Arial" w:cs="Arial"/>
-          <w:sz w:val="22"/>
-          <w:szCs w:val="22"/>
-        </w:rPr>
-      </w:pPr>
-      <w:r>
-        <w:rPr>
-          <w:rFonts w:ascii="Arial" w:eastAsia="Arial" w:hAnsi="Arial" w:cs="Arial"/>
+          <w:bCs/>
+          <w:sz w:val="22"/>
+          <w:szCs w:val="22"/>
+        </w:rPr>
+      </w:pPr>
+      <w:r>
+        <w:rPr>
+          <w:rFonts w:ascii="Arial" w:eastAsia="Arial" w:hAnsi="Arial" w:cs="Arial"/>
+          <w:bCs/>
+          <w:sz w:val="22"/>
+          <w:szCs w:val="22"/>
+        </w:rPr>
+        <w:t>Which level of application does your study fall into?</w:t>
+      </w:r>
+      <w:r>
+        <w:rPr>
+          <w:rFonts w:ascii="Arial" w:eastAsia="Arial" w:hAnsi="Arial" w:cs="Arial"/>
+          <w:bCs/>
           <w:sz w:val="22"/>
           <w:szCs w:val="22"/>
         </w:rPr>
@@ -1026,21 +1072,506 @@
       <w:r>
         <w:rPr>
           <w:rFonts w:ascii="Arial" w:eastAsia="Arial" w:hAnsi="Arial" w:cs="Arial"/>
-          <w:b/>
-          <w:sz w:val="22"/>
-          <w:szCs w:val="22"/>
-        </w:rPr>
-        <w:t xml:space="preserve">ADD THE EXPEDITED STUFF HERE </w:t>
-      </w:r>
-    </w:p>
-    <w:p>
-      <w:pPr>
-        <w:rPr>
-          <w:rFonts w:ascii="Arial" w:eastAsia="Arial" w:hAnsi="Arial" w:cs="Arial"/>
-          <w:sz w:val="22"/>
-          <w:szCs w:val="22"/>
-        </w:rPr>
-      </w:pPr>
+          <w:bCs/>
+          <w:i/>
+          <w:iCs/>
+          <w:sz w:val="22"/>
+          <w:szCs w:val="22"/>
+        </w:rPr>
+        <w:t>Expedited: Survey research of individuals with no more than minimal risk, Interviews of individuals with no more than minimal risk, Experimental research with no more than minimal risk, or Use of public or secondary where there is more than minimal risk (including physical, social, psychological, and privacy risks for either individuals or groups)</w:t>
+      </w:r>
+    </w:p>
+    <w:p>
+      <w:pPr>
+        <w:rPr>
+          <w:rFonts w:ascii="Arial" w:eastAsia="Arial" w:hAnsi="Arial" w:cs="Arial"/>
+          <w:bCs/>
+          <w:sz w:val="22"/>
+          <w:szCs w:val="22"/>
+        </w:rPr>
+      </w:pPr>
+    </w:p>
+    <w:p>
+      <w:pPr>
+        <w:rPr>
+          <w:rFonts w:ascii="Arial" w:eastAsia="Arial" w:hAnsi="Arial" w:cs="Arial"/>
+          <w:bCs/>
+          <w:i/>
+          <w:iCs/>
+          <w:sz w:val="22"/>
+          <w:szCs w:val="22"/>
+        </w:rPr>
+      </w:pPr>
+      <w:r>
+        <w:rPr>
+          <w:rFonts w:ascii="Arial" w:eastAsia="Arial" w:hAnsi="Arial" w:cs="Arial"/>
+          <w:bCs/>
+          <w:sz w:val="22"/>
+          <w:szCs w:val="22"/>
+        </w:rPr>
+        <w:t>What category of research is involved? See OHRP for further information and criteria, &lt;https://www.hhs.gov/ohrp/regulations-and-policy/guidance/categories-of-research-expedited-review-procedure-1998/index.html&gt;. If conducting a survey, interview, or focus group, Category 7 is likely the most appropriate category.</w:t>
+      </w:r>
+      <w:r>
+        <w:rPr>
+          <w:rFonts w:ascii="Arial" w:eastAsia="Arial" w:hAnsi="Arial" w:cs="Arial"/>
+          <w:bCs/>
+          <w:sz w:val="22"/>
+          <w:szCs w:val="22"/>
+        </w:rPr>
+        <w:t xml:space="preserve"> </w:t>
+      </w:r>
+      <w:r>
+        <w:rPr>
+          <w:rFonts w:ascii="Arial" w:eastAsia="Arial" w:hAnsi="Arial" w:cs="Arial"/>
+          <w:bCs/>
+          <w:i/>
+          <w:iCs/>
+          <w:sz w:val="22"/>
+          <w:szCs w:val="22"/>
+        </w:rPr>
+        <w:t>Category 7: Research on individual or group characteristics or behavior (including, but not limited to, research on perception, cognition, motivation, identity, language, communication, cultural beliefs or practices, and social behavior) or research employing survey, interview, oral history, focus group, program evaluation, human factors evaluation, or quality assurance methodologies.</w:t>
+      </w:r>
+    </w:p>
+    <w:p>
+      <w:pPr>
+        <w:rPr>
+          <w:rFonts w:ascii="Arial" w:eastAsia="Arial" w:hAnsi="Arial" w:cs="Arial"/>
+          <w:bCs/>
+          <w:sz w:val="22"/>
+          <w:szCs w:val="22"/>
+        </w:rPr>
+      </w:pPr>
+    </w:p>
+    <w:p>
+      <w:pPr>
+        <w:pStyle w:val="Heading3"/>
+        <w:rPr>
+          <w:rFonts w:ascii="Arial" w:hAnsi="Arial" w:cs="Arial"/>
+        </w:rPr>
+      </w:pPr>
+      <w:r>
+        <w:rPr>
+          <w:rFonts w:ascii="Arial" w:hAnsi="Arial" w:cs="Arial"/>
+        </w:rPr>
+        <w:t>HU Specific Questions:</w:t>
+      </w:r>
+    </w:p>
+    <w:p>
+      <w:pPr>
+        <w:rPr>
+          <w:rStyle w:val="text-format-content"/>
+          <w:rFonts w:ascii="Arial" w:hAnsi="Arial" w:cs="Arial"/>
+        </w:rPr>
+      </w:pPr>
+    </w:p>
+    <w:p>
+      <w:pPr>
+        <w:rPr>
+          <w:rStyle w:val="text-format-content"/>
+          <w:rFonts w:ascii="Arial" w:hAnsi="Arial" w:cs="Arial"/>
+          <w:sz w:val="22"/>
+          <w:szCs w:val="22"/>
+        </w:rPr>
+      </w:pPr>
+      <w:r>
+        <w:rPr>
+          <w:rStyle w:val="text-format-content"/>
+          <w:rFonts w:ascii="Arial" w:hAnsi="Arial" w:cs="Arial"/>
+          <w:sz w:val="22"/>
+          <w:szCs w:val="22"/>
+        </w:rPr>
+        <w:t>List all questions that participants will be asked</w:t>
+      </w:r>
+      <w:r>
+        <w:rPr>
+          <w:rStyle w:val="text-format-content"/>
+          <w:rFonts w:ascii="Arial" w:hAnsi="Arial" w:cs="Arial"/>
+          <w:sz w:val="22"/>
+          <w:szCs w:val="22"/>
+        </w:rPr>
+        <w:t xml:space="preserve">. </w:t>
+      </w:r>
+      <w:r>
+        <w:rPr>
+          <w:rStyle w:val="text-format-content"/>
+          <w:rFonts w:ascii="Arial" w:hAnsi="Arial" w:cs="Arial"/>
+          <w:i/>
+          <w:iCs/>
+          <w:sz w:val="22"/>
+          <w:szCs w:val="22"/>
+        </w:rPr>
+        <w:t xml:space="preserve">Please see specific study materials below. </w:t>
+      </w:r>
+    </w:p>
+    <w:p>
+      <w:pPr>
+        <w:rPr>
+          <w:rStyle w:val="text-format-content"/>
+          <w:rFonts w:ascii="Arial" w:hAnsi="Arial" w:cs="Arial"/>
+          <w:sz w:val="22"/>
+          <w:szCs w:val="22"/>
+        </w:rPr>
+      </w:pPr>
+    </w:p>
+    <w:p>
+      <w:pPr>
+        <w:rPr>
+          <w:rFonts w:ascii="Arial" w:eastAsia="Arial" w:hAnsi="Arial" w:cs="Arial"/>
+          <w:bCs/>
+          <w:i/>
+          <w:iCs/>
+          <w:sz w:val="22"/>
+          <w:szCs w:val="22"/>
+        </w:rPr>
+      </w:pPr>
+      <w:r>
+        <w:rPr>
+          <w:rFonts w:ascii="Arial" w:eastAsia="Arial" w:hAnsi="Arial" w:cs="Arial"/>
+          <w:bCs/>
+          <w:sz w:val="22"/>
+          <w:szCs w:val="22"/>
+        </w:rPr>
+        <w:t>If applicable, describe any stimuli or materials participants will be shown.</w:t>
+      </w:r>
+      <w:r>
+        <w:rPr>
+          <w:rFonts w:ascii="Arial" w:eastAsia="Arial" w:hAnsi="Arial" w:cs="Arial"/>
+          <w:bCs/>
+          <w:sz w:val="22"/>
+          <w:szCs w:val="22"/>
+        </w:rPr>
+        <w:t xml:space="preserve"> </w:t>
+      </w:r>
+      <w:r>
+        <w:rPr>
+          <w:rFonts w:ascii="Arial" w:eastAsia="Arial" w:hAnsi="Arial" w:cs="Arial"/>
+          <w:bCs/>
+          <w:i/>
+          <w:iCs/>
+          <w:sz w:val="22"/>
+          <w:szCs w:val="22"/>
+        </w:rPr>
+        <w:t xml:space="preserve">Please see materials section below. </w:t>
+      </w:r>
+    </w:p>
+    <w:p>
+      <w:pPr>
+        <w:rPr>
+          <w:rFonts w:ascii="Arial" w:eastAsia="Arial" w:hAnsi="Arial" w:cs="Arial"/>
+          <w:bCs/>
+          <w:i/>
+          <w:iCs/>
+          <w:sz w:val="22"/>
+          <w:szCs w:val="22"/>
+        </w:rPr>
+      </w:pPr>
+    </w:p>
+    <w:p>
+      <w:pPr>
+        <w:rPr>
+          <w:rFonts w:ascii="Arial" w:eastAsia="Arial" w:hAnsi="Arial" w:cs="Arial"/>
+          <w:bCs/>
+          <w:i/>
+          <w:iCs/>
+          <w:sz w:val="22"/>
+          <w:szCs w:val="22"/>
+        </w:rPr>
+      </w:pPr>
+      <w:r>
+        <w:rPr>
+          <w:rFonts w:ascii="Arial" w:eastAsia="Arial" w:hAnsi="Arial" w:cs="Arial"/>
+          <w:bCs/>
+          <w:sz w:val="22"/>
+          <w:szCs w:val="22"/>
+        </w:rPr>
+        <w:t>How will participants be identified and recruited?</w:t>
+      </w:r>
+      <w:r>
+        <w:rPr>
+          <w:rFonts w:ascii="Arial" w:eastAsia="Arial" w:hAnsi="Arial" w:cs="Arial"/>
+          <w:bCs/>
+          <w:sz w:val="22"/>
+          <w:szCs w:val="22"/>
+        </w:rPr>
+        <w:t xml:space="preserve"> </w:t>
+      </w:r>
+      <w:r>
+        <w:rPr>
+          <w:rFonts w:ascii="Arial" w:eastAsia="Arial" w:hAnsi="Arial" w:cs="Arial"/>
+          <w:bCs/>
+          <w:i/>
+          <w:iCs/>
+          <w:sz w:val="22"/>
+          <w:szCs w:val="22"/>
+        </w:rPr>
+        <w:t>Participants will be recruited from the following methods:</w:t>
+      </w:r>
+    </w:p>
+    <w:p>
+      <w:pPr>
+        <w:pStyle w:val="ListParagraph"/>
+        <w:numPr>
+          <w:ilvl w:val="0"/>
+          <w:numId w:val="2"/>
+        </w:numPr>
+        <w:rPr>
+          <w:rFonts w:ascii="Arial" w:eastAsia="Arial" w:hAnsi="Arial" w:cs="Arial"/>
+          <w:bCs/>
+          <w:i/>
+          <w:iCs/>
+          <w:sz w:val="22"/>
+          <w:szCs w:val="22"/>
+        </w:rPr>
+      </w:pPr>
+      <w:r>
+        <w:rPr>
+          <w:rFonts w:ascii="Arial" w:eastAsia="Arial" w:hAnsi="Arial" w:cs="Arial"/>
+          <w:bCs/>
+          <w:i/>
+          <w:iCs/>
+          <w:sz w:val="22"/>
+          <w:szCs w:val="22"/>
+        </w:rPr>
+        <w:t xml:space="preserve">Class samples: students from </w:t>
+      </w:r>
+      <w:r>
+        <w:rPr>
+          <w:rFonts w:ascii="Arial" w:eastAsia="Arial" w:hAnsi="Arial" w:cs="Arial"/>
+          <w:bCs/>
+          <w:i/>
+          <w:iCs/>
+          <w:sz w:val="22"/>
+          <w:szCs w:val="22"/>
+        </w:rPr>
+        <w:t>instructors’</w:t>
+      </w:r>
+      <w:r>
+        <w:rPr>
+          <w:rFonts w:ascii="Arial" w:eastAsia="Arial" w:hAnsi="Arial" w:cs="Arial"/>
+          <w:bCs/>
+          <w:i/>
+          <w:iCs/>
+          <w:sz w:val="22"/>
+          <w:szCs w:val="22"/>
+        </w:rPr>
+        <w:t xml:space="preserve"> courses – who may receive extra credit or other class incentives to complete the study.</w:t>
+      </w:r>
+    </w:p>
+    <w:p>
+      <w:pPr>
+        <w:pStyle w:val="ListParagraph"/>
+        <w:numPr>
+          <w:ilvl w:val="0"/>
+          <w:numId w:val="2"/>
+        </w:numPr>
+        <w:rPr>
+          <w:rFonts w:ascii="Arial" w:eastAsia="Arial" w:hAnsi="Arial" w:cs="Arial"/>
+          <w:bCs/>
+          <w:i/>
+          <w:iCs/>
+          <w:sz w:val="22"/>
+          <w:szCs w:val="22"/>
+        </w:rPr>
+      </w:pPr>
+      <w:r>
+        <w:rPr>
+          <w:rFonts w:ascii="Arial" w:eastAsia="Arial" w:hAnsi="Arial" w:cs="Arial"/>
+          <w:bCs/>
+          <w:i/>
+          <w:iCs/>
+          <w:sz w:val="22"/>
+          <w:szCs w:val="22"/>
+        </w:rPr>
+        <w:t xml:space="preserve">Sampling platforms: </w:t>
+      </w:r>
+      <w:proofErr w:type="spellStart"/>
+      <w:r>
+        <w:rPr>
+          <w:rFonts w:ascii="Arial" w:eastAsia="Arial" w:hAnsi="Arial" w:cs="Arial"/>
+          <w:bCs/>
+          <w:i/>
+          <w:iCs/>
+          <w:sz w:val="22"/>
+          <w:szCs w:val="22"/>
+        </w:rPr>
+        <w:t>Besample</w:t>
+      </w:r>
+      <w:proofErr w:type="spellEnd"/>
+      <w:r>
+        <w:rPr>
+          <w:rFonts w:ascii="Arial" w:eastAsia="Arial" w:hAnsi="Arial" w:cs="Arial"/>
+          <w:bCs/>
+          <w:i/>
+          <w:iCs/>
+          <w:sz w:val="22"/>
+          <w:szCs w:val="22"/>
+        </w:rPr>
+        <w:t xml:space="preserve">, Prolific, </w:t>
+      </w:r>
+      <w:proofErr w:type="spellStart"/>
+      <w:r>
+        <w:rPr>
+          <w:rFonts w:ascii="Arial" w:eastAsia="Arial" w:hAnsi="Arial" w:cs="Arial"/>
+          <w:bCs/>
+          <w:i/>
+          <w:iCs/>
+          <w:sz w:val="22"/>
+          <w:szCs w:val="22"/>
+        </w:rPr>
+        <w:t>MTurk</w:t>
+      </w:r>
+      <w:proofErr w:type="spellEnd"/>
+      <w:r>
+        <w:rPr>
+          <w:rFonts w:ascii="Arial" w:eastAsia="Arial" w:hAnsi="Arial" w:cs="Arial"/>
+          <w:bCs/>
+          <w:i/>
+          <w:iCs/>
+          <w:sz w:val="22"/>
+          <w:szCs w:val="22"/>
+        </w:rPr>
+        <w:t xml:space="preserve">, </w:t>
+      </w:r>
+      <w:proofErr w:type="spellStart"/>
+      <w:r>
+        <w:rPr>
+          <w:rFonts w:ascii="Arial" w:eastAsia="Arial" w:hAnsi="Arial" w:cs="Arial"/>
+          <w:bCs/>
+          <w:i/>
+          <w:iCs/>
+          <w:sz w:val="22"/>
+          <w:szCs w:val="22"/>
+        </w:rPr>
+        <w:t>Bilendi</w:t>
+      </w:r>
+      <w:proofErr w:type="spellEnd"/>
+      <w:r>
+        <w:rPr>
+          <w:rFonts w:ascii="Arial" w:eastAsia="Arial" w:hAnsi="Arial" w:cs="Arial"/>
+          <w:bCs/>
+          <w:i/>
+          <w:iCs/>
+          <w:sz w:val="22"/>
+          <w:szCs w:val="22"/>
+        </w:rPr>
+        <w:t xml:space="preserve">, and other recruitment platforms will be used to collect samples in locations we do not have partner organizations. </w:t>
+      </w:r>
+    </w:p>
+    <w:p>
+      <w:pPr>
+        <w:pStyle w:val="ListParagraph"/>
+        <w:numPr>
+          <w:ilvl w:val="0"/>
+          <w:numId w:val="2"/>
+        </w:numPr>
+        <w:rPr>
+          <w:rFonts w:ascii="Arial" w:eastAsia="Arial" w:hAnsi="Arial" w:cs="Arial"/>
+          <w:bCs/>
+          <w:i/>
+          <w:iCs/>
+          <w:sz w:val="22"/>
+          <w:szCs w:val="22"/>
+        </w:rPr>
+      </w:pPr>
+      <w:r>
+        <w:rPr>
+          <w:rFonts w:ascii="Arial" w:eastAsia="Arial" w:hAnsi="Arial" w:cs="Arial"/>
+          <w:bCs/>
+          <w:i/>
+          <w:iCs/>
+          <w:sz w:val="22"/>
+          <w:szCs w:val="22"/>
+        </w:rPr>
+        <w:t xml:space="preserve">Psychological Science Accelerator and </w:t>
+      </w:r>
+      <w:proofErr w:type="spellStart"/>
+      <w:r>
+        <w:rPr>
+          <w:rFonts w:ascii="Arial" w:eastAsia="Arial" w:hAnsi="Arial" w:cs="Arial"/>
+          <w:bCs/>
+          <w:i/>
+          <w:iCs/>
+          <w:sz w:val="22"/>
+          <w:szCs w:val="22"/>
+        </w:rPr>
+        <w:t>ManyLanguages</w:t>
+      </w:r>
+      <w:proofErr w:type="spellEnd"/>
+      <w:r>
+        <w:rPr>
+          <w:rFonts w:ascii="Arial" w:eastAsia="Arial" w:hAnsi="Arial" w:cs="Arial"/>
+          <w:bCs/>
+          <w:i/>
+          <w:iCs/>
+          <w:sz w:val="22"/>
+          <w:szCs w:val="22"/>
+        </w:rPr>
+        <w:t xml:space="preserve"> consortiums: We will partner with these non-profit organizations to recruit research labs that can sample via </w:t>
+      </w:r>
+      <w:r>
+        <w:rPr>
+          <w:rFonts w:ascii="Arial" w:eastAsia="Arial" w:hAnsi="Arial" w:cs="Arial"/>
+          <w:bCs/>
+          <w:i/>
+          <w:iCs/>
+          <w:sz w:val="22"/>
+          <w:szCs w:val="22"/>
+        </w:rPr>
+        <w:t xml:space="preserve">local methods (participant pools, local recruitment options). </w:t>
+      </w:r>
+    </w:p>
+    <w:p>
+      <w:pPr>
+        <w:rPr>
+          <w:rFonts w:ascii="Arial" w:eastAsia="Arial" w:hAnsi="Arial" w:cs="Arial"/>
+          <w:bCs/>
+          <w:i/>
+          <w:iCs/>
+          <w:sz w:val="22"/>
+          <w:szCs w:val="22"/>
+        </w:rPr>
+      </w:pPr>
+    </w:p>
+    <w:p>
+      <w:pPr>
+        <w:rPr>
+          <w:rFonts w:ascii="Arial" w:eastAsia="Arial" w:hAnsi="Arial" w:cs="Arial"/>
+          <w:bCs/>
+          <w:i/>
+          <w:iCs/>
+          <w:sz w:val="22"/>
+          <w:szCs w:val="22"/>
+        </w:rPr>
+      </w:pPr>
+      <w:r>
+        <w:rPr>
+          <w:rFonts w:ascii="Arial" w:eastAsia="Arial" w:hAnsi="Arial" w:cs="Arial"/>
+          <w:bCs/>
+          <w:sz w:val="22"/>
+          <w:szCs w:val="22"/>
+        </w:rPr>
+        <w:t>How will be data be secured?</w:t>
+      </w:r>
+      <w:r>
+        <w:rPr>
+          <w:rFonts w:ascii="Arial" w:eastAsia="Arial" w:hAnsi="Arial" w:cs="Arial"/>
+          <w:bCs/>
+          <w:sz w:val="22"/>
+          <w:szCs w:val="22"/>
+        </w:rPr>
+        <w:t xml:space="preserve"> </w:t>
+      </w:r>
+      <w:r>
+        <w:rPr>
+          <w:rFonts w:ascii="Arial" w:eastAsia="Arial" w:hAnsi="Arial" w:cs="Arial"/>
+          <w:bCs/>
+          <w:i/>
+          <w:iCs/>
+          <w:sz w:val="22"/>
+          <w:szCs w:val="22"/>
+        </w:rPr>
+        <w:t xml:space="preserve">The data will be collected via private server </w:t>
+      </w:r>
     </w:p>
     <w:p>
       <w:pPr>
@@ -1117,15 +1648,7 @@
           <w:sz w:val="22"/>
           <w:szCs w:val="22"/>
         </w:rPr>
-        <w:t xml:space="preserve"> meet the need for a database of semantic priming values, particularly in non-English languages that are cross linguistically complete. Large-scale data in this area is sparse, unlike the other published databases found in Buc</w:t>
-      </w:r>
-      <w:r>
-        <w:rPr>
-          <w:rFonts w:ascii="Arial" w:eastAsia="Arial" w:hAnsi="Arial" w:cs="Arial"/>
-          <w:sz w:val="22"/>
-          <w:szCs w:val="22"/>
-        </w:rPr>
-        <w:t>hanan et al.</w:t>
+        <w:t xml:space="preserve"> meet the need for a database of semantic priming values, particularly in non-English languages that are cross linguistically complete. Large-scale data in this area is sparse, unlike the other published databases found in Buchanan et al.</w:t>
       </w:r>
       <w:hyperlink r:id="rId5">
         <w:r>
@@ -1134,7 +1657,16 @@
             <w:sz w:val="22"/>
             <w:szCs w:val="22"/>
           </w:rPr>
-          <w:t xml:space="preserve"> (2019a)</w:t>
+          <w:t xml:space="preserve"> </w:t>
+        </w:r>
+        <w:r>
+          <w:rPr>
+            <w:rFonts w:ascii="Arial" w:eastAsia="Arial" w:hAnsi="Arial" w:cs="Arial"/>
+            <w:sz w:val="22"/>
+            <w:szCs w:val="22"/>
+          </w:rPr>
+          <w:lastRenderedPageBreak/>
+          <w:t>(2019a)</w:t>
         </w:r>
       </w:hyperlink>
       <w:r>
@@ -1477,7 +2009,6 @@
           <w:sz w:val="22"/>
           <w:szCs w:val="22"/>
         </w:rPr>
-        <w:lastRenderedPageBreak/>
         <w:t xml:space="preserve">Given proposed standard error value, the data was then sampled with replacement to determine the sample size that would provide that standard error value. One hundred words within the data were selected, and samples starting at </w:t>
       </w:r>
       <w:r>
@@ -1512,15 +2043,7 @@
           <w:sz w:val="22"/>
           <w:szCs w:val="22"/>
         </w:rPr>
-        <w:t xml:space="preserve"> = 400 were selected (increasing in units of five). The standard error for each of these samples was then calculated for the simulation, and the percent of samples with standard errors at or less than the </w:t>
-      </w:r>
-      <w:r>
-        <w:rPr>
-          <w:rFonts w:ascii="Arial" w:eastAsia="Arial" w:hAnsi="Arial" w:cs="Arial"/>
-          <w:sz w:val="22"/>
-          <w:szCs w:val="22"/>
-        </w:rPr>
-        <w:t xml:space="preserve">estimated population value was then tabulated. From this calculation, </w:t>
+        <w:t xml:space="preserve"> = 400 were selected (increasing in units of five). The standard error for each of these samples was then calculated for the simulation, and the percent of samples with standard errors at or less than the estimated population value was then tabulated. From this calculation, </w:t>
       </w:r>
       <w:r>
         <w:rPr>
@@ -1639,23 +2162,16 @@
           <w:sz w:val="22"/>
           <w:szCs w:val="22"/>
         </w:rPr>
-        <w:t xml:space="preserve"> guess at minimum sample size. As indicated, it’s often unclear how to exactly estimate a sample size for these types of studies, and this study</w:t>
-      </w:r>
-      <w:r>
-        <w:rPr>
-          <w:rFonts w:ascii="Arial" w:eastAsia="Arial" w:hAnsi="Arial" w:cs="Arial"/>
-          <w:sz w:val="22"/>
-          <w:szCs w:val="22"/>
-        </w:rPr>
-        <w:t xml:space="preserve"> will detail that procedure to provide guidance for future work. The upper range of estimated participants is high because of the uncertainty in estimating an “accurate” parameter. Because the variability of the sample size is quite large, we will employ a stopping procedure to ensure participant time and effort is maximized, and data collection is minimiz</w:t>
-      </w:r>
-      <w:r>
-        <w:rPr>
-          <w:rFonts w:ascii="Arial" w:eastAsia="Arial" w:hAnsi="Arial" w:cs="Arial"/>
-          <w:sz w:val="22"/>
-          <w:szCs w:val="22"/>
-        </w:rPr>
-        <w:t xml:space="preserve">ed. The minimum sample size will be 50 participants per concept or 741 total participants, and the maximum will be 320. </w:t>
+        <w:t xml:space="preserve"> guess at minimum sample size. As indicated, it’s often unclear how to exactly estimate a sample size for these types of studies, and this study will detail that procedure to provide guidance for future work. The upper range of estimated participants is high because of the uncertainty in estimating an “accurate” parameter. Because the variability of the sample size is quite large, we will employ a stopping procedure to ensure participant time and effort is maximized, and data </w:t>
+      </w:r>
+      <w:r>
+        <w:rPr>
+          <w:rFonts w:ascii="Arial" w:eastAsia="Arial" w:hAnsi="Arial" w:cs="Arial"/>
+          <w:sz w:val="22"/>
+          <w:szCs w:val="22"/>
+        </w:rPr>
+        <w:lastRenderedPageBreak/>
+        <w:t xml:space="preserve">collection is minimized. The minimum sample size will be 50 participants per concept or 741 total participants, and the maximum will be 320. </w:t>
       </w:r>
     </w:p>
     <w:p>
@@ -1718,17 +2234,972 @@
           <w:sz w:val="22"/>
           <w:szCs w:val="22"/>
         </w:rPr>
-        <w:t xml:space="preserve">ERIN NEEDS ADD STUFF HERE ABOUT THE PARTICIPANTS PER TASK </w:t>
-      </w:r>
-    </w:p>
-    <w:p>
-      <w:pPr>
-        <w:rPr>
-          <w:rFonts w:ascii="Arial" w:eastAsia="Arial" w:hAnsi="Arial" w:cs="Arial"/>
-          <w:sz w:val="22"/>
-          <w:szCs w:val="22"/>
-        </w:rPr>
-      </w:pPr>
+        <w:t>As a follow-up to the Semantic Priming Across Many Languages project [cite], we will collect norming data across 45 languages and language variants on six subjective rating variables: familiarity, concreteness, valence, arousal, imageability, and age of acquisition. To determine the number of participants needed to produce sufficiently precise item-level estimates, we used the accuracy in parameter estimation (AIPE) procedure described by Buchanan and colleagues [cite].</w:t>
+      </w:r>
+      <w:r>
+        <w:rPr>
+          <w:rFonts w:ascii="Arial" w:eastAsia="Arial" w:hAnsi="Arial" w:cs="Arial"/>
+          <w:sz w:val="22"/>
+          <w:szCs w:val="22"/>
+        </w:rPr>
+        <w:t xml:space="preserve"> The code for this analysis can be found at: </w:t>
+      </w:r>
+      <w:hyperlink r:id="rId11" w:history="1">
+        <w:r>
+          <w:rPr>
+            <w:rStyle w:val="Hyperlink"/>
+            <w:rFonts w:ascii="Arial" w:eastAsia="Arial" w:hAnsi="Arial" w:cs="Arial"/>
+            <w:sz w:val="22"/>
+            <w:szCs w:val="22"/>
+          </w:rPr>
+          <w:t>https://github.com/SemanticPriming/ML-One-Network/blob/main/05-Power/power_analysis.pdf</w:t>
+        </w:r>
+      </w:hyperlink>
+      <w:r>
+        <w:rPr>
+          <w:rFonts w:ascii="Arial" w:eastAsia="Arial" w:hAnsi="Arial" w:cs="Arial"/>
+          <w:sz w:val="22"/>
+          <w:szCs w:val="22"/>
+        </w:rPr>
+        <w:t xml:space="preserve"> </w:t>
+      </w:r>
+    </w:p>
+    <w:p>
+      <w:pPr>
+        <w:rPr>
+          <w:rFonts w:ascii="Arial" w:eastAsia="Arial" w:hAnsi="Arial" w:cs="Arial"/>
+          <w:sz w:val="22"/>
+          <w:szCs w:val="22"/>
+        </w:rPr>
+      </w:pPr>
+    </w:p>
+    <w:p>
+      <w:pPr>
+        <w:rPr>
+          <w:rFonts w:ascii="Arial" w:eastAsia="Arial" w:hAnsi="Arial" w:cs="Arial"/>
+          <w:sz w:val="22"/>
+          <w:szCs w:val="22"/>
+        </w:rPr>
+      </w:pPr>
+      <w:r>
+        <w:rPr>
+          <w:rFonts w:ascii="Arial" w:eastAsia="Arial" w:hAnsi="Arial" w:cs="Arial"/>
+          <w:sz w:val="22"/>
+          <w:szCs w:val="22"/>
+        </w:rPr>
+        <w:t xml:space="preserve">We began by identifying representative pilot data drawn from the Linguistic Annotated Bibliography [cite] and its </w:t>
+      </w:r>
+      <w:r>
+        <w:rPr>
+          <w:rFonts w:ascii="Arial" w:eastAsia="Arial" w:hAnsi="Arial" w:cs="Arial"/>
+          <w:sz w:val="22"/>
+          <w:szCs w:val="22"/>
+        </w:rPr>
+        <w:t>updated form</w:t>
+      </w:r>
+      <w:r>
+        <w:rPr>
+          <w:rFonts w:ascii="Arial" w:eastAsia="Arial" w:hAnsi="Arial" w:cs="Arial"/>
+          <w:sz w:val="22"/>
+          <w:szCs w:val="22"/>
+        </w:rPr>
+        <w:t xml:space="preserve"> currently under development at manynorms.many-languages.com. Only datasets that reported both a mean and standard deviation for each item were included, since variance information was necessary to simulate the data; datasets reporting only means were excluded. Where the original source reported a range of raters per item rather than an exact number (for example, "15 to 20 participants rated each item"), we conservatively used the lower bound, which increases the estimated sample size requirement by assuming less precision than may </w:t>
+      </w:r>
+      <w:proofErr w:type="gramStart"/>
+      <w:r>
+        <w:rPr>
+          <w:rFonts w:ascii="Arial" w:eastAsia="Arial" w:hAnsi="Arial" w:cs="Arial"/>
+          <w:sz w:val="22"/>
+          <w:szCs w:val="22"/>
+        </w:rPr>
+        <w:t>actually have</w:t>
+      </w:r>
+      <w:proofErr w:type="gramEnd"/>
+      <w:r>
+        <w:rPr>
+          <w:rFonts w:ascii="Arial" w:eastAsia="Arial" w:hAnsi="Arial" w:cs="Arial"/>
+          <w:sz w:val="22"/>
+          <w:szCs w:val="22"/>
+        </w:rPr>
+        <w:t xml:space="preserve"> existed.</w:t>
+      </w:r>
+    </w:p>
+    <w:p>
+      <w:pPr>
+        <w:rPr>
+          <w:rFonts w:ascii="Arial" w:eastAsia="Arial" w:hAnsi="Arial" w:cs="Arial"/>
+          <w:sz w:val="22"/>
+          <w:szCs w:val="22"/>
+        </w:rPr>
+      </w:pPr>
+    </w:p>
+    <w:p>
+      <w:pPr>
+        <w:rPr>
+          <w:rFonts w:ascii="Arial" w:eastAsia="Arial" w:hAnsi="Arial" w:cs="Arial"/>
+          <w:sz w:val="22"/>
+          <w:szCs w:val="22"/>
+        </w:rPr>
+      </w:pPr>
+      <w:r>
+        <w:rPr>
+          <w:rFonts w:ascii="Arial" w:eastAsia="Arial" w:hAnsi="Arial" w:cs="Arial"/>
+          <w:sz w:val="22"/>
+          <w:szCs w:val="22"/>
+        </w:rPr>
+        <w:t xml:space="preserve">Using the </w:t>
+      </w:r>
+      <w:proofErr w:type="spellStart"/>
+      <w:r>
+        <w:rPr>
+          <w:rFonts w:ascii="Arial" w:eastAsia="Arial" w:hAnsi="Arial" w:cs="Arial"/>
+          <w:i/>
+          <w:iCs/>
+          <w:sz w:val="22"/>
+          <w:szCs w:val="22"/>
+        </w:rPr>
+        <w:t>semanticprimeR</w:t>
+      </w:r>
+      <w:proofErr w:type="spellEnd"/>
+      <w:r>
+        <w:rPr>
+          <w:rFonts w:ascii="Arial" w:eastAsia="Arial" w:hAnsi="Arial" w:cs="Arial"/>
+          <w:sz w:val="22"/>
+          <w:szCs w:val="22"/>
+        </w:rPr>
+        <w:t xml:space="preserve"> package [cite], we simulated each pilot dataset using its reported means, standard deviations, and sample sizes, treating this simulated dataset as the population of interest. We then calculated the standard error of each item in this population and used the fourth decile of these standard errors as our target cutoff and stopping rule for precision.</w:t>
+      </w:r>
+      <w:r>
+        <w:rPr>
+          <w:rFonts w:ascii="Arial" w:eastAsia="Arial" w:hAnsi="Arial" w:cs="Arial"/>
+          <w:sz w:val="22"/>
+          <w:szCs w:val="22"/>
+        </w:rPr>
+        <w:t xml:space="preserve"> </w:t>
+      </w:r>
+      <w:r>
+        <w:rPr>
+          <w:rFonts w:ascii="Arial" w:eastAsia="Arial" w:hAnsi="Arial" w:cs="Arial"/>
+          <w:sz w:val="22"/>
+          <w:szCs w:val="22"/>
+        </w:rPr>
+        <w:t>From this simulated population, we drew samples ranging from 20 to 500 participants and evaluated how many items met the precision cutoff at each sample size. Because running this simulation exhaustively across every dataset and every sample size was computationally expensive, we conducted the simulations in two stages: an initial coarse pilot sweep (sample sizes 20 to 500 in steps of 10, with 10 simulations per step) to identify approximately where each dataset's precision curve crossed 70% and 95% item coverage, followed by a narrower, high-precision refinement stage (steps of 5, with 100 simulations per step) restricted to the range identified in the pilot stage. Only the refined-stage results are reported here, as they represent the higher-precision final estimates. For each sample size, we calculated the proportion of items falling below the precision cutoff and identified the sample sizes at which 80%, 85%, 90%, and 95% of items met that criterion, applying a correction formula to adjust the estimate based on the size of the original pilot dataset.</w:t>
+      </w:r>
+    </w:p>
+    <w:p>
+      <w:pPr>
+        <w:rPr>
+          <w:rFonts w:ascii="Arial" w:eastAsia="Arial" w:hAnsi="Arial" w:cs="Arial"/>
+          <w:sz w:val="22"/>
+          <w:szCs w:val="22"/>
+        </w:rPr>
+      </w:pPr>
+    </w:p>
+    <w:p>
+      <w:pPr>
+        <w:rPr>
+          <w:rFonts w:ascii="Arial" w:eastAsia="Arial" w:hAnsi="Arial" w:cs="Arial"/>
+          <w:sz w:val="22"/>
+          <w:szCs w:val="22"/>
+        </w:rPr>
+      </w:pPr>
+      <w:r>
+        <w:rPr>
+          <w:rFonts w:ascii="Arial" w:eastAsia="Arial" w:hAnsi="Arial" w:cs="Arial"/>
+          <w:sz w:val="22"/>
+          <w:szCs w:val="22"/>
+        </w:rPr>
+        <w:t>In addition to precision, we calculated split-half reliability at each sample size for each dataset. Participants rating each item were split into two halves, the two half-means were correlated, and the Spearman-Brown correction was applied to estimate full-scale reliability. This</w:t>
+      </w:r>
+      <w:r>
+        <w:rPr>
+          <w:rFonts w:ascii="Arial" w:eastAsia="Arial" w:hAnsi="Arial" w:cs="Arial"/>
+          <w:sz w:val="22"/>
+          <w:szCs w:val="22"/>
+        </w:rPr>
+        <w:t xml:space="preserve"> analysis</w:t>
+      </w:r>
+      <w:r>
+        <w:rPr>
+          <w:rFonts w:ascii="Arial" w:eastAsia="Arial" w:hAnsi="Arial" w:cs="Arial"/>
+          <w:sz w:val="22"/>
+          <w:szCs w:val="22"/>
+        </w:rPr>
+        <w:t xml:space="preserve"> provided a second, complementary index of how consistently item-level scores would be estimated at a given number of raters per item. Reliability was evaluated across sample sizes from </w:t>
+      </w:r>
+      <w:r>
+        <w:rPr>
+          <w:rFonts w:ascii="Arial" w:eastAsia="Arial" w:hAnsi="Arial" w:cs="Arial"/>
+          <w:i/>
+          <w:iCs/>
+          <w:sz w:val="22"/>
+          <w:szCs w:val="22"/>
+        </w:rPr>
+        <w:t>n</w:t>
+      </w:r>
+      <w:r>
+        <w:rPr>
+          <w:rFonts w:ascii="Arial" w:eastAsia="Arial" w:hAnsi="Arial" w:cs="Arial"/>
+          <w:sz w:val="22"/>
+          <w:szCs w:val="22"/>
+        </w:rPr>
+        <w:t xml:space="preserve"> = 5 up to the upper end of the range identified for each dataset in the precision analysis.</w:t>
+      </w:r>
+    </w:p>
+    <w:p>
+      <w:pPr>
+        <w:rPr>
+          <w:rFonts w:ascii="Arial" w:eastAsia="Arial" w:hAnsi="Arial" w:cs="Arial"/>
+          <w:sz w:val="22"/>
+          <w:szCs w:val="22"/>
+        </w:rPr>
+      </w:pPr>
+    </w:p>
+    <w:p>
+      <w:pPr>
+        <w:rPr>
+          <w:rFonts w:ascii="Arial" w:eastAsia="Arial" w:hAnsi="Arial" w:cs="Arial"/>
+          <w:sz w:val="22"/>
+          <w:szCs w:val="22"/>
+        </w:rPr>
+      </w:pPr>
+      <w:r>
+        <w:rPr>
+          <w:rFonts w:ascii="Arial" w:eastAsia="Arial" w:hAnsi="Arial" w:cs="Arial"/>
+          <w:sz w:val="22"/>
+          <w:szCs w:val="22"/>
+        </w:rPr>
+        <w:t xml:space="preserve">We targeted 80% power under the AIPE precision criterion and 80% split-half reliability as our two benchmarks, since these address distinct but related questions: precision reflects how accurately the estimated mean approximates the true item mean, while reliability reflects how consistent item-level scores would be across independent halves of the sample. Because averaging these two criteria offers a single practical recommendation rather than defaulting to the stricter of the two, our final recommended sample size per variable was </w:t>
+      </w:r>
+      <w:r>
+        <w:rPr>
+          <w:rFonts w:ascii="Arial" w:eastAsia="Arial" w:hAnsi="Arial" w:cs="Arial"/>
+          <w:sz w:val="22"/>
+          <w:szCs w:val="22"/>
+        </w:rPr>
+        <w:lastRenderedPageBreak/>
+        <w:t xml:space="preserve">computed as the average of the precision-based and reliability-based estimates. We imposed a floor of </w:t>
+      </w:r>
+      <w:r>
+        <w:rPr>
+          <w:rFonts w:ascii="Arial" w:eastAsia="Arial" w:hAnsi="Arial" w:cs="Arial"/>
+          <w:i/>
+          <w:iCs/>
+          <w:sz w:val="22"/>
+          <w:szCs w:val="22"/>
+        </w:rPr>
+        <w:t>n</w:t>
+      </w:r>
+      <w:r>
+        <w:rPr>
+          <w:rFonts w:ascii="Arial" w:eastAsia="Arial" w:hAnsi="Arial" w:cs="Arial"/>
+          <w:sz w:val="22"/>
+          <w:szCs w:val="22"/>
+        </w:rPr>
+        <w:t xml:space="preserve"> = 20 on the reliability estimate, since reliability could appear artificially high at very small samples (</w:t>
+      </w:r>
+      <w:r>
+        <w:rPr>
+          <w:rFonts w:ascii="Arial" w:eastAsia="Arial" w:hAnsi="Arial" w:cs="Arial"/>
+          <w:i/>
+          <w:iCs/>
+          <w:sz w:val="22"/>
+          <w:szCs w:val="22"/>
+        </w:rPr>
+        <w:t>n</w:t>
+      </w:r>
+      <w:r>
+        <w:rPr>
+          <w:rFonts w:ascii="Arial" w:eastAsia="Arial" w:hAnsi="Arial" w:cs="Arial"/>
+          <w:sz w:val="22"/>
+          <w:szCs w:val="22"/>
+        </w:rPr>
+        <w:t xml:space="preserve"> = 5, 10, or 15) in a way that would inappropriately bias the combined recommendation downward.</w:t>
+      </w:r>
+    </w:p>
+    <w:p>
+      <w:pPr>
+        <w:rPr>
+          <w:rFonts w:ascii="Arial" w:eastAsia="Arial" w:hAnsi="Arial" w:cs="Arial"/>
+          <w:sz w:val="22"/>
+          <w:szCs w:val="22"/>
+        </w:rPr>
+      </w:pPr>
+    </w:p>
+    <w:p>
+      <w:pPr>
+        <w:rPr>
+          <w:rFonts w:ascii="Arial" w:eastAsia="Arial" w:hAnsi="Arial" w:cs="Arial"/>
+          <w:sz w:val="22"/>
+          <w:szCs w:val="22"/>
+        </w:rPr>
+      </w:pPr>
+      <w:r>
+        <w:rPr>
+          <w:rFonts w:ascii="Arial" w:eastAsia="Arial" w:hAnsi="Arial" w:cs="Arial"/>
+          <w:sz w:val="22"/>
+          <w:szCs w:val="22"/>
+        </w:rPr>
+        <w:t>Each dataset (that is, each source paper or corpus reporting a given variable) contributed one precision estimate and one reliability estimate per variable. Because a small number of source datasets were unusually small or noisy, producing extreme per-dataset estimates, we removed outlier runs prior to pooling using the standard 1.5 times interquartile range rule, applied separately to the precision and reliability estimates for each variable. We then took the median of the remaining, non-outlier estimates for each metric, since the median is more robust than the mean to any remaining borderline values.</w:t>
+      </w:r>
+    </w:p>
+    <w:p>
+      <w:pPr>
+        <w:spacing w:before="100" w:beforeAutospacing="1" w:after="100" w:afterAutospacing="1"/>
+        <w:rPr>
+          <w:rFonts w:ascii="Arial" w:eastAsia="Times New Roman" w:hAnsi="Arial" w:cs="Arial"/>
+          <w:sz w:val="22"/>
+          <w:szCs w:val="22"/>
+        </w:rPr>
+      </w:pPr>
+      <w:r>
+        <w:rPr>
+          <w:rFonts w:ascii="Arial" w:eastAsia="Times New Roman" w:hAnsi="Arial" w:cs="Arial"/>
+          <w:sz w:val="22"/>
+          <w:szCs w:val="22"/>
+        </w:rPr>
+        <w:t>Applying this procedure across the six norming variables, we obtained the following recommended sample sizes:</w:t>
+      </w:r>
+    </w:p>
+    <w:tbl>
+      <w:tblPr>
+        <w:tblW w:w="7984" w:type="dxa"/>
+        <w:tblCellSpacing w:w="15" w:type="dxa"/>
+        <w:tblCellMar>
+          <w:top w:w="15" w:type="dxa"/>
+          <w:left w:w="15" w:type="dxa"/>
+          <w:bottom w:w="15" w:type="dxa"/>
+          <w:right w:w="15" w:type="dxa"/>
+        </w:tblCellMar>
+        <w:tblLook w:val="04A0" w:firstRow="1" w:lastRow="0" w:firstColumn="1" w:lastColumn="0" w:noHBand="0" w:noVBand="1"/>
+      </w:tblPr>
+      <w:tblGrid>
+        <w:gridCol w:w="2626"/>
+        <w:gridCol w:w="1395"/>
+        <w:gridCol w:w="3963"/>
+      </w:tblGrid>
+      <w:tr>
+        <w:trPr>
+          <w:trHeight w:val="262"/>
+          <w:tblHeader/>
+          <w:tblCellSpacing w:w="15" w:type="dxa"/>
+        </w:trPr>
+        <w:tc>
+          <w:tcPr>
+            <w:tcW w:w="0" w:type="auto"/>
+            <w:hideMark/>
+          </w:tcPr>
+          <w:p>
+            <w:pPr>
+              <w:rPr>
+                <w:rFonts w:ascii="Arial" w:eastAsia="Times New Roman" w:hAnsi="Arial" w:cs="Arial"/>
+                <w:b/>
+                <w:bCs/>
+                <w:sz w:val="22"/>
+                <w:szCs w:val="22"/>
+              </w:rPr>
+            </w:pPr>
+            <w:r>
+              <w:rPr>
+                <w:rFonts w:ascii="Arial" w:eastAsia="Times New Roman" w:hAnsi="Arial" w:cs="Arial"/>
+                <w:b/>
+                <w:bCs/>
+                <w:sz w:val="22"/>
+                <w:szCs w:val="22"/>
+              </w:rPr>
+              <w:t>Variable</w:t>
+            </w:r>
+          </w:p>
+        </w:tc>
+        <w:tc>
+          <w:tcPr>
+            <w:tcW w:w="0" w:type="auto"/>
+            <w:vAlign w:val="center"/>
+            <w:hideMark/>
+          </w:tcPr>
+          <w:p>
+            <w:pPr>
+              <w:jc w:val="center"/>
+              <w:rPr>
+                <w:rFonts w:ascii="Arial" w:eastAsia="Times New Roman" w:hAnsi="Arial" w:cs="Arial"/>
+                <w:b/>
+                <w:bCs/>
+                <w:sz w:val="22"/>
+                <w:szCs w:val="22"/>
+              </w:rPr>
+            </w:pPr>
+            <w:r>
+              <w:rPr>
+                <w:rFonts w:ascii="Arial" w:eastAsia="Times New Roman" w:hAnsi="Arial" w:cs="Arial"/>
+                <w:b/>
+                <w:bCs/>
+                <w:sz w:val="22"/>
+                <w:szCs w:val="22"/>
+              </w:rPr>
+              <w:t>Datasets</w:t>
+            </w:r>
+          </w:p>
+        </w:tc>
+        <w:tc>
+          <w:tcPr>
+            <w:tcW w:w="0" w:type="auto"/>
+            <w:vAlign w:val="center"/>
+            <w:hideMark/>
+          </w:tcPr>
+          <w:p>
+            <w:pPr>
+              <w:jc w:val="center"/>
+              <w:rPr>
+                <w:rFonts w:ascii="Arial" w:eastAsia="Times New Roman" w:hAnsi="Arial" w:cs="Arial"/>
+                <w:b/>
+                <w:bCs/>
+                <w:sz w:val="22"/>
+                <w:szCs w:val="22"/>
+              </w:rPr>
+            </w:pPr>
+            <w:r>
+              <w:rPr>
+                <w:rFonts w:ascii="Arial" w:eastAsia="Times New Roman" w:hAnsi="Arial" w:cs="Arial"/>
+                <w:b/>
+                <w:bCs/>
+                <w:sz w:val="22"/>
+                <w:szCs w:val="22"/>
+              </w:rPr>
+              <w:t xml:space="preserve">Recommended </w:t>
+            </w:r>
+            <w:r>
+              <w:rPr>
+                <w:rFonts w:ascii="Arial" w:eastAsia="Times New Roman" w:hAnsi="Arial" w:cs="Arial"/>
+                <w:b/>
+                <w:bCs/>
+                <w:i/>
+                <w:iCs/>
+                <w:sz w:val="22"/>
+                <w:szCs w:val="22"/>
+              </w:rPr>
+              <w:t xml:space="preserve">n </w:t>
+            </w:r>
+            <w:r>
+              <w:rPr>
+                <w:rFonts w:ascii="Arial" w:eastAsia="Times New Roman" w:hAnsi="Arial" w:cs="Arial"/>
+                <w:b/>
+                <w:bCs/>
+                <w:sz w:val="22"/>
+                <w:szCs w:val="22"/>
+              </w:rPr>
+              <w:t xml:space="preserve">per </w:t>
+            </w:r>
+            <w:r>
+              <w:rPr>
+                <w:rFonts w:ascii="Arial" w:eastAsia="Times New Roman" w:hAnsi="Arial" w:cs="Arial"/>
+                <w:b/>
+                <w:bCs/>
+                <w:sz w:val="22"/>
+                <w:szCs w:val="22"/>
+              </w:rPr>
+              <w:t>item</w:t>
+            </w:r>
+          </w:p>
+        </w:tc>
+      </w:tr>
+      <w:tr>
+        <w:trPr>
+          <w:trHeight w:val="252"/>
+          <w:tblCellSpacing w:w="15" w:type="dxa"/>
+        </w:trPr>
+        <w:tc>
+          <w:tcPr>
+            <w:tcW w:w="0" w:type="auto"/>
+            <w:vAlign w:val="center"/>
+            <w:hideMark/>
+          </w:tcPr>
+          <w:p>
+            <w:pPr>
+              <w:rPr>
+                <w:rFonts w:ascii="Arial" w:eastAsia="Times New Roman" w:hAnsi="Arial" w:cs="Arial"/>
+                <w:sz w:val="22"/>
+                <w:szCs w:val="22"/>
+              </w:rPr>
+            </w:pPr>
+            <w:r>
+              <w:rPr>
+                <w:rFonts w:ascii="Arial" w:eastAsia="Times New Roman" w:hAnsi="Arial" w:cs="Arial"/>
+                <w:sz w:val="22"/>
+                <w:szCs w:val="22"/>
+              </w:rPr>
+              <w:t>Arousal</w:t>
+            </w:r>
+          </w:p>
+        </w:tc>
+        <w:tc>
+          <w:tcPr>
+            <w:tcW w:w="0" w:type="auto"/>
+            <w:vAlign w:val="center"/>
+            <w:hideMark/>
+          </w:tcPr>
+          <w:p>
+            <w:pPr>
+              <w:jc w:val="center"/>
+              <w:rPr>
+                <w:rFonts w:ascii="Arial" w:eastAsia="Times New Roman" w:hAnsi="Arial" w:cs="Arial"/>
+                <w:sz w:val="22"/>
+                <w:szCs w:val="22"/>
+              </w:rPr>
+            </w:pPr>
+            <w:r>
+              <w:rPr>
+                <w:rFonts w:ascii="Arial" w:eastAsia="Times New Roman" w:hAnsi="Arial" w:cs="Arial"/>
+                <w:sz w:val="22"/>
+                <w:szCs w:val="22"/>
+              </w:rPr>
+              <w:t>34</w:t>
+            </w:r>
+          </w:p>
+        </w:tc>
+        <w:tc>
+          <w:tcPr>
+            <w:tcW w:w="0" w:type="auto"/>
+            <w:vAlign w:val="center"/>
+            <w:hideMark/>
+          </w:tcPr>
+          <w:p>
+            <w:pPr>
+              <w:jc w:val="center"/>
+              <w:rPr>
+                <w:rFonts w:ascii="Arial" w:eastAsia="Times New Roman" w:hAnsi="Arial" w:cs="Arial"/>
+                <w:sz w:val="22"/>
+                <w:szCs w:val="22"/>
+              </w:rPr>
+            </w:pPr>
+            <w:r>
+              <w:rPr>
+                <w:rFonts w:ascii="Arial" w:eastAsia="Times New Roman" w:hAnsi="Arial" w:cs="Arial"/>
+                <w:sz w:val="22"/>
+                <w:szCs w:val="22"/>
+              </w:rPr>
+              <w:t>30</w:t>
+            </w:r>
+          </w:p>
+        </w:tc>
+      </w:tr>
+      <w:tr>
+        <w:trPr>
+          <w:trHeight w:val="252"/>
+          <w:tblCellSpacing w:w="15" w:type="dxa"/>
+        </w:trPr>
+        <w:tc>
+          <w:tcPr>
+            <w:tcW w:w="0" w:type="auto"/>
+            <w:vAlign w:val="center"/>
+            <w:hideMark/>
+          </w:tcPr>
+          <w:p>
+            <w:pPr>
+              <w:rPr>
+                <w:rFonts w:ascii="Arial" w:eastAsia="Times New Roman" w:hAnsi="Arial" w:cs="Arial"/>
+                <w:sz w:val="22"/>
+                <w:szCs w:val="22"/>
+              </w:rPr>
+            </w:pPr>
+            <w:r>
+              <w:rPr>
+                <w:rFonts w:ascii="Arial" w:eastAsia="Times New Roman" w:hAnsi="Arial" w:cs="Arial"/>
+                <w:sz w:val="22"/>
+                <w:szCs w:val="22"/>
+              </w:rPr>
+              <w:t>Concreteness</w:t>
+            </w:r>
+          </w:p>
+        </w:tc>
+        <w:tc>
+          <w:tcPr>
+            <w:tcW w:w="0" w:type="auto"/>
+            <w:vAlign w:val="center"/>
+            <w:hideMark/>
+          </w:tcPr>
+          <w:p>
+            <w:pPr>
+              <w:jc w:val="center"/>
+              <w:rPr>
+                <w:rFonts w:ascii="Arial" w:eastAsia="Times New Roman" w:hAnsi="Arial" w:cs="Arial"/>
+                <w:sz w:val="22"/>
+                <w:szCs w:val="22"/>
+              </w:rPr>
+            </w:pPr>
+            <w:r>
+              <w:rPr>
+                <w:rFonts w:ascii="Arial" w:eastAsia="Times New Roman" w:hAnsi="Arial" w:cs="Arial"/>
+                <w:sz w:val="22"/>
+                <w:szCs w:val="22"/>
+              </w:rPr>
+              <w:t>38</w:t>
+            </w:r>
+          </w:p>
+        </w:tc>
+        <w:tc>
+          <w:tcPr>
+            <w:tcW w:w="0" w:type="auto"/>
+            <w:vAlign w:val="center"/>
+            <w:hideMark/>
+          </w:tcPr>
+          <w:p>
+            <w:pPr>
+              <w:jc w:val="center"/>
+              <w:rPr>
+                <w:rFonts w:ascii="Arial" w:eastAsia="Times New Roman" w:hAnsi="Arial" w:cs="Arial"/>
+                <w:sz w:val="22"/>
+                <w:szCs w:val="22"/>
+              </w:rPr>
+            </w:pPr>
+            <w:r>
+              <w:rPr>
+                <w:rFonts w:ascii="Arial" w:eastAsia="Times New Roman" w:hAnsi="Arial" w:cs="Arial"/>
+                <w:sz w:val="22"/>
+                <w:szCs w:val="22"/>
+              </w:rPr>
+              <w:t>33</w:t>
+            </w:r>
+          </w:p>
+        </w:tc>
+      </w:tr>
+      <w:tr>
+        <w:trPr>
+          <w:trHeight w:val="252"/>
+          <w:tblCellSpacing w:w="15" w:type="dxa"/>
+        </w:trPr>
+        <w:tc>
+          <w:tcPr>
+            <w:tcW w:w="0" w:type="auto"/>
+            <w:vAlign w:val="center"/>
+            <w:hideMark/>
+          </w:tcPr>
+          <w:p>
+            <w:pPr>
+              <w:rPr>
+                <w:rFonts w:ascii="Arial" w:eastAsia="Times New Roman" w:hAnsi="Arial" w:cs="Arial"/>
+                <w:sz w:val="22"/>
+                <w:szCs w:val="22"/>
+              </w:rPr>
+            </w:pPr>
+            <w:r>
+              <w:rPr>
+                <w:rFonts w:ascii="Arial" w:eastAsia="Times New Roman" w:hAnsi="Arial" w:cs="Arial"/>
+                <w:sz w:val="22"/>
+                <w:szCs w:val="22"/>
+              </w:rPr>
+              <w:t>Familiarity</w:t>
+            </w:r>
+          </w:p>
+        </w:tc>
+        <w:tc>
+          <w:tcPr>
+            <w:tcW w:w="0" w:type="auto"/>
+            <w:vAlign w:val="center"/>
+            <w:hideMark/>
+          </w:tcPr>
+          <w:p>
+            <w:pPr>
+              <w:jc w:val="center"/>
+              <w:rPr>
+                <w:rFonts w:ascii="Arial" w:eastAsia="Times New Roman" w:hAnsi="Arial" w:cs="Arial"/>
+                <w:sz w:val="22"/>
+                <w:szCs w:val="22"/>
+              </w:rPr>
+            </w:pPr>
+            <w:r>
+              <w:rPr>
+                <w:rFonts w:ascii="Arial" w:eastAsia="Times New Roman" w:hAnsi="Arial" w:cs="Arial"/>
+                <w:sz w:val="22"/>
+                <w:szCs w:val="22"/>
+              </w:rPr>
+              <w:t>57</w:t>
+            </w:r>
+          </w:p>
+        </w:tc>
+        <w:tc>
+          <w:tcPr>
+            <w:tcW w:w="0" w:type="auto"/>
+            <w:vAlign w:val="center"/>
+            <w:hideMark/>
+          </w:tcPr>
+          <w:p>
+            <w:pPr>
+              <w:jc w:val="center"/>
+              <w:rPr>
+                <w:rFonts w:ascii="Arial" w:eastAsia="Times New Roman" w:hAnsi="Arial" w:cs="Arial"/>
+                <w:sz w:val="22"/>
+                <w:szCs w:val="22"/>
+              </w:rPr>
+            </w:pPr>
+            <w:r>
+              <w:rPr>
+                <w:rFonts w:ascii="Arial" w:eastAsia="Times New Roman" w:hAnsi="Arial" w:cs="Arial"/>
+                <w:sz w:val="22"/>
+                <w:szCs w:val="22"/>
+              </w:rPr>
+              <w:t>34</w:t>
+            </w:r>
+          </w:p>
+        </w:tc>
+      </w:tr>
+      <w:tr>
+        <w:trPr>
+          <w:trHeight w:val="262"/>
+          <w:tblCellSpacing w:w="15" w:type="dxa"/>
+        </w:trPr>
+        <w:tc>
+          <w:tcPr>
+            <w:tcW w:w="0" w:type="auto"/>
+            <w:vAlign w:val="center"/>
+            <w:hideMark/>
+          </w:tcPr>
+          <w:p>
+            <w:pPr>
+              <w:rPr>
+                <w:rFonts w:ascii="Arial" w:eastAsia="Times New Roman" w:hAnsi="Arial" w:cs="Arial"/>
+                <w:sz w:val="22"/>
+                <w:szCs w:val="22"/>
+              </w:rPr>
+            </w:pPr>
+            <w:r>
+              <w:rPr>
+                <w:rFonts w:ascii="Arial" w:eastAsia="Times New Roman" w:hAnsi="Arial" w:cs="Arial"/>
+                <w:sz w:val="22"/>
+                <w:szCs w:val="22"/>
+              </w:rPr>
+              <w:t>Age of Acquisition</w:t>
+            </w:r>
+          </w:p>
+        </w:tc>
+        <w:tc>
+          <w:tcPr>
+            <w:tcW w:w="0" w:type="auto"/>
+            <w:vAlign w:val="center"/>
+            <w:hideMark/>
+          </w:tcPr>
+          <w:p>
+            <w:pPr>
+              <w:jc w:val="center"/>
+              <w:rPr>
+                <w:rFonts w:ascii="Arial" w:eastAsia="Times New Roman" w:hAnsi="Arial" w:cs="Arial"/>
+                <w:sz w:val="22"/>
+                <w:szCs w:val="22"/>
+              </w:rPr>
+            </w:pPr>
+            <w:r>
+              <w:rPr>
+                <w:rFonts w:ascii="Arial" w:eastAsia="Times New Roman" w:hAnsi="Arial" w:cs="Arial"/>
+                <w:sz w:val="22"/>
+                <w:szCs w:val="22"/>
+              </w:rPr>
+              <w:t>51</w:t>
+            </w:r>
+          </w:p>
+        </w:tc>
+        <w:tc>
+          <w:tcPr>
+            <w:tcW w:w="0" w:type="auto"/>
+            <w:vAlign w:val="center"/>
+            <w:hideMark/>
+          </w:tcPr>
+          <w:p>
+            <w:pPr>
+              <w:jc w:val="center"/>
+              <w:rPr>
+                <w:rFonts w:ascii="Arial" w:eastAsia="Times New Roman" w:hAnsi="Arial" w:cs="Arial"/>
+                <w:sz w:val="22"/>
+                <w:szCs w:val="22"/>
+              </w:rPr>
+            </w:pPr>
+            <w:r>
+              <w:rPr>
+                <w:rFonts w:ascii="Arial" w:eastAsia="Times New Roman" w:hAnsi="Arial" w:cs="Arial"/>
+                <w:sz w:val="22"/>
+                <w:szCs w:val="22"/>
+              </w:rPr>
+              <w:t>34</w:t>
+            </w:r>
+          </w:p>
+        </w:tc>
+      </w:tr>
+      <w:tr>
+        <w:trPr>
+          <w:trHeight w:val="252"/>
+          <w:tblCellSpacing w:w="15" w:type="dxa"/>
+        </w:trPr>
+        <w:tc>
+          <w:tcPr>
+            <w:tcW w:w="0" w:type="auto"/>
+            <w:vAlign w:val="center"/>
+            <w:hideMark/>
+          </w:tcPr>
+          <w:p>
+            <w:pPr>
+              <w:rPr>
+                <w:rFonts w:ascii="Arial" w:eastAsia="Times New Roman" w:hAnsi="Arial" w:cs="Arial"/>
+                <w:sz w:val="22"/>
+                <w:szCs w:val="22"/>
+              </w:rPr>
+            </w:pPr>
+            <w:r>
+              <w:rPr>
+                <w:rFonts w:ascii="Arial" w:eastAsia="Times New Roman" w:hAnsi="Arial" w:cs="Arial"/>
+                <w:sz w:val="22"/>
+                <w:szCs w:val="22"/>
+              </w:rPr>
+              <w:t>Imageability</w:t>
+            </w:r>
+          </w:p>
+        </w:tc>
+        <w:tc>
+          <w:tcPr>
+            <w:tcW w:w="0" w:type="auto"/>
+            <w:vAlign w:val="center"/>
+            <w:hideMark/>
+          </w:tcPr>
+          <w:p>
+            <w:pPr>
+              <w:jc w:val="center"/>
+              <w:rPr>
+                <w:rFonts w:ascii="Arial" w:eastAsia="Times New Roman" w:hAnsi="Arial" w:cs="Arial"/>
+                <w:sz w:val="22"/>
+                <w:szCs w:val="22"/>
+              </w:rPr>
+            </w:pPr>
+            <w:r>
+              <w:rPr>
+                <w:rFonts w:ascii="Arial" w:eastAsia="Times New Roman" w:hAnsi="Arial" w:cs="Arial"/>
+                <w:sz w:val="22"/>
+                <w:szCs w:val="22"/>
+              </w:rPr>
+              <w:t>48</w:t>
+            </w:r>
+          </w:p>
+        </w:tc>
+        <w:tc>
+          <w:tcPr>
+            <w:tcW w:w="0" w:type="auto"/>
+            <w:vAlign w:val="center"/>
+            <w:hideMark/>
+          </w:tcPr>
+          <w:p>
+            <w:pPr>
+              <w:jc w:val="center"/>
+              <w:rPr>
+                <w:rFonts w:ascii="Arial" w:eastAsia="Times New Roman" w:hAnsi="Arial" w:cs="Arial"/>
+                <w:sz w:val="22"/>
+                <w:szCs w:val="22"/>
+              </w:rPr>
+            </w:pPr>
+            <w:r>
+              <w:rPr>
+                <w:rFonts w:ascii="Arial" w:eastAsia="Times New Roman" w:hAnsi="Arial" w:cs="Arial"/>
+                <w:sz w:val="22"/>
+                <w:szCs w:val="22"/>
+              </w:rPr>
+              <w:t>34</w:t>
+            </w:r>
+          </w:p>
+        </w:tc>
+      </w:tr>
+      <w:tr>
+        <w:trPr>
+          <w:trHeight w:val="252"/>
+          <w:tblCellSpacing w:w="15" w:type="dxa"/>
+        </w:trPr>
+        <w:tc>
+          <w:tcPr>
+            <w:tcW w:w="0" w:type="auto"/>
+            <w:vAlign w:val="center"/>
+            <w:hideMark/>
+          </w:tcPr>
+          <w:p>
+            <w:pPr>
+              <w:rPr>
+                <w:rFonts w:ascii="Arial" w:eastAsia="Times New Roman" w:hAnsi="Arial" w:cs="Arial"/>
+                <w:sz w:val="22"/>
+                <w:szCs w:val="22"/>
+              </w:rPr>
+            </w:pPr>
+            <w:r>
+              <w:rPr>
+                <w:rFonts w:ascii="Arial" w:eastAsia="Times New Roman" w:hAnsi="Arial" w:cs="Arial"/>
+                <w:sz w:val="22"/>
+                <w:szCs w:val="22"/>
+              </w:rPr>
+              <w:t>Valence</w:t>
+            </w:r>
+          </w:p>
+        </w:tc>
+        <w:tc>
+          <w:tcPr>
+            <w:tcW w:w="0" w:type="auto"/>
+            <w:vAlign w:val="center"/>
+            <w:hideMark/>
+          </w:tcPr>
+          <w:p>
+            <w:pPr>
+              <w:jc w:val="center"/>
+              <w:rPr>
+                <w:rFonts w:ascii="Arial" w:eastAsia="Times New Roman" w:hAnsi="Arial" w:cs="Arial"/>
+                <w:sz w:val="22"/>
+                <w:szCs w:val="22"/>
+              </w:rPr>
+            </w:pPr>
+            <w:r>
+              <w:rPr>
+                <w:rFonts w:ascii="Arial" w:eastAsia="Times New Roman" w:hAnsi="Arial" w:cs="Arial"/>
+                <w:sz w:val="22"/>
+                <w:szCs w:val="22"/>
+              </w:rPr>
+              <w:t>40</w:t>
+            </w:r>
+          </w:p>
+        </w:tc>
+        <w:tc>
+          <w:tcPr>
+            <w:tcW w:w="0" w:type="auto"/>
+            <w:vAlign w:val="center"/>
+            <w:hideMark/>
+          </w:tcPr>
+          <w:p>
+            <w:pPr>
+              <w:jc w:val="center"/>
+              <w:rPr>
+                <w:rFonts w:ascii="Arial" w:eastAsia="Times New Roman" w:hAnsi="Arial" w:cs="Arial"/>
+                <w:sz w:val="22"/>
+                <w:szCs w:val="22"/>
+              </w:rPr>
+            </w:pPr>
+            <w:r>
+              <w:rPr>
+                <w:rFonts w:ascii="Arial" w:eastAsia="Times New Roman" w:hAnsi="Arial" w:cs="Arial"/>
+                <w:sz w:val="22"/>
+                <w:szCs w:val="22"/>
+              </w:rPr>
+              <w:t>35</w:t>
+            </w:r>
+          </w:p>
+        </w:tc>
+      </w:tr>
+    </w:tbl>
+    <w:p>
+      <w:pPr>
+        <w:spacing w:before="100" w:beforeAutospacing="1" w:after="100" w:afterAutospacing="1"/>
+        <w:rPr>
+          <w:rFonts w:ascii="Arial" w:eastAsia="Times New Roman" w:hAnsi="Arial" w:cs="Arial"/>
+          <w:sz w:val="22"/>
+          <w:szCs w:val="22"/>
+        </w:rPr>
+      </w:pPr>
+      <w:r>
+        <w:rPr>
+          <w:rFonts w:ascii="Arial" w:eastAsia="Times New Roman" w:hAnsi="Arial" w:cs="Arial"/>
+          <w:sz w:val="22"/>
+          <w:szCs w:val="22"/>
+        </w:rPr>
+        <w:t>Recommended sample sizes clustered tightly between 30 and 35 participants per item, with valence requiring the largest sample. Because our norming study collects all six variables from the same participants for each item, the design must satisfy the most demanding variable's requirement simultaneously. We therefore adopted a minimum sample size of 35 participants per item, which satisfies the combined precision and reliability criteria across all six variables.</w:t>
+      </w:r>
     </w:p>
     <w:p>
       <w:pPr>
@@ -1865,7 +3336,7 @@
         </w:rPr>
         <w:t>). Consequently, the choice of related words is key for the study. There are multiple measures of semantic similarity including the cosine between overlapping features</w:t>
       </w:r>
-      <w:hyperlink r:id="rId11">
+      <w:hyperlink r:id="rId12">
         <w:r>
           <w:rPr>
             <w:rFonts w:ascii="Arial" w:eastAsia="Arial" w:hAnsi="Arial" w:cs="Arial"/>
@@ -1883,7 +3354,7 @@
         </w:rPr>
         <w:t>, free association probabilities</w:t>
       </w:r>
-      <w:hyperlink r:id="rId12">
+      <w:hyperlink r:id="rId13">
         <w:r>
           <w:rPr>
             <w:rFonts w:ascii="Arial" w:eastAsia="Arial" w:hAnsi="Arial" w:cs="Arial"/>
@@ -1901,7 +3372,7 @@
         </w:rPr>
         <w:t>, and local/global coherence values from network models</w:t>
       </w:r>
-      <w:hyperlink r:id="rId13">
+      <w:hyperlink r:id="rId14">
         <w:r>
           <w:rPr>
             <w:rFonts w:ascii="Arial" w:eastAsia="Arial" w:hAnsi="Arial" w:cs="Arial"/>
@@ -1962,7 +3433,7 @@
         </w:rPr>
         <w:t xml:space="preserve"> package</w:t>
       </w:r>
-      <w:hyperlink r:id="rId14">
+      <w:hyperlink r:id="rId15">
         <w:r>
           <w:rPr>
             <w:rFonts w:ascii="Arial" w:eastAsia="Arial" w:hAnsi="Arial" w:cs="Arial"/>
@@ -1996,7 +3467,7 @@
         </w:rPr>
         <w:t xml:space="preserve"> used from the subs2vec project to identify concepts related to the 10000 most frequent words and to calculate their respective similarity values</w:t>
       </w:r>
-      <w:hyperlink r:id="rId15">
+      <w:hyperlink r:id="rId16">
         <w:r>
           <w:rPr>
             <w:rFonts w:ascii="Arial" w:eastAsia="Arial" w:hAnsi="Arial" w:cs="Arial"/>
@@ -2036,6 +3507,7 @@
           <w:sz w:val="22"/>
           <w:szCs w:val="22"/>
         </w:rPr>
+        <w:lastRenderedPageBreak/>
         <w:t>those were</w:t>
       </w:r>
       <w:r>
@@ -2173,16 +3645,7 @@
           <w:sz w:val="22"/>
           <w:szCs w:val="22"/>
         </w:rPr>
-        <w:t xml:space="preserve"> examined for their relative statistics on lexical measures (length, part of speech, neighborhood, phonemes/morphemes) </w:t>
-      </w:r>
-      <w:r>
-        <w:rPr>
-          <w:rFonts w:ascii="Arial" w:eastAsia="Arial" w:hAnsi="Arial" w:cs="Arial"/>
-          <w:sz w:val="22"/>
-          <w:szCs w:val="22"/>
-        </w:rPr>
-        <w:lastRenderedPageBreak/>
-        <w:t xml:space="preserve">and subjective measures (age of acquisition, imageability, concreteness, valence, dominance, arousal, and familiarity) because of their known associations with concept representation. </w:t>
+        <w:t xml:space="preserve"> examined for their relative statistics on lexical measures (length, part of speech, neighborhood, phonemes/morphemes) and subjective measures (age of acquisition, imageability, concreteness, valence, dominance, arousal, and familiarity) because of their known associations with concept representation. </w:t>
       </w:r>
       <w:r>
         <w:rPr>
@@ -2278,7 +3741,7 @@
         </w:rPr>
         <w:t xml:space="preserve">: </w:t>
       </w:r>
-      <w:hyperlink r:id="rId16" w:history="1">
+      <w:hyperlink r:id="rId17" w:history="1">
         <w:r>
           <w:rPr>
             <w:rStyle w:val="Hyperlink"/>
@@ -2362,15 +3825,7 @@
           <w:sz w:val="22"/>
           <w:szCs w:val="22"/>
         </w:rPr>
-        <w:t xml:space="preserve">A </w:t>
-      </w:r>
-      <w:r>
-        <w:rPr>
-          <w:rFonts w:ascii="Arial" w:eastAsia="Arial" w:hAnsi="Arial" w:cs="Arial"/>
-          <w:sz w:val="22"/>
-          <w:szCs w:val="22"/>
-        </w:rPr>
-        <w:t>small demonstration of the experiment can be found at:</w:t>
+        <w:t>A small demonstration of the experiment can be found at:</w:t>
       </w:r>
       <w:r>
         <w:rPr>
@@ -2380,7 +3835,7 @@
         </w:rPr>
         <w:t xml:space="preserve"> </w:t>
       </w:r>
-      <w:hyperlink r:id="rId17" w:history="1">
+      <w:hyperlink r:id="rId18" w:history="1">
         <w:r>
           <w:rPr>
             <w:rStyle w:val="Hyperlink"/>
@@ -2429,23 +3884,7 @@
           <w:sz w:val="22"/>
           <w:szCs w:val="22"/>
         </w:rPr>
-        <w:t xml:space="preserve"> (Henninger</w:t>
-      </w:r>
-      <w:r>
-        <w:rPr>
-          <w:rFonts w:ascii="Arial" w:eastAsia="Arial" w:hAnsi="Arial" w:cs="Arial"/>
-          <w:sz w:val="22"/>
-          <w:szCs w:val="22"/>
-        </w:rPr>
-        <w:t xml:space="preserve"> et al.</w:t>
-      </w:r>
-      <w:r>
-        <w:rPr>
-          <w:rFonts w:ascii="Arial" w:eastAsia="Arial" w:hAnsi="Arial" w:cs="Arial"/>
-          <w:sz w:val="22"/>
-          <w:szCs w:val="22"/>
-        </w:rPr>
-        <w:t>, 2019)</w:t>
+        <w:t xml:space="preserve"> (Henninger et al., 2019)</w:t>
       </w:r>
       <w:r>
         <w:rPr>
@@ -2461,23 +3900,7 @@
           <w:sz w:val="22"/>
           <w:szCs w:val="22"/>
         </w:rPr>
-        <w:t xml:space="preserve"> (Henninger</w:t>
-      </w:r>
-      <w:r>
-        <w:rPr>
-          <w:rFonts w:ascii="Arial" w:eastAsia="Arial" w:hAnsi="Arial" w:cs="Arial"/>
-          <w:sz w:val="22"/>
-          <w:szCs w:val="22"/>
-        </w:rPr>
-        <w:t xml:space="preserve"> et al.,</w:t>
-      </w:r>
-      <w:r>
-        <w:rPr>
-          <w:rFonts w:ascii="Arial" w:eastAsia="Arial" w:hAnsi="Arial" w:cs="Arial"/>
-          <w:sz w:val="22"/>
-          <w:szCs w:val="22"/>
-        </w:rPr>
-        <w:t>, 2018)</w:t>
+        <w:t xml:space="preserve"> (Henninger et al.,, 2018)</w:t>
       </w:r>
       <w:r>
         <w:rPr>
@@ -2487,7 +3910,7 @@
         </w:rPr>
         <w:t>, and previous work has shown no differences between lab and web-based data collection for response latencies</w:t>
       </w:r>
-      <w:hyperlink r:id="rId18">
+      <w:hyperlink r:id="rId19">
         <w:r>
           <w:rPr>
             <w:rFonts w:ascii="Arial" w:eastAsia="Arial" w:hAnsi="Arial" w:cs="Arial"/>
@@ -2505,7 +3928,7 @@
         </w:rPr>
         <w:t>. In addition, SPALEX, a large lexical decision database in Spanish was collected completely online</w:t>
       </w:r>
-      <w:hyperlink r:id="rId19">
+      <w:hyperlink r:id="rId20">
         <w:r>
           <w:rPr>
             <w:rFonts w:ascii="Arial" w:eastAsia="Arial" w:hAnsi="Arial" w:cs="Arial"/>
@@ -2654,6 +4077,197 @@
           <w:sz w:val="22"/>
           <w:szCs w:val="22"/>
         </w:rPr>
+        <w:t xml:space="preserve"> key depending on the common keyboard layout for that language (i.e., Z and / </w:t>
+      </w:r>
+      <w:proofErr w:type="spellStart"/>
+      <w:r>
+        <w:rPr>
+          <w:rFonts w:ascii="Arial" w:eastAsia="Arial" w:hAnsi="Arial" w:cs="Arial"/>
+          <w:sz w:val="22"/>
+          <w:szCs w:val="22"/>
+        </w:rPr>
+        <w:t>on</w:t>
+      </w:r>
+      <w:proofErr w:type="spellEnd"/>
+      <w:r>
+        <w:rPr>
+          <w:rFonts w:ascii="Arial" w:eastAsia="Arial" w:hAnsi="Arial" w:cs="Arial"/>
+          <w:sz w:val="22"/>
+          <w:szCs w:val="22"/>
+        </w:rPr>
+        <w:t xml:space="preserve"> a QWERTY keyboard or &gt; and - on a QWERTZ keyboard). </w:t>
+      </w:r>
+      <w:r>
+        <w:rPr>
+          <w:rFonts w:ascii="Arial" w:eastAsia="Arial" w:hAnsi="Arial" w:cs="Arial"/>
+          <w:sz w:val="22"/>
+          <w:szCs w:val="22"/>
+        </w:rPr>
+        <w:t>The mapping of the keys will d</w:t>
+      </w:r>
+      <w:r>
+        <w:rPr>
+          <w:rFonts w:ascii="Arial" w:eastAsia="Arial" w:hAnsi="Arial" w:cs="Arial"/>
+          <w:sz w:val="22"/>
+          <w:szCs w:val="22"/>
+        </w:rPr>
+        <w:t>e</w:t>
+      </w:r>
+      <w:r>
+        <w:rPr>
+          <w:rFonts w:ascii="Arial" w:eastAsia="Arial" w:hAnsi="Arial" w:cs="Arial"/>
+          <w:sz w:val="22"/>
+          <w:szCs w:val="22"/>
+        </w:rPr>
+        <w:t xml:space="preserve">pend on the participant </w:t>
+      </w:r>
+      <w:r>
+        <w:rPr>
+          <w:rFonts w:ascii="Arial" w:eastAsia="Arial" w:hAnsi="Arial" w:cs="Arial"/>
+          <w:sz w:val="22"/>
+          <w:szCs w:val="22"/>
+        </w:rPr>
+        <w:t>choice</w:t>
+      </w:r>
+      <w:r>
+        <w:rPr>
+          <w:rFonts w:ascii="Arial" w:eastAsia="Arial" w:hAnsi="Arial" w:cs="Arial"/>
+          <w:sz w:val="22"/>
+          <w:szCs w:val="22"/>
+        </w:rPr>
+        <w:t xml:space="preserve"> for handedness: the dominant hand will be mapped to the word </w:t>
+      </w:r>
+      <w:r>
+        <w:rPr>
+          <w:rFonts w:ascii="Arial" w:eastAsia="Arial" w:hAnsi="Arial" w:cs="Arial"/>
+          <w:sz w:val="22"/>
+          <w:szCs w:val="22"/>
+        </w:rPr>
+        <w:t>choice,</w:t>
+      </w:r>
+      <w:r>
+        <w:rPr>
+          <w:rFonts w:ascii="Arial" w:eastAsia="Arial" w:hAnsi="Arial" w:cs="Arial"/>
+          <w:sz w:val="22"/>
+          <w:szCs w:val="22"/>
+        </w:rPr>
+        <w:t xml:space="preserve"> and the non-dominant hand will be mapped to the non-word choice</w:t>
+      </w:r>
+      <w:r>
+        <w:rPr>
+          <w:rFonts w:ascii="Arial" w:eastAsia="Arial" w:hAnsi="Arial" w:cs="Arial"/>
+          <w:sz w:val="22"/>
+          <w:szCs w:val="22"/>
+        </w:rPr>
+        <w:t xml:space="preserve">. Participants will enter their choice for each concept, and then the next word will appear with an intertrial interval of 500 </w:t>
+      </w:r>
+      <w:proofErr w:type="spellStart"/>
+      <w:r>
+        <w:rPr>
+          <w:rFonts w:ascii="Arial" w:eastAsia="Arial" w:hAnsi="Arial" w:cs="Arial"/>
+          <w:sz w:val="22"/>
+          <w:szCs w:val="22"/>
+        </w:rPr>
+        <w:t>ms</w:t>
+      </w:r>
+      <w:proofErr w:type="spellEnd"/>
+      <w:r>
+        <w:rPr>
+          <w:rFonts w:ascii="Arial" w:eastAsia="Arial" w:hAnsi="Arial" w:cs="Arial"/>
+          <w:sz w:val="22"/>
+          <w:szCs w:val="22"/>
+        </w:rPr>
+        <w:t xml:space="preserve"> (i.e., the time between the offset of the first concept and onset of the next concept, when the fixation cross is showing). Responses </w:t>
+      </w:r>
+      <w:r>
+        <w:rPr>
+          <w:rFonts w:ascii="Arial" w:eastAsia="Arial" w:hAnsi="Arial" w:cs="Arial"/>
+          <w:sz w:val="22"/>
+          <w:szCs w:val="22"/>
+        </w:rPr>
+        <w:lastRenderedPageBreak/>
+        <w:t>will time out after 5 seconds and move on to the next trial. After ten trials, participants will see the instruction screen again with a reminder that they will now be doing the real task.</w:t>
+      </w:r>
+    </w:p>
+    <w:p>
+      <w:pPr>
+        <w:rPr>
+          <w:rFonts w:ascii="Arial" w:eastAsia="Arial" w:hAnsi="Arial" w:cs="Arial"/>
+          <w:sz w:val="22"/>
+          <w:szCs w:val="22"/>
+        </w:rPr>
+      </w:pPr>
+    </w:p>
+    <w:p>
+      <w:pPr>
+        <w:rPr>
+          <w:rFonts w:ascii="Arial" w:eastAsia="Arial" w:hAnsi="Arial" w:cs="Arial"/>
+          <w:sz w:val="22"/>
+          <w:szCs w:val="22"/>
+        </w:rPr>
+      </w:pPr>
+      <w:r>
+        <w:rPr>
+          <w:rFonts w:ascii="Arial" w:eastAsia="Arial" w:hAnsi="Arial" w:cs="Arial"/>
+          <w:sz w:val="22"/>
+          <w:szCs w:val="22"/>
+        </w:rPr>
+        <w:t xml:space="preserve">After 100 trials, the participants will be shown a short break screen with the option to continue by hitting the spacebar after 10 seconds. After </w:t>
+      </w:r>
+      <w:r>
+        <w:rPr>
+          <w:rFonts w:ascii="Arial" w:eastAsia="Arial" w:hAnsi="Arial" w:cs="Arial"/>
+          <w:sz w:val="22"/>
+          <w:szCs w:val="22"/>
+        </w:rPr>
+        <w:t xml:space="preserve">eight </w:t>
+      </w:r>
+      <w:r>
+        <w:rPr>
+          <w:rFonts w:ascii="Arial" w:eastAsia="Arial" w:hAnsi="Arial" w:cs="Arial"/>
+          <w:sz w:val="22"/>
+          <w:szCs w:val="22"/>
+        </w:rPr>
+        <w:t>blocks of 100 trials (</w:t>
+      </w:r>
+      <w:r>
+        <w:rPr>
+          <w:rFonts w:ascii="Arial" w:eastAsia="Arial" w:hAnsi="Arial" w:cs="Arial"/>
+          <w:sz w:val="22"/>
+          <w:szCs w:val="22"/>
+        </w:rPr>
+        <w:t>8</w:t>
+      </w:r>
+      <w:r>
+        <w:rPr>
+          <w:rFonts w:ascii="Arial" w:eastAsia="Arial" w:hAnsi="Arial" w:cs="Arial"/>
+          <w:sz w:val="22"/>
+          <w:szCs w:val="22"/>
+        </w:rPr>
+        <w:t xml:space="preserve">00 words), the experiment will end with a thank you screen. On this screen, </w:t>
+      </w:r>
+      <w:r>
+        <w:rPr>
+          <w:rFonts w:ascii="Arial" w:eastAsia="Arial" w:hAnsi="Arial" w:cs="Arial"/>
+          <w:sz w:val="22"/>
+          <w:szCs w:val="22"/>
+        </w:rPr>
+        <w:t>participants</w:t>
+      </w:r>
+      <w:r>
+        <w:rPr>
+          <w:rFonts w:ascii="Arial" w:eastAsia="Arial" w:hAnsi="Arial" w:cs="Arial"/>
+          <w:sz w:val="22"/>
+          <w:szCs w:val="22"/>
+        </w:rPr>
+        <w:t xml:space="preserve"> will be given instructions on how to indicate they have completed the study to the appropriate lab.</w:t>
+      </w:r>
+      <w:r>
+        <w:rPr>
+          <w:rFonts w:ascii="Arial" w:eastAsia="Arial" w:hAnsi="Arial" w:cs="Arial"/>
+          <w:sz w:val="22"/>
+          <w:szCs w:val="22"/>
+        </w:rPr>
         <w:t xml:space="preserve"> </w:t>
       </w:r>
       <w:r>
@@ -2662,7 +4276,642 @@
           <w:sz w:val="22"/>
           <w:szCs w:val="22"/>
         </w:rPr>
-        <w:t xml:space="preserve">key depending on the common keyboard layout for that language (i.e., Z and / </w:t>
+        <w:t xml:space="preserve">These values will be customized based on data collection type (i.e., Mechanical Turk, participant pool, etc.). An estimate </w:t>
+      </w:r>
+      <w:r>
+        <w:rPr>
+          <w:rFonts w:ascii="Arial" w:eastAsia="Arial" w:hAnsi="Arial" w:cs="Arial"/>
+          <w:sz w:val="22"/>
+          <w:szCs w:val="22"/>
+        </w:rPr>
+        <w:t>for</w:t>
+      </w:r>
+      <w:r>
+        <w:rPr>
+          <w:rFonts w:ascii="Arial" w:eastAsia="Arial" w:hAnsi="Arial" w:cs="Arial"/>
+          <w:sz w:val="22"/>
+          <w:szCs w:val="22"/>
+        </w:rPr>
+        <w:t xml:space="preserve"> time required for the study is approximately twenty to thirty minutes including practice trials, instructions, and breaks. </w:t>
+      </w:r>
+    </w:p>
+    <w:p>
+      <w:pPr>
+        <w:pStyle w:val="Heading3"/>
+        <w:rPr>
+          <w:rFonts w:ascii="Arial" w:hAnsi="Arial" w:cs="Arial"/>
+        </w:rPr>
+      </w:pPr>
+      <w:bookmarkStart w:id="8" w:name="_Toc225617956"/>
+      <w:r>
+        <w:rPr>
+          <w:rFonts w:ascii="Arial" w:hAnsi="Arial" w:cs="Arial"/>
+        </w:rPr>
+        <w:t>Subjective Ratings</w:t>
+      </w:r>
+      <w:bookmarkEnd w:id="8"/>
+    </w:p>
+    <w:p>
+      <w:pPr>
+        <w:rPr>
+          <w:rFonts w:ascii="Arial" w:eastAsia="Arial" w:hAnsi="Arial" w:cs="Arial"/>
+          <w:sz w:val="22"/>
+          <w:szCs w:val="22"/>
+        </w:rPr>
+      </w:pPr>
+    </w:p>
+    <w:p>
+      <w:pPr>
+        <w:rPr>
+          <w:rFonts w:ascii="Arial" w:eastAsia="Arial" w:hAnsi="Arial" w:cs="Arial"/>
+          <w:sz w:val="22"/>
+          <w:szCs w:val="22"/>
+        </w:rPr>
+      </w:pPr>
+      <w:r>
+        <w:rPr>
+          <w:rFonts w:ascii="Arial" w:eastAsia="Arial" w:hAnsi="Arial" w:cs="Arial"/>
+          <w:sz w:val="22"/>
+          <w:szCs w:val="22"/>
+        </w:rPr>
+        <w:t xml:space="preserve">Subjective measures are concept characteristics that are rated by participants, such as age of acquisition (approximate age you learned a concept), imageability (how easy the concept is to imagine), concreteness (how concrete is the concept), valence (emotion), arousal, and familiarity. For concepts that are missing these values in a target language, participants will be asked to provide ratings on a single metric (i.e., they would only see instructions for familiarity or arousal). Each participant will be asked to provide </w:t>
+      </w:r>
+      <w:r>
+        <w:rPr>
+          <w:rFonts w:ascii="Arial" w:eastAsia="Arial" w:hAnsi="Arial" w:cs="Arial"/>
+          <w:sz w:val="22"/>
+          <w:szCs w:val="22"/>
+        </w:rPr>
+        <w:t>400</w:t>
+      </w:r>
+      <w:r>
+        <w:rPr>
+          <w:rFonts w:ascii="Arial" w:eastAsia="Arial" w:hAnsi="Arial" w:cs="Arial"/>
+          <w:sz w:val="22"/>
+          <w:szCs w:val="22"/>
+        </w:rPr>
+        <w:t xml:space="preserve"> ratings of concepts</w:t>
+      </w:r>
+      <w:r>
+        <w:rPr>
+          <w:rFonts w:ascii="Arial" w:eastAsia="Arial" w:hAnsi="Arial" w:cs="Arial"/>
+          <w:sz w:val="22"/>
+          <w:szCs w:val="22"/>
+        </w:rPr>
+        <w:t xml:space="preserve"> per test session</w:t>
+      </w:r>
+      <w:r>
+        <w:rPr>
+          <w:rFonts w:ascii="Arial" w:eastAsia="Arial" w:hAnsi="Arial" w:cs="Arial"/>
+          <w:sz w:val="22"/>
+          <w:szCs w:val="22"/>
+        </w:rPr>
+        <w:t xml:space="preserve">, given the need for a particular language, while also controlling for the length of the task to prevent fatigue in the experiment. </w:t>
+      </w:r>
+      <w:r>
+        <w:rPr>
+          <w:rFonts w:ascii="Arial" w:eastAsia="Arial" w:hAnsi="Arial" w:cs="Arial"/>
+          <w:sz w:val="22"/>
+          <w:szCs w:val="22"/>
+        </w:rPr>
+        <w:t xml:space="preserve">We will first target real words from our priming task described above for norming that do not have data in previously published norms. We will use a random selection of the previously normed real words to ensure all participants see the same number of trials.  </w:t>
+      </w:r>
+    </w:p>
+    <w:p>
+      <w:pPr>
+        <w:pStyle w:val="Heading2"/>
+        <w:rPr>
+          <w:rFonts w:ascii="Arial" w:hAnsi="Arial" w:cs="Arial"/>
+        </w:rPr>
+      </w:pPr>
+      <w:bookmarkStart w:id="9" w:name="_Toc225617957"/>
+      <w:r>
+        <w:rPr>
+          <w:rFonts w:ascii="Arial" w:hAnsi="Arial" w:cs="Arial"/>
+        </w:rPr>
+        <w:t>Specific Study Materials:</w:t>
+      </w:r>
+      <w:bookmarkEnd w:id="9"/>
+    </w:p>
+    <w:p>
+      <w:pPr>
+        <w:rPr>
+          <w:rFonts w:ascii="Arial" w:hAnsi="Arial" w:cs="Arial"/>
+          <w:sz w:val="22"/>
+          <w:szCs w:val="22"/>
+        </w:rPr>
+      </w:pPr>
+      <w:r>
+        <w:rPr>
+          <w:rFonts w:ascii="Arial" w:hAnsi="Arial" w:cs="Arial"/>
+          <w:sz w:val="22"/>
+          <w:szCs w:val="22"/>
+        </w:rPr>
+        <w:t>For full translations requirements please see our translation sheet here:</w:t>
+      </w:r>
+    </w:p>
+    <w:bookmarkStart w:id="10" w:name="_Toc225617958"/>
+    <w:p>
+      <w:pPr>
+        <w:pStyle w:val="Heading3"/>
+        <w:rPr>
+          <w:rFonts w:ascii="Arial" w:hAnsi="Arial" w:cs="Arial"/>
+          <w:b w:val="0"/>
+          <w:sz w:val="22"/>
+          <w:szCs w:val="22"/>
+        </w:rPr>
+      </w:pPr>
+      <w:r>
+        <w:rPr>
+          <w:rFonts w:ascii="Arial" w:hAnsi="Arial" w:cs="Arial"/>
+          <w:b w:val="0"/>
+          <w:sz w:val="22"/>
+          <w:szCs w:val="22"/>
+        </w:rPr>
+        <w:fldChar w:fldCharType="begin"/>
+      </w:r>
+      <w:r>
+        <w:rPr>
+          <w:rFonts w:ascii="Arial" w:hAnsi="Arial" w:cs="Arial"/>
+          <w:b w:val="0"/>
+          <w:sz w:val="22"/>
+          <w:szCs w:val="22"/>
+        </w:rPr>
+        <w:instrText>HYPERLINK "</w:instrText>
+      </w:r>
+      <w:r>
+        <w:rPr>
+          <w:rFonts w:ascii="Arial" w:hAnsi="Arial" w:cs="Arial"/>
+          <w:b w:val="0"/>
+          <w:sz w:val="22"/>
+          <w:szCs w:val="22"/>
+        </w:rPr>
+        <w:instrText>https://github.com/SemanticPriming/ML-One-Network/blob/main/01-Translation/04_translate_experiment/task_translation_template.xlsx</w:instrText>
+      </w:r>
+      <w:r>
+        <w:rPr>
+          <w:rFonts w:ascii="Arial" w:hAnsi="Arial" w:cs="Arial"/>
+          <w:b w:val="0"/>
+          <w:sz w:val="22"/>
+          <w:szCs w:val="22"/>
+        </w:rPr>
+        <w:instrText>"</w:instrText>
+      </w:r>
+      <w:r>
+        <w:rPr>
+          <w:rFonts w:ascii="Arial" w:hAnsi="Arial" w:cs="Arial"/>
+          <w:b w:val="0"/>
+          <w:sz w:val="22"/>
+          <w:szCs w:val="22"/>
+        </w:rPr>
+        <w:fldChar w:fldCharType="separate"/>
+      </w:r>
+      <w:r>
+        <w:rPr>
+          <w:rStyle w:val="Hyperlink"/>
+          <w:rFonts w:ascii="Arial" w:hAnsi="Arial" w:cs="Arial"/>
+          <w:b w:val="0"/>
+          <w:sz w:val="22"/>
+          <w:szCs w:val="22"/>
+        </w:rPr>
+        <w:t>https://github.com/SemanticPriming/ML-One-Network/blob/main/01-Translation/04_translate_experiment/task_translation_template.xlsx</w:t>
+      </w:r>
+      <w:r>
+        <w:rPr>
+          <w:rFonts w:ascii="Arial" w:hAnsi="Arial" w:cs="Arial"/>
+          <w:b w:val="0"/>
+          <w:sz w:val="22"/>
+          <w:szCs w:val="22"/>
+        </w:rPr>
+        <w:fldChar w:fldCharType="end"/>
+      </w:r>
+    </w:p>
+    <w:p>
+      <w:pPr>
+        <w:pStyle w:val="Heading3"/>
+        <w:rPr>
+          <w:rFonts w:ascii="Arial" w:hAnsi="Arial" w:cs="Arial"/>
+        </w:rPr>
+      </w:pPr>
+      <w:r>
+        <w:rPr>
+          <w:rFonts w:ascii="Arial" w:hAnsi="Arial" w:cs="Arial"/>
+        </w:rPr>
+        <w:t xml:space="preserve">Demographics: </w:t>
+      </w:r>
+      <w:r>
+        <w:rPr>
+          <w:rFonts w:ascii="Arial" w:hAnsi="Arial" w:cs="Arial"/>
+        </w:rPr>
+        <w:t>Shown on all tasks</w:t>
+      </w:r>
+      <w:bookmarkEnd w:id="10"/>
+      <w:r>
+        <w:rPr>
+          <w:rFonts w:ascii="Arial" w:hAnsi="Arial" w:cs="Arial"/>
+        </w:rPr>
+        <w:t xml:space="preserve"> </w:t>
+      </w:r>
+    </w:p>
+    <w:p>
+      <w:pPr>
+        <w:rPr>
+          <w:rFonts w:ascii="Arial" w:hAnsi="Arial" w:cs="Arial"/>
+        </w:rPr>
+      </w:pPr>
+    </w:p>
+    <w:p>
+      <w:pPr>
+        <w:jc w:val="both"/>
+        <w:rPr>
+          <w:rFonts w:ascii="Arial" w:eastAsia="Arial" w:hAnsi="Arial" w:cs="Arial"/>
+          <w:sz w:val="22"/>
+          <w:szCs w:val="22"/>
+        </w:rPr>
+      </w:pPr>
+      <w:r>
+        <w:rPr>
+          <w:rFonts w:ascii="Arial" w:eastAsia="Arial" w:hAnsi="Arial" w:cs="Arial"/>
+          <w:sz w:val="22"/>
+          <w:szCs w:val="22"/>
+        </w:rPr>
+        <w:t>Please tell us a little bit about yourself.</w:t>
+      </w:r>
+      <w:r>
+        <w:rPr>
+          <w:rFonts w:ascii="Arial" w:eastAsia="Arial" w:hAnsi="Arial" w:cs="Arial"/>
+          <w:sz w:val="22"/>
+          <w:szCs w:val="22"/>
+        </w:rPr>
+        <w:t xml:space="preserve"> [title of page]</w:t>
+      </w:r>
+    </w:p>
+    <w:p>
+      <w:pPr>
+        <w:jc w:val="both"/>
+        <w:rPr>
+          <w:rFonts w:ascii="Arial" w:eastAsia="Arial" w:hAnsi="Arial" w:cs="Arial"/>
+          <w:sz w:val="22"/>
+          <w:szCs w:val="22"/>
+        </w:rPr>
+      </w:pPr>
+      <w:r>
+        <w:rPr>
+          <w:rFonts w:ascii="Arial" w:eastAsia="Arial" w:hAnsi="Arial" w:cs="Arial"/>
+          <w:sz w:val="22"/>
+          <w:szCs w:val="22"/>
+        </w:rPr>
+        <w:t>Please tell us your gender: male female other prefer not to say</w:t>
+      </w:r>
+    </w:p>
+    <w:p>
+      <w:pPr>
+        <w:jc w:val="both"/>
+        <w:rPr>
+          <w:rFonts w:ascii="Arial" w:eastAsia="Arial" w:hAnsi="Arial" w:cs="Arial"/>
+          <w:sz w:val="22"/>
+          <w:szCs w:val="22"/>
+        </w:rPr>
+      </w:pPr>
+      <w:r>
+        <w:rPr>
+          <w:rFonts w:ascii="Arial" w:eastAsia="Arial" w:hAnsi="Arial" w:cs="Arial"/>
+          <w:sz w:val="22"/>
+          <w:szCs w:val="22"/>
+        </w:rPr>
+        <w:t xml:space="preserve">Which year were you born? Please enter a four-digit year: </w:t>
+      </w:r>
+    </w:p>
+    <w:p>
+      <w:pPr>
+        <w:jc w:val="both"/>
+        <w:rPr>
+          <w:rFonts w:ascii="Arial" w:eastAsia="Arial" w:hAnsi="Arial" w:cs="Arial"/>
+          <w:sz w:val="22"/>
+          <w:szCs w:val="22"/>
+        </w:rPr>
+      </w:pPr>
+      <w:r>
+        <w:rPr>
+          <w:rFonts w:ascii="Arial" w:eastAsia="Arial" w:hAnsi="Arial" w:cs="Arial"/>
+          <w:sz w:val="22"/>
+          <w:szCs w:val="22"/>
+        </w:rPr>
+        <w:t xml:space="preserve">Please tell us your highest education level: Less than high school diploma, High school diploma, </w:t>
+      </w:r>
+      <w:proofErr w:type="gramStart"/>
+      <w:r>
+        <w:rPr>
+          <w:rFonts w:ascii="Arial" w:eastAsia="Arial" w:hAnsi="Arial" w:cs="Arial"/>
+          <w:sz w:val="22"/>
+          <w:szCs w:val="22"/>
+        </w:rPr>
+        <w:t>Associate’s</w:t>
+      </w:r>
+      <w:proofErr w:type="gramEnd"/>
+      <w:r>
+        <w:rPr>
+          <w:rFonts w:ascii="Arial" w:eastAsia="Arial" w:hAnsi="Arial" w:cs="Arial"/>
+          <w:sz w:val="22"/>
+          <w:szCs w:val="22"/>
+        </w:rPr>
+        <w:t xml:space="preserve"> degree or two-year degree, </w:t>
+      </w:r>
+      <w:proofErr w:type="gramStart"/>
+      <w:r>
+        <w:rPr>
+          <w:rFonts w:ascii="Arial" w:eastAsia="Arial" w:hAnsi="Arial" w:cs="Arial"/>
+          <w:sz w:val="22"/>
+          <w:szCs w:val="22"/>
+        </w:rPr>
+        <w:t>Bachelor’s</w:t>
+      </w:r>
+      <w:proofErr w:type="gramEnd"/>
+      <w:r>
+        <w:rPr>
+          <w:rFonts w:ascii="Arial" w:eastAsia="Arial" w:hAnsi="Arial" w:cs="Arial"/>
+          <w:sz w:val="22"/>
+          <w:szCs w:val="22"/>
+        </w:rPr>
+        <w:t xml:space="preserve"> degree or four-year degree, </w:t>
+      </w:r>
+      <w:proofErr w:type="gramStart"/>
+      <w:r>
+        <w:rPr>
+          <w:rFonts w:ascii="Arial" w:eastAsia="Arial" w:hAnsi="Arial" w:cs="Arial"/>
+          <w:sz w:val="22"/>
+          <w:szCs w:val="22"/>
+        </w:rPr>
+        <w:t>Master’s</w:t>
+      </w:r>
+      <w:proofErr w:type="gramEnd"/>
+      <w:r>
+        <w:rPr>
+          <w:rFonts w:ascii="Arial" w:eastAsia="Arial" w:hAnsi="Arial" w:cs="Arial"/>
+          <w:sz w:val="22"/>
+          <w:szCs w:val="22"/>
+        </w:rPr>
+        <w:t xml:space="preserve"> degree or equivalent, Doctoral degree or equivalent (please note these will be made culturally relevant for each language)</w:t>
+      </w:r>
+    </w:p>
+    <w:p>
+      <w:pPr>
+        <w:jc w:val="both"/>
+        <w:rPr>
+          <w:rFonts w:ascii="Arial" w:eastAsia="Arial" w:hAnsi="Arial" w:cs="Arial"/>
+          <w:sz w:val="22"/>
+          <w:szCs w:val="22"/>
+        </w:rPr>
+      </w:pPr>
+      <w:r>
+        <w:rPr>
+          <w:rFonts w:ascii="Arial" w:eastAsia="Arial" w:hAnsi="Arial" w:cs="Arial"/>
+          <w:sz w:val="22"/>
+          <w:szCs w:val="22"/>
+        </w:rPr>
+        <w:t>What is your native (first) language?</w:t>
+      </w:r>
+    </w:p>
+    <w:p>
+      <w:pPr>
+        <w:rPr>
+          <w:rFonts w:ascii="Arial" w:eastAsia="Arial" w:hAnsi="Arial" w:cs="Arial"/>
+          <w:sz w:val="22"/>
+          <w:szCs w:val="22"/>
+        </w:rPr>
+      </w:pPr>
+      <w:r>
+        <w:rPr>
+          <w:rFonts w:ascii="Arial" w:eastAsia="Arial" w:hAnsi="Arial" w:cs="Arial"/>
+          <w:sz w:val="22"/>
+          <w:szCs w:val="22"/>
+        </w:rPr>
+        <w:t>Are you primarily left- or right-</w:t>
+      </w:r>
+      <w:proofErr w:type="gramStart"/>
+      <w:r>
+        <w:rPr>
+          <w:rFonts w:ascii="Arial" w:eastAsia="Arial" w:hAnsi="Arial" w:cs="Arial"/>
+          <w:sz w:val="22"/>
+          <w:szCs w:val="22"/>
+        </w:rPr>
+        <w:t>handed?:</w:t>
+      </w:r>
+      <w:proofErr w:type="gramEnd"/>
+      <w:r>
+        <w:rPr>
+          <w:rFonts w:ascii="Arial" w:eastAsia="Arial" w:hAnsi="Arial" w:cs="Arial"/>
+          <w:sz w:val="22"/>
+          <w:szCs w:val="22"/>
+        </w:rPr>
+        <w:t xml:space="preserve"> Left-handed, Right-handed</w:t>
+      </w:r>
+    </w:p>
+    <w:p>
+      <w:pPr>
+        <w:rPr>
+          <w:rFonts w:ascii="Arial" w:eastAsia="Arial" w:hAnsi="Arial" w:cs="Arial"/>
+          <w:sz w:val="22"/>
+          <w:szCs w:val="22"/>
+        </w:rPr>
+      </w:pPr>
+    </w:p>
+    <w:p>
+      <w:pPr>
+        <w:pStyle w:val="Heading3"/>
+        <w:rPr>
+          <w:rFonts w:ascii="Arial" w:hAnsi="Arial" w:cs="Arial"/>
+        </w:rPr>
+      </w:pPr>
+      <w:r>
+        <w:rPr>
+          <w:rFonts w:ascii="Arial" w:hAnsi="Arial" w:cs="Arial"/>
+        </w:rPr>
+        <w:t>End Screen: Shown on all tasks</w:t>
+      </w:r>
+    </w:p>
+    <w:p>
+      <w:pPr>
+        <w:rPr>
+          <w:rFonts w:ascii="Arial" w:eastAsia="Arial" w:hAnsi="Arial" w:cs="Arial"/>
+          <w:b/>
+          <w:sz w:val="22"/>
+          <w:szCs w:val="22"/>
+        </w:rPr>
+      </w:pPr>
+    </w:p>
+    <w:p>
+      <w:pPr>
+        <w:rPr>
+          <w:rFonts w:ascii="Arial" w:eastAsia="Arial" w:hAnsi="Arial" w:cs="Arial"/>
+          <w:bCs/>
+          <w:sz w:val="22"/>
+          <w:szCs w:val="22"/>
+        </w:rPr>
+      </w:pPr>
+      <w:r>
+        <w:rPr>
+          <w:rFonts w:ascii="Arial" w:eastAsia="Arial" w:hAnsi="Arial" w:cs="Arial"/>
+          <w:bCs/>
+          <w:sz w:val="22"/>
+          <w:szCs w:val="22"/>
+        </w:rPr>
+        <w:t>You have completed the word ratings.</w:t>
+      </w:r>
+    </w:p>
+    <w:p>
+      <w:pPr>
+        <w:rPr>
+          <w:rFonts w:ascii="Arial" w:eastAsia="Arial" w:hAnsi="Arial" w:cs="Arial"/>
+          <w:bCs/>
+          <w:sz w:val="22"/>
+          <w:szCs w:val="22"/>
+        </w:rPr>
+      </w:pPr>
+    </w:p>
+    <w:p>
+      <w:pPr>
+        <w:rPr>
+          <w:rFonts w:ascii="Arial" w:eastAsia="Arial" w:hAnsi="Arial" w:cs="Arial"/>
+          <w:bCs/>
+          <w:sz w:val="22"/>
+          <w:szCs w:val="22"/>
+        </w:rPr>
+      </w:pPr>
+      <w:r>
+        <w:rPr>
+          <w:rFonts w:ascii="Arial" w:eastAsia="Arial" w:hAnsi="Arial" w:cs="Arial"/>
+          <w:bCs/>
+          <w:sz w:val="22"/>
+          <w:szCs w:val="22"/>
+        </w:rPr>
+        <w:t>Your participant number is:</w:t>
+      </w:r>
+    </w:p>
+    <w:p>
+      <w:pPr>
+        <w:rPr>
+          <w:rFonts w:ascii="Arial" w:eastAsia="Arial" w:hAnsi="Arial" w:cs="Arial"/>
+          <w:bCs/>
+          <w:sz w:val="22"/>
+          <w:szCs w:val="22"/>
+        </w:rPr>
+      </w:pPr>
+    </w:p>
+    <w:p>
+      <w:pPr>
+        <w:rPr>
+          <w:rFonts w:ascii="Arial" w:eastAsia="Arial" w:hAnsi="Arial" w:cs="Arial"/>
+          <w:bCs/>
+          <w:sz w:val="22"/>
+          <w:szCs w:val="22"/>
+        </w:rPr>
+      </w:pPr>
+      <w:r>
+        <w:rPr>
+          <w:rFonts w:ascii="Arial" w:eastAsia="Arial" w:hAnsi="Arial" w:cs="Arial"/>
+          <w:bCs/>
+          <w:sz w:val="22"/>
+          <w:szCs w:val="22"/>
+        </w:rPr>
+        <w:t xml:space="preserve">[random number] </w:t>
+      </w:r>
+    </w:p>
+    <w:p>
+      <w:pPr>
+        <w:rPr>
+          <w:rFonts w:ascii="Arial" w:eastAsia="Arial" w:hAnsi="Arial" w:cs="Arial"/>
+          <w:bCs/>
+          <w:sz w:val="22"/>
+          <w:szCs w:val="22"/>
+        </w:rPr>
+      </w:pPr>
+    </w:p>
+    <w:p>
+      <w:pPr>
+        <w:rPr>
+          <w:rFonts w:ascii="Arial" w:eastAsia="Arial" w:hAnsi="Arial" w:cs="Arial"/>
+          <w:bCs/>
+          <w:sz w:val="22"/>
+          <w:szCs w:val="22"/>
+        </w:rPr>
+      </w:pPr>
+      <w:r>
+        <w:rPr>
+          <w:rFonts w:ascii="Arial" w:eastAsia="Arial" w:hAnsi="Arial" w:cs="Arial"/>
+          <w:bCs/>
+          <w:sz w:val="22"/>
+          <w:szCs w:val="22"/>
+        </w:rPr>
+        <w:t>Please keep or copy this number if you are asked for it.</w:t>
+      </w:r>
+    </w:p>
+    <w:p>
+      <w:pPr>
+        <w:pStyle w:val="Heading3"/>
+        <w:rPr>
+          <w:rFonts w:ascii="Arial" w:hAnsi="Arial" w:cs="Arial"/>
+        </w:rPr>
+      </w:pPr>
+      <w:bookmarkStart w:id="11" w:name="_Toc225617959"/>
+      <w:r>
+        <w:rPr>
+          <w:rFonts w:ascii="Arial" w:hAnsi="Arial" w:cs="Arial"/>
+        </w:rPr>
+        <w:t>Semantic priming task:</w:t>
+      </w:r>
+      <w:bookmarkEnd w:id="11"/>
+    </w:p>
+    <w:p>
+      <w:pPr>
+        <w:jc w:val="both"/>
+        <w:rPr>
+          <w:rFonts w:ascii="Arial" w:eastAsia="Arial" w:hAnsi="Arial" w:cs="Arial"/>
+          <w:sz w:val="22"/>
+          <w:szCs w:val="22"/>
+        </w:rPr>
+      </w:pPr>
+      <w:r>
+        <w:rPr>
+          <w:rFonts w:ascii="Arial" w:eastAsia="Arial" w:hAnsi="Arial" w:cs="Arial"/>
+          <w:sz w:val="22"/>
+          <w:szCs w:val="22"/>
+        </w:rPr>
+        <w:t xml:space="preserve">This experiment is concerned with how people process words. You will be asked to view words and judge them. The words will be presented in the middle of the screen. You should ask yourself if the word on the screen is a real word or a fake word. If you recognize the word on the screen like </w:t>
+      </w:r>
+      <w:r>
+        <w:rPr>
+          <w:rFonts w:ascii="Arial" w:eastAsia="Arial" w:hAnsi="Arial" w:cs="Arial"/>
+          <w:b/>
+          <w:sz w:val="22"/>
+          <w:szCs w:val="22"/>
+        </w:rPr>
+        <w:t>COLD</w:t>
+      </w:r>
+      <w:r>
+        <w:rPr>
+          <w:rFonts w:ascii="Arial" w:eastAsia="Arial" w:hAnsi="Arial" w:cs="Arial"/>
+          <w:sz w:val="22"/>
+          <w:szCs w:val="22"/>
+        </w:rPr>
+        <w:t xml:space="preserve">, please press the </w:t>
+      </w:r>
+      <w:r>
+        <w:rPr>
+          <w:rFonts w:ascii="Arial" w:eastAsia="Arial" w:hAnsi="Arial" w:cs="Arial"/>
+          <w:b/>
+          <w:sz w:val="22"/>
+          <w:szCs w:val="22"/>
+        </w:rPr>
+        <w:t>KEY</w:t>
+      </w:r>
+      <w:r>
+        <w:rPr>
+          <w:rFonts w:ascii="Arial" w:eastAsia="Arial" w:hAnsi="Arial" w:cs="Arial"/>
+          <w:sz w:val="22"/>
+          <w:szCs w:val="22"/>
+        </w:rPr>
+        <w:t xml:space="preserve"> </w:t>
       </w:r>
       <w:proofErr w:type="spellStart"/>
       <w:r>
@@ -2671,7 +4920,7 @@
           <w:sz w:val="22"/>
           <w:szCs w:val="22"/>
         </w:rPr>
-        <w:t>on</w:t>
+        <w:t>key</w:t>
       </w:r>
       <w:proofErr w:type="spellEnd"/>
       <w:r>
@@ -2680,71 +4929,41 @@
           <w:sz w:val="22"/>
           <w:szCs w:val="22"/>
         </w:rPr>
-        <w:t xml:space="preserve"> a QWERTY keyboard or &gt; and - on a QWERTZ keyboard). </w:t>
-      </w:r>
-      <w:r>
-        <w:rPr>
-          <w:rFonts w:ascii="Arial" w:eastAsia="Arial" w:hAnsi="Arial" w:cs="Arial"/>
-          <w:sz w:val="22"/>
-          <w:szCs w:val="22"/>
-        </w:rPr>
-        <w:t>The mapping of the keys will d</w:t>
-      </w:r>
-      <w:r>
-        <w:rPr>
-          <w:rFonts w:ascii="Arial" w:eastAsia="Arial" w:hAnsi="Arial" w:cs="Arial"/>
-          <w:sz w:val="22"/>
-          <w:szCs w:val="22"/>
-        </w:rPr>
-        <w:t>e</w:t>
-      </w:r>
-      <w:r>
-        <w:rPr>
-          <w:rFonts w:ascii="Arial" w:eastAsia="Arial" w:hAnsi="Arial" w:cs="Arial"/>
-          <w:sz w:val="22"/>
-          <w:szCs w:val="22"/>
-        </w:rPr>
-        <w:t xml:space="preserve">pend on the participant </w:t>
-      </w:r>
-      <w:r>
-        <w:rPr>
-          <w:rFonts w:ascii="Arial" w:eastAsia="Arial" w:hAnsi="Arial" w:cs="Arial"/>
-          <w:sz w:val="22"/>
-          <w:szCs w:val="22"/>
-        </w:rPr>
-        <w:t>choice</w:t>
-      </w:r>
-      <w:r>
-        <w:rPr>
-          <w:rFonts w:ascii="Arial" w:eastAsia="Arial" w:hAnsi="Arial" w:cs="Arial"/>
-          <w:sz w:val="22"/>
-          <w:szCs w:val="22"/>
-        </w:rPr>
-        <w:t xml:space="preserve"> for handedness: the dominant hand will be mapped to the word </w:t>
-      </w:r>
-      <w:r>
-        <w:rPr>
-          <w:rFonts w:ascii="Arial" w:eastAsia="Arial" w:hAnsi="Arial" w:cs="Arial"/>
-          <w:sz w:val="22"/>
-          <w:szCs w:val="22"/>
-        </w:rPr>
-        <w:t>choice,</w:t>
-      </w:r>
-      <w:r>
-        <w:rPr>
-          <w:rFonts w:ascii="Arial" w:eastAsia="Arial" w:hAnsi="Arial" w:cs="Arial"/>
-          <w:sz w:val="22"/>
-          <w:szCs w:val="22"/>
-        </w:rPr>
-        <w:t xml:space="preserve"> and the non-dominant hand will be mapped to the non-word choice</w:t>
-      </w:r>
-      <w:r>
-        <w:rPr>
-          <w:rFonts w:ascii="Arial" w:eastAsia="Arial" w:hAnsi="Arial" w:cs="Arial"/>
-          <w:sz w:val="22"/>
-          <w:szCs w:val="22"/>
-        </w:rPr>
-        <w:t xml:space="preserve">. Participants will enter their choice for each concept, and then the next word will appear with an intertrial interval of 500 </w:t>
+        <w:t xml:space="preserve"> for real word. If the word is made-up nonsense, like </w:t>
+      </w:r>
+      <w:r>
+        <w:rPr>
+          <w:rFonts w:ascii="Arial" w:eastAsia="Arial" w:hAnsi="Arial" w:cs="Arial"/>
+          <w:b/>
+          <w:sz w:val="22"/>
+          <w:szCs w:val="22"/>
+        </w:rPr>
+        <w:t>WERM</w:t>
+      </w:r>
+      <w:r>
+        <w:rPr>
+          <w:rFonts w:ascii="Arial" w:eastAsia="Arial" w:hAnsi="Arial" w:cs="Arial"/>
+          <w:sz w:val="22"/>
+          <w:szCs w:val="22"/>
+        </w:rPr>
+        <w:t xml:space="preserve">, please press the </w:t>
+      </w:r>
+      <w:r>
+        <w:rPr>
+          <w:rFonts w:ascii="Arial" w:eastAsia="Arial" w:hAnsi="Arial" w:cs="Arial"/>
+          <w:b/>
+          <w:sz w:val="22"/>
+          <w:szCs w:val="22"/>
+        </w:rPr>
+        <w:t>KEY</w:t>
+      </w:r>
+      <w:r>
+        <w:rPr>
+          <w:rFonts w:ascii="Arial" w:eastAsia="Arial" w:hAnsi="Arial" w:cs="Arial"/>
+          <w:sz w:val="22"/>
+          <w:szCs w:val="22"/>
+        </w:rPr>
+        <w:t xml:space="preserve"> </w:t>
       </w:r>
       <w:proofErr w:type="spellStart"/>
       <w:r>
@@ -2753,7 +4972,7 @@
           <w:sz w:val="22"/>
           <w:szCs w:val="22"/>
         </w:rPr>
-        <w:t>ms</w:t>
+        <w:t>key</w:t>
       </w:r>
       <w:proofErr w:type="spellEnd"/>
       <w:r>
@@ -2762,829 +4981,7 @@
           <w:sz w:val="22"/>
           <w:szCs w:val="22"/>
         </w:rPr>
-        <w:t xml:space="preserve"> (i.e., the time between the offset of the first concept and onset of the next concept, when the fixation cross is showing). Responses will time out after 5 seconds and move on to the next trial. After ten trials, participants will see the instruction screen again with a reminder that they will now be doing the real t</w:t>
-      </w:r>
-      <w:r>
-        <w:rPr>
-          <w:rFonts w:ascii="Arial" w:eastAsia="Arial" w:hAnsi="Arial" w:cs="Arial"/>
-          <w:sz w:val="22"/>
-          <w:szCs w:val="22"/>
-        </w:rPr>
-        <w:t>ask.</w:t>
-      </w:r>
-    </w:p>
-    <w:p>
-      <w:pPr>
-        <w:rPr>
-          <w:rFonts w:ascii="Arial" w:eastAsia="Arial" w:hAnsi="Arial" w:cs="Arial"/>
-          <w:sz w:val="22"/>
-          <w:szCs w:val="22"/>
-        </w:rPr>
-      </w:pPr>
-    </w:p>
-    <w:p>
-      <w:pPr>
-        <w:rPr>
-          <w:rFonts w:ascii="Arial" w:eastAsia="Arial" w:hAnsi="Arial" w:cs="Arial"/>
-          <w:sz w:val="22"/>
-          <w:szCs w:val="22"/>
-        </w:rPr>
-      </w:pPr>
-      <w:r>
-        <w:rPr>
-          <w:rFonts w:ascii="Arial" w:eastAsia="Arial" w:hAnsi="Arial" w:cs="Arial"/>
-          <w:sz w:val="22"/>
-          <w:szCs w:val="22"/>
-        </w:rPr>
-        <w:t xml:space="preserve">After 100 trials, the participants will be shown a short break screen with the option to continue by hitting the spacebar after 10 seconds. After </w:t>
-      </w:r>
-      <w:r>
-        <w:rPr>
-          <w:rFonts w:ascii="Arial" w:eastAsia="Arial" w:hAnsi="Arial" w:cs="Arial"/>
-          <w:sz w:val="22"/>
-          <w:szCs w:val="22"/>
-        </w:rPr>
-        <w:t>eight</w:t>
-      </w:r>
-      <w:r>
-        <w:rPr>
-          <w:rFonts w:ascii="Arial" w:eastAsia="Arial" w:hAnsi="Arial" w:cs="Arial"/>
-          <w:sz w:val="22"/>
-          <w:szCs w:val="22"/>
-        </w:rPr>
-        <w:t xml:space="preserve"> </w:t>
-      </w:r>
-      <w:r>
-        <w:rPr>
-          <w:rFonts w:ascii="Arial" w:eastAsia="Arial" w:hAnsi="Arial" w:cs="Arial"/>
-          <w:sz w:val="22"/>
-          <w:szCs w:val="22"/>
-        </w:rPr>
-        <w:t>blocks of 100 trials (</w:t>
-      </w:r>
-      <w:r>
-        <w:rPr>
-          <w:rFonts w:ascii="Arial" w:eastAsia="Arial" w:hAnsi="Arial" w:cs="Arial"/>
-          <w:sz w:val="22"/>
-          <w:szCs w:val="22"/>
-        </w:rPr>
-        <w:t>8</w:t>
-      </w:r>
-      <w:r>
-        <w:rPr>
-          <w:rFonts w:ascii="Arial" w:eastAsia="Arial" w:hAnsi="Arial" w:cs="Arial"/>
-          <w:sz w:val="22"/>
-          <w:szCs w:val="22"/>
-        </w:rPr>
-        <w:t xml:space="preserve">00 words), the experiment will end with a thank you screen. On this screen, </w:t>
-      </w:r>
-      <w:r>
-        <w:rPr>
-          <w:rFonts w:ascii="Arial" w:eastAsia="Arial" w:hAnsi="Arial" w:cs="Arial"/>
-          <w:sz w:val="22"/>
-          <w:szCs w:val="22"/>
-        </w:rPr>
-        <w:t>participants</w:t>
-      </w:r>
-      <w:r>
-        <w:rPr>
-          <w:rFonts w:ascii="Arial" w:eastAsia="Arial" w:hAnsi="Arial" w:cs="Arial"/>
-          <w:sz w:val="22"/>
-          <w:szCs w:val="22"/>
-        </w:rPr>
-        <w:t xml:space="preserve"> will be given instructions on how to indicate they have completed the study to the appropriate lab.</w:t>
-      </w:r>
-      <w:r>
-        <w:rPr>
-          <w:rFonts w:ascii="Arial" w:eastAsia="Arial" w:hAnsi="Arial" w:cs="Arial"/>
-          <w:sz w:val="22"/>
-          <w:szCs w:val="22"/>
-        </w:rPr>
-        <w:t xml:space="preserve"> </w:t>
-      </w:r>
-      <w:r>
-        <w:rPr>
-          <w:rFonts w:ascii="Arial" w:eastAsia="Arial" w:hAnsi="Arial" w:cs="Arial"/>
-          <w:sz w:val="22"/>
-          <w:szCs w:val="22"/>
-        </w:rPr>
-        <w:t xml:space="preserve">These values will be customized based on data collection type (i.e., Mechanical Turk, </w:t>
-      </w:r>
-      <w:r>
-        <w:rPr>
-          <w:rFonts w:ascii="Arial" w:eastAsia="Arial" w:hAnsi="Arial" w:cs="Arial"/>
-          <w:sz w:val="22"/>
-          <w:szCs w:val="22"/>
-        </w:rPr>
-        <w:lastRenderedPageBreak/>
-        <w:t xml:space="preserve">participant pool, etc.). An estimate </w:t>
-      </w:r>
-      <w:r>
-        <w:rPr>
-          <w:rFonts w:ascii="Arial" w:eastAsia="Arial" w:hAnsi="Arial" w:cs="Arial"/>
-          <w:sz w:val="22"/>
-          <w:szCs w:val="22"/>
-        </w:rPr>
-        <w:t>for</w:t>
-      </w:r>
-      <w:r>
-        <w:rPr>
-          <w:rFonts w:ascii="Arial" w:eastAsia="Arial" w:hAnsi="Arial" w:cs="Arial"/>
-          <w:sz w:val="22"/>
-          <w:szCs w:val="22"/>
-        </w:rPr>
-        <w:t xml:space="preserve"> time required for the study is approximately twenty to thirty minutes including practice trials, instructions, and breaks. </w:t>
-      </w:r>
-    </w:p>
-    <w:p>
-      <w:pPr>
-        <w:pStyle w:val="Heading3"/>
-        <w:rPr>
-          <w:rFonts w:ascii="Arial" w:hAnsi="Arial" w:cs="Arial"/>
-        </w:rPr>
-      </w:pPr>
-      <w:bookmarkStart w:id="8" w:name="_Toc225617956"/>
-      <w:r>
-        <w:rPr>
-          <w:rFonts w:ascii="Arial" w:hAnsi="Arial" w:cs="Arial"/>
-        </w:rPr>
-        <w:t>Subjective Ratings</w:t>
-      </w:r>
-      <w:bookmarkEnd w:id="8"/>
-    </w:p>
-    <w:p>
-      <w:pPr>
-        <w:rPr>
-          <w:rFonts w:ascii="Arial" w:eastAsia="Arial" w:hAnsi="Arial" w:cs="Arial"/>
-          <w:sz w:val="22"/>
-          <w:szCs w:val="22"/>
-        </w:rPr>
-      </w:pPr>
-    </w:p>
-    <w:p>
-      <w:pPr>
-        <w:rPr>
-          <w:rFonts w:ascii="Arial" w:eastAsia="Arial" w:hAnsi="Arial" w:cs="Arial"/>
-          <w:sz w:val="22"/>
-          <w:szCs w:val="22"/>
-        </w:rPr>
-      </w:pPr>
-      <w:r>
-        <w:rPr>
-          <w:rFonts w:ascii="Arial" w:eastAsia="Arial" w:hAnsi="Arial" w:cs="Arial"/>
-          <w:sz w:val="22"/>
-          <w:szCs w:val="22"/>
-        </w:rPr>
-        <w:t xml:space="preserve">Subjective measures are concept characteristics that are rated by participants, such as age of acquisition (approximate age you learned a concept), imageability (how easy the concept is to imagine), concreteness (how concrete is the concept), valence (emotion), arousal, and familiarity. For concepts that are missing these values in a target language, participants will be asked to provide ratings on a single metric (i.e., they would only see instructions for familiarity or arousal). Each participant will be </w:t>
-      </w:r>
-      <w:r>
-        <w:rPr>
-          <w:rFonts w:ascii="Arial" w:eastAsia="Arial" w:hAnsi="Arial" w:cs="Arial"/>
-          <w:sz w:val="22"/>
-          <w:szCs w:val="22"/>
-        </w:rPr>
-        <w:t xml:space="preserve">asked to provide </w:t>
-      </w:r>
-      <w:r>
-        <w:rPr>
-          <w:rFonts w:ascii="Arial" w:eastAsia="Arial" w:hAnsi="Arial" w:cs="Arial"/>
-          <w:sz w:val="22"/>
-          <w:szCs w:val="22"/>
-        </w:rPr>
-        <w:t>400</w:t>
-      </w:r>
-      <w:r>
-        <w:rPr>
-          <w:rFonts w:ascii="Arial" w:eastAsia="Arial" w:hAnsi="Arial" w:cs="Arial"/>
-          <w:sz w:val="22"/>
-          <w:szCs w:val="22"/>
-        </w:rPr>
-        <w:t xml:space="preserve"> ratings of concepts</w:t>
-      </w:r>
-      <w:r>
-        <w:rPr>
-          <w:rFonts w:ascii="Arial" w:eastAsia="Arial" w:hAnsi="Arial" w:cs="Arial"/>
-          <w:sz w:val="22"/>
-          <w:szCs w:val="22"/>
-        </w:rPr>
-        <w:t xml:space="preserve"> per test session</w:t>
-      </w:r>
-      <w:r>
-        <w:rPr>
-          <w:rFonts w:ascii="Arial" w:eastAsia="Arial" w:hAnsi="Arial" w:cs="Arial"/>
-          <w:sz w:val="22"/>
-          <w:szCs w:val="22"/>
-        </w:rPr>
-        <w:t xml:space="preserve">, given the need for a particular language, while also controlling for the length of the task to prevent fatigue in the experiment. </w:t>
-      </w:r>
-      <w:r>
-        <w:rPr>
-          <w:rFonts w:ascii="Arial" w:eastAsia="Arial" w:hAnsi="Arial" w:cs="Arial"/>
-          <w:sz w:val="22"/>
-          <w:szCs w:val="22"/>
-        </w:rPr>
-        <w:t xml:space="preserve">We will first target real words from our priming task described above for norming that do not have data in previously published norms. We will use a random selection of the previously normed real words to ensure all participants see the same number of trials.  </w:t>
-      </w:r>
-    </w:p>
-    <w:p>
-      <w:pPr>
-        <w:pStyle w:val="Heading2"/>
-      </w:pPr>
-      <w:bookmarkStart w:id="9" w:name="_Toc225617957"/>
-      <w:r>
-        <w:rPr>
-          <w:rFonts w:ascii="Arial" w:hAnsi="Arial" w:cs="Arial"/>
-        </w:rPr>
-        <w:t>Specific Study Materials:</w:t>
-      </w:r>
-      <w:bookmarkEnd w:id="9"/>
-    </w:p>
-    <w:p>
-      <w:pPr>
-        <w:rPr>
-          <w:rFonts w:ascii="Arial" w:hAnsi="Arial" w:cs="Arial"/>
-          <w:sz w:val="22"/>
-          <w:szCs w:val="22"/>
-        </w:rPr>
-      </w:pPr>
-      <w:r>
-        <w:rPr>
-          <w:rFonts w:ascii="Arial" w:hAnsi="Arial" w:cs="Arial"/>
-          <w:sz w:val="22"/>
-          <w:szCs w:val="22"/>
-        </w:rPr>
-        <w:t>For full translations requirements please see our translation sheet here:</w:t>
-      </w:r>
-    </w:p>
-    <w:p>
-      <w:pPr>
-        <w:rPr>
-          <w:rFonts w:ascii="Arial" w:hAnsi="Arial" w:cs="Arial"/>
-          <w:sz w:val="22"/>
-          <w:szCs w:val="22"/>
-        </w:rPr>
-      </w:pPr>
-      <w:hyperlink r:id="rId20" w:history="1">
-        <w:r>
-          <w:rPr>
-            <w:rStyle w:val="Hyperlink"/>
-            <w:rFonts w:ascii="Arial" w:hAnsi="Arial" w:cs="Arial"/>
-            <w:sz w:val="22"/>
-            <w:szCs w:val="22"/>
-          </w:rPr>
-          <w:t>https://github.com/SemanticPriming/ML-One-Network/blob/main/01-Translation/task_translation_template.xlsx</w:t>
-        </w:r>
-      </w:hyperlink>
-      <w:r>
-        <w:rPr>
-          <w:rFonts w:ascii="Arial" w:hAnsi="Arial" w:cs="Arial"/>
-          <w:sz w:val="22"/>
-          <w:szCs w:val="22"/>
-        </w:rPr>
-        <w:t xml:space="preserve"> </w:t>
-      </w:r>
-    </w:p>
-    <w:p>
-      <w:pPr>
-        <w:pStyle w:val="Heading3"/>
-        <w:rPr>
-          <w:rFonts w:ascii="Arial" w:hAnsi="Arial" w:cs="Arial"/>
-        </w:rPr>
-      </w:pPr>
-      <w:bookmarkStart w:id="10" w:name="_Toc225617958"/>
-      <w:r>
-        <w:rPr>
-          <w:rFonts w:ascii="Arial" w:hAnsi="Arial" w:cs="Arial"/>
-        </w:rPr>
-        <w:t xml:space="preserve">Demographics: </w:t>
-      </w:r>
-      <w:r>
-        <w:rPr>
-          <w:rFonts w:ascii="Arial" w:hAnsi="Arial" w:cs="Arial"/>
-        </w:rPr>
-        <w:t>Shown on all tasks</w:t>
-      </w:r>
-      <w:bookmarkEnd w:id="10"/>
-      <w:r>
-        <w:rPr>
-          <w:rFonts w:ascii="Arial" w:hAnsi="Arial" w:cs="Arial"/>
-        </w:rPr>
-        <w:t xml:space="preserve"> </w:t>
-      </w:r>
-    </w:p>
-    <w:p>
-      <w:pPr>
-        <w:rPr>
-          <w:rFonts w:ascii="Arial" w:hAnsi="Arial" w:cs="Arial"/>
-        </w:rPr>
-      </w:pPr>
-    </w:p>
-    <w:p>
-      <w:pPr>
-        <w:jc w:val="both"/>
-        <w:rPr>
-          <w:rFonts w:ascii="Arial" w:eastAsia="Arial" w:hAnsi="Arial" w:cs="Arial"/>
-          <w:sz w:val="22"/>
-          <w:szCs w:val="22"/>
-        </w:rPr>
-      </w:pPr>
-      <w:r>
-        <w:rPr>
-          <w:rFonts w:ascii="Arial" w:eastAsia="Arial" w:hAnsi="Arial" w:cs="Arial"/>
-          <w:sz w:val="22"/>
-          <w:szCs w:val="22"/>
-        </w:rPr>
-        <w:t>Please tell us a little bit about yourself.</w:t>
-      </w:r>
-      <w:r>
-        <w:rPr>
-          <w:rFonts w:ascii="Arial" w:eastAsia="Arial" w:hAnsi="Arial" w:cs="Arial"/>
-          <w:sz w:val="22"/>
-          <w:szCs w:val="22"/>
-        </w:rPr>
-        <w:t xml:space="preserve"> [title of page]</w:t>
-      </w:r>
-    </w:p>
-    <w:p>
-      <w:pPr>
-        <w:jc w:val="both"/>
-        <w:rPr>
-          <w:rFonts w:ascii="Arial" w:eastAsia="Arial" w:hAnsi="Arial" w:cs="Arial"/>
-          <w:sz w:val="22"/>
-          <w:szCs w:val="22"/>
-        </w:rPr>
-      </w:pPr>
-      <w:r>
-        <w:rPr>
-          <w:rFonts w:ascii="Arial" w:eastAsia="Arial" w:hAnsi="Arial" w:cs="Arial"/>
-          <w:sz w:val="22"/>
-          <w:szCs w:val="22"/>
-        </w:rPr>
-        <w:t>Please tell us your gender: male female other prefer not to say</w:t>
-      </w:r>
-    </w:p>
-    <w:p>
-      <w:pPr>
-        <w:jc w:val="both"/>
-        <w:rPr>
-          <w:rFonts w:ascii="Arial" w:eastAsia="Arial" w:hAnsi="Arial" w:cs="Arial"/>
-          <w:sz w:val="22"/>
-          <w:szCs w:val="22"/>
-        </w:rPr>
-      </w:pPr>
-      <w:r>
-        <w:rPr>
-          <w:rFonts w:ascii="Arial" w:eastAsia="Arial" w:hAnsi="Arial" w:cs="Arial"/>
-          <w:sz w:val="22"/>
-          <w:szCs w:val="22"/>
-        </w:rPr>
-        <w:t xml:space="preserve">Which year </w:t>
-      </w:r>
-      <w:proofErr w:type="gramStart"/>
-      <w:r>
-        <w:rPr>
-          <w:rFonts w:ascii="Arial" w:eastAsia="Arial" w:hAnsi="Arial" w:cs="Arial"/>
-          <w:sz w:val="22"/>
-          <w:szCs w:val="22"/>
-        </w:rPr>
-        <w:t>were</w:t>
-      </w:r>
-      <w:proofErr w:type="gramEnd"/>
-      <w:r>
-        <w:rPr>
-          <w:rFonts w:ascii="Arial" w:eastAsia="Arial" w:hAnsi="Arial" w:cs="Arial"/>
-          <w:sz w:val="22"/>
-          <w:szCs w:val="22"/>
-        </w:rPr>
-        <w:t xml:space="preserve"> you born? Please enter a four-digit year: </w:t>
-      </w:r>
-    </w:p>
-    <w:p>
-      <w:pPr>
-        <w:jc w:val="both"/>
-        <w:rPr>
-          <w:rFonts w:ascii="Arial" w:eastAsia="Arial" w:hAnsi="Arial" w:cs="Arial"/>
-          <w:sz w:val="22"/>
-          <w:szCs w:val="22"/>
-        </w:rPr>
-      </w:pPr>
-      <w:r>
-        <w:rPr>
-          <w:rFonts w:ascii="Arial" w:eastAsia="Arial" w:hAnsi="Arial" w:cs="Arial"/>
-          <w:sz w:val="22"/>
-          <w:szCs w:val="22"/>
-        </w:rPr>
-        <w:t>Please tell us your highest education level: Less than high school diploma, High school diploma, Associate’s degree or two-year degree, Bachelor’s degree or four-year degree, Master’s degree or equivalent, Doctoral degree or equivalent (please note these will be made culturally relevant for each language)</w:t>
-      </w:r>
-      <w:r>
-        <w:rPr>
-          <w:rFonts w:ascii="Arial" w:eastAsia="Arial" w:hAnsi="Arial" w:cs="Arial"/>
-          <w:sz w:val="22"/>
-          <w:szCs w:val="22"/>
-        </w:rPr>
-      </w:r>
-      <w:r>
-        <w:rPr>
-          <w:rFonts w:ascii="Arial" w:eastAsia="Arial" w:hAnsi="Arial" w:cs="Arial"/>
-          <w:sz w:val="22"/>
-          <w:szCs w:val="22"/>
-        </w:rPr>
-      </w:r>
-      <w:r>
-        <w:rPr>
-          <w:rFonts w:ascii="Arial" w:eastAsia="Arial" w:hAnsi="Arial" w:cs="Arial"/>
-          <w:sz w:val="22"/>
-          <w:szCs w:val="22"/>
-        </w:rPr>
-      </w:r>
-      <w:r>
-        <w:rPr>
-          <w:rFonts w:ascii="Arial" w:eastAsia="Arial" w:hAnsi="Arial" w:cs="Arial"/>
-          <w:sz w:val="22"/>
-          <w:szCs w:val="22"/>
-        </w:rPr>
-      </w:r>
-      <w:r>
-        <w:rPr>
-          <w:rFonts w:ascii="Arial" w:eastAsia="Arial" w:hAnsi="Arial" w:cs="Arial"/>
-          <w:sz w:val="22"/>
-          <w:szCs w:val="22"/>
-        </w:rPr>
-      </w:r>
-      <w:r>
-        <w:rPr>
-          <w:rFonts w:ascii="Arial" w:eastAsia="Arial" w:hAnsi="Arial" w:cs="Arial"/>
-          <w:sz w:val="22"/>
-          <w:szCs w:val="22"/>
-        </w:rPr>
-      </w:r>
-      <w:proofErr w:type="gramStart"/>
-      <w:r>
-        <w:rPr>
-          <w:rFonts w:ascii="Arial" w:eastAsia="Arial" w:hAnsi="Arial" w:cs="Arial"/>
-          <w:sz w:val="22"/>
-          <w:szCs w:val="22"/>
-        </w:rPr>
-      </w:r>
-      <w:r>
-        <w:rPr>
-          <w:rFonts w:ascii="Arial" w:eastAsia="Arial" w:hAnsi="Arial" w:cs="Arial"/>
-          <w:sz w:val="22"/>
-          <w:szCs w:val="22"/>
-        </w:rPr>
-      </w:r>
-      <w:proofErr w:type="gramEnd"/>
-      <w:r>
-        <w:rPr>
-          <w:rFonts w:ascii="Arial" w:eastAsia="Arial" w:hAnsi="Arial" w:cs="Arial"/>
-          <w:sz w:val="22"/>
-          <w:szCs w:val="22"/>
-        </w:rPr>
-      </w:r>
-    </w:p>
-    <w:p>
-      <w:pPr>
-        <w:jc w:val="both"/>
-        <w:rPr>
-          <w:rFonts w:ascii="Arial" w:eastAsia="Arial" w:hAnsi="Arial" w:cs="Arial"/>
-          <w:sz w:val="22"/>
-          <w:szCs w:val="22"/>
-        </w:rPr>
-      </w:pPr>
-      <w:r>
-        <w:rPr>
-          <w:rFonts w:ascii="Arial" w:eastAsia="Arial" w:hAnsi="Arial" w:cs="Arial"/>
-          <w:sz w:val="22"/>
-          <w:szCs w:val="22"/>
-        </w:rPr>
-        <w:t xml:space="preserve">What is your native (first) language?</w:t>
-      </w:r>
-    </w:p>
-    <w:p>
-      <w:pPr>
-        <w:rPr>
-          <w:rFonts w:ascii="Arial" w:eastAsia="Arial" w:hAnsi="Arial" w:cs="Arial"/>
-          <w:sz w:val="22"/>
-          <w:szCs w:val="22"/>
-        </w:rPr>
-      </w:pPr>
-      <w:r>
-        <w:rPr>
-          <w:rFonts w:ascii="Arial" w:eastAsia="Arial" w:hAnsi="Arial" w:cs="Arial"/>
-          <w:sz w:val="22"/>
-          <w:szCs w:val="22"/>
-        </w:rPr>
-        <w:t>Are you primarily left- or right-</w:t>
-      </w:r>
-      <w:proofErr w:type="gramStart"/>
-      <w:r>
-        <w:rPr>
-          <w:rFonts w:ascii="Arial" w:eastAsia="Arial" w:hAnsi="Arial" w:cs="Arial"/>
-          <w:sz w:val="22"/>
-          <w:szCs w:val="22"/>
-        </w:rPr>
-        <w:t>handed?:</w:t>
-      </w:r>
-      <w:proofErr w:type="gramEnd"/>
-      <w:r>
-        <w:rPr>
-          <w:rFonts w:ascii="Arial" w:eastAsia="Arial" w:hAnsi="Arial" w:cs="Arial"/>
-          <w:sz w:val="22"/>
-          <w:szCs w:val="22"/>
-        </w:rPr>
-        <w:t xml:space="preserve"> Left-handed, Right-handed</w:t>
-      </w:r>
-    </w:p>
-    <w:p>
-      <w:pPr>
-        <w:rPr>
-          <w:rFonts w:ascii="Arial" w:eastAsia="Arial" w:hAnsi="Arial" w:cs="Arial"/>
-          <w:sz w:val="22"/>
-          <w:szCs w:val="22"/>
-        </w:rPr>
-      </w:pPr>
-    </w:p>
-    <w:p>
-      <w:pPr>
-        <w:pStyle w:val="Heading3"/>
-        <w:rPr>
-          <w:rFonts w:ascii="Arial" w:hAnsi="Arial" w:cs="Arial"/>
-        </w:rPr>
-      </w:pPr>
-      <w:r>
-        <w:rPr>
-          <w:rFonts w:ascii="Arial" w:hAnsi="Arial" w:cs="Arial"/>
-        </w:rPr>
-        <w:t>End Screen: Shown on all tasks</w:t>
-      </w:r>
-    </w:p>
-    <w:p>
-      <w:pPr>
-        <w:rPr>
-          <w:rFonts w:ascii="Arial" w:eastAsia="Arial" w:hAnsi="Arial" w:cs="Arial"/>
-          <w:b/>
-          <w:sz w:val="22"/>
-          <w:szCs w:val="22"/>
-        </w:rPr>
-      </w:pPr>
-    </w:p>
-    <w:p>
-      <w:pPr>
-        <w:rPr>
-          <w:rFonts w:ascii="Arial" w:eastAsia="Arial" w:hAnsi="Arial" w:cs="Arial"/>
-          <w:bCs/>
-          <w:sz w:val="22"/>
-          <w:szCs w:val="22"/>
-        </w:rPr>
-      </w:pPr>
-      <w:r>
-        <w:rPr>
-          <w:rFonts w:ascii="Arial" w:eastAsia="Arial" w:hAnsi="Arial" w:cs="Arial"/>
-          <w:bCs/>
-          <w:sz w:val="22"/>
-          <w:szCs w:val="22"/>
-        </w:rPr>
-        <w:t>You have completed the word ratings.</w:t>
-      </w:r>
-    </w:p>
-    <w:p>
-      <w:pPr>
-        <w:rPr>
-          <w:rFonts w:ascii="Arial" w:eastAsia="Arial" w:hAnsi="Arial" w:cs="Arial"/>
-          <w:bCs/>
-          <w:sz w:val="22"/>
-          <w:szCs w:val="22"/>
-        </w:rPr>
-      </w:pPr>
-    </w:p>
-    <w:p>
-      <w:pPr>
-        <w:rPr>
-          <w:rFonts w:ascii="Arial" w:eastAsia="Arial" w:hAnsi="Arial" w:cs="Arial"/>
-          <w:bCs/>
-          <w:sz w:val="22"/>
-          <w:szCs w:val="22"/>
-        </w:rPr>
-      </w:pPr>
-      <w:r>
-        <w:rPr>
-          <w:rFonts w:ascii="Arial" w:eastAsia="Arial" w:hAnsi="Arial" w:cs="Arial"/>
-          <w:bCs/>
-          <w:sz w:val="22"/>
-          <w:szCs w:val="22"/>
-        </w:rPr>
-        <w:t>Your participant number is:</w:t>
-      </w:r>
-    </w:p>
-    <w:p>
-      <w:pPr>
-        <w:rPr>
-          <w:rFonts w:ascii="Arial" w:eastAsia="Arial" w:hAnsi="Arial" w:cs="Arial"/>
-          <w:bCs/>
-          <w:sz w:val="22"/>
-          <w:szCs w:val="22"/>
-        </w:rPr>
-      </w:pPr>
-    </w:p>
-    <w:p>
-      <w:pPr>
-        <w:rPr>
-          <w:rFonts w:ascii="Arial" w:eastAsia="Arial" w:hAnsi="Arial" w:cs="Arial"/>
-          <w:bCs/>
-          <w:sz w:val="22"/>
-          <w:szCs w:val="22"/>
-        </w:rPr>
-      </w:pPr>
-      <w:r>
-        <w:rPr>
-          <w:rFonts w:ascii="Arial" w:eastAsia="Arial" w:hAnsi="Arial" w:cs="Arial"/>
-          <w:bCs/>
-          <w:sz w:val="22"/>
-          <w:szCs w:val="22"/>
-        </w:rPr>
-        <w:t xml:space="preserve">[random number] </w:t>
-      </w:r>
-    </w:p>
-    <w:p>
-      <w:pPr>
-        <w:rPr>
-          <w:rFonts w:ascii="Arial" w:eastAsia="Arial" w:hAnsi="Arial" w:cs="Arial"/>
-          <w:bCs/>
-          <w:sz w:val="22"/>
-          <w:szCs w:val="22"/>
-        </w:rPr>
-      </w:pPr>
-    </w:p>
-    <w:p>
-      <w:pPr>
-        <w:rPr>
-          <w:rFonts w:ascii="Arial" w:eastAsia="Arial" w:hAnsi="Arial" w:cs="Arial"/>
-          <w:bCs/>
-          <w:sz w:val="22"/>
-          <w:szCs w:val="22"/>
-        </w:rPr>
-      </w:pPr>
-      <w:r>
-        <w:rPr>
-          <w:rFonts w:ascii="Arial" w:eastAsia="Arial" w:hAnsi="Arial" w:cs="Arial"/>
-          <w:bCs/>
-          <w:sz w:val="22"/>
-          <w:szCs w:val="22"/>
-        </w:rPr>
-        <w:t>Please keep or copy this number if you are asked for it.</w:t>
-      </w:r>
-    </w:p>
-    <w:p>
-      <w:pPr>
-        <w:pStyle w:val="Heading3"/>
-        <w:rPr>
-          <w:rFonts w:ascii="Arial" w:hAnsi="Arial" w:cs="Arial"/>
-        </w:rPr>
-      </w:pPr>
-      <w:bookmarkStart w:id="11" w:name="_Toc225617959"/>
-      <w:r>
-        <w:rPr>
-          <w:rFonts w:ascii="Arial" w:hAnsi="Arial" w:cs="Arial"/>
-        </w:rPr>
-        <w:t>Semantic priming task</w:t>
-      </w:r>
-      <w:r>
-        <w:rPr>
-          <w:rFonts w:ascii="Arial" w:hAnsi="Arial" w:cs="Arial"/>
-        </w:rPr>
-        <w:t>:</w:t>
-      </w:r>
-      <w:bookmarkEnd w:id="11"/>
-    </w:p>
-    <w:p>
-      <w:pPr>
-        <w:jc w:val="both"/>
-        <w:rPr>
-          <w:rFonts w:ascii="Arial" w:eastAsia="Arial" w:hAnsi="Arial" w:cs="Arial"/>
-          <w:sz w:val="22"/>
-          <w:szCs w:val="22"/>
-        </w:rPr>
-      </w:pPr>
-      <w:r>
-        <w:rPr>
-          <w:rFonts w:ascii="Arial" w:eastAsia="Arial" w:hAnsi="Arial" w:cs="Arial"/>
-          <w:sz w:val="22"/>
-          <w:szCs w:val="22"/>
-        </w:rPr>
-        <w:t xml:space="preserve">This experiment is concerned with how people process words. You will be asked to view words and judge them. The words will be presented in the middle of the screen. You should ask yourself if the word on the screen is a real word or a fake word. If you recognize the word on the screen like </w:t>
-      </w:r>
-      <w:r>
-        <w:rPr>
-          <w:rFonts w:ascii="Arial" w:eastAsia="Arial" w:hAnsi="Arial" w:cs="Arial"/>
-          <w:b/>
-          <w:sz w:val="22"/>
-          <w:szCs w:val="22"/>
-        </w:rPr>
-        <w:t>COLD</w:t>
-      </w:r>
-      <w:r>
-        <w:rPr>
-          <w:rFonts w:ascii="Arial" w:eastAsia="Arial" w:hAnsi="Arial" w:cs="Arial"/>
-          <w:sz w:val="22"/>
-          <w:szCs w:val="22"/>
-        </w:rPr>
-        <w:t xml:space="preserve">, please press the </w:t>
-      </w:r>
-      <w:r>
-        <w:rPr>
-          <w:rFonts w:ascii="Arial" w:eastAsia="Arial" w:hAnsi="Arial" w:cs="Arial"/>
-          <w:b/>
-          <w:sz w:val="22"/>
-          <w:szCs w:val="22"/>
-        </w:rPr>
-        <w:t>KEY</w:t>
-      </w:r>
-      <w:r>
-        <w:rPr>
-          <w:rFonts w:ascii="Arial" w:eastAsia="Arial" w:hAnsi="Arial" w:cs="Arial"/>
-          <w:sz w:val="22"/>
-          <w:szCs w:val="22"/>
-        </w:rPr>
-        <w:t xml:space="preserve"> </w:t>
-      </w:r>
-      <w:proofErr w:type="spellStart"/>
-      <w:r>
-        <w:rPr>
-          <w:rFonts w:ascii="Arial" w:eastAsia="Arial" w:hAnsi="Arial" w:cs="Arial"/>
-          <w:sz w:val="22"/>
-          <w:szCs w:val="22"/>
-        </w:rPr>
-        <w:t>key</w:t>
-      </w:r>
-      <w:proofErr w:type="spellEnd"/>
-      <w:r>
-        <w:rPr>
-          <w:rFonts w:ascii="Arial" w:eastAsia="Arial" w:hAnsi="Arial" w:cs="Arial"/>
-          <w:sz w:val="22"/>
-          <w:szCs w:val="22"/>
-        </w:rPr>
-        <w:t xml:space="preserve"> for real word. If the word is made-up nonsense, like </w:t>
-      </w:r>
-      <w:r>
-        <w:rPr>
-          <w:rFonts w:ascii="Arial" w:eastAsia="Arial" w:hAnsi="Arial" w:cs="Arial"/>
-          <w:b/>
-          <w:sz w:val="22"/>
-          <w:szCs w:val="22"/>
-        </w:rPr>
-        <w:t>WERM</w:t>
-      </w:r>
-      <w:r>
-        <w:rPr>
-          <w:rFonts w:ascii="Arial" w:eastAsia="Arial" w:hAnsi="Arial" w:cs="Arial"/>
-          <w:sz w:val="22"/>
-          <w:szCs w:val="22"/>
-        </w:rPr>
-        <w:t xml:space="preserve">, please press the </w:t>
-      </w:r>
-      <w:r>
-        <w:rPr>
-          <w:rFonts w:ascii="Arial" w:eastAsia="Arial" w:hAnsi="Arial" w:cs="Arial"/>
-          <w:b/>
-          <w:sz w:val="22"/>
-          <w:szCs w:val="22"/>
-        </w:rPr>
-        <w:t>KEY</w:t>
-      </w:r>
-      <w:r>
-        <w:rPr>
-          <w:rFonts w:ascii="Arial" w:eastAsia="Arial" w:hAnsi="Arial" w:cs="Arial"/>
-          <w:sz w:val="22"/>
-          <w:szCs w:val="22"/>
-        </w:rPr>
-        <w:t xml:space="preserve"> </w:t>
-      </w:r>
-      <w:proofErr w:type="spellStart"/>
-      <w:r>
-        <w:rPr>
-          <w:rFonts w:ascii="Arial" w:eastAsia="Arial" w:hAnsi="Arial" w:cs="Arial"/>
-          <w:sz w:val="22"/>
-          <w:szCs w:val="22"/>
-        </w:rPr>
-        <w:t>key</w:t>
-      </w:r>
-      <w:proofErr w:type="spellEnd"/>
-      <w:r>
-        <w:rPr>
-          <w:rFonts w:ascii="Arial" w:eastAsia="Arial" w:hAnsi="Arial" w:cs="Arial"/>
-          <w:sz w:val="22"/>
-          <w:szCs w:val="22"/>
-        </w:rPr>
-        <w:t xml:space="preserve"> for fake word. During practice, we will give you feedback. We would like to ask you to respond as quickly as you can while remaining </w:t>
-      </w:r>
-      <w:r>
-        <w:rPr>
-          <w:rFonts w:ascii="Arial" w:eastAsia="Arial" w:hAnsi="Arial" w:cs="Arial"/>
-          <w:sz w:val="22"/>
-          <w:szCs w:val="22"/>
-        </w:rPr>
-        <w:lastRenderedPageBreak/>
-        <w:t xml:space="preserve">accurate. You have five seconds to respond to every word. Please press the </w:t>
+        <w:t xml:space="preserve"> for fake word. During practice, we will give you feedback. We would like to ask you to respond as quickly as you can while remaining accurate. You have five seconds to respond to every word. Please press the </w:t>
       </w:r>
       <w:r>
         <w:rPr>
@@ -4096,7 +5493,16 @@
           <w:sz w:val="22"/>
           <w:szCs w:val="22"/>
         </w:rPr>
-        <w:t xml:space="preserve"> you can experience directly through one of the five senses. We call these words concrete words. Other words refer to meanings that cannot be experienced directly but which we know because the meanings can be defined by other words. These are abstract words. Still other words fall in-between the two extremes, because we can experience them to some extent; and in addition, we rely on language to understand them. We want you to indicate how concrete the meaning of each word is for you by using a 9-point rating scale going from abstract to concrete. A concrete word comes with a higher rating and refers to something that exists in reality; you can have immediate experience of it through your senses (smelling, tasting, touching, hearing, seeing) and the actions you do.</w:t>
+        <w:t xml:space="preserve"> you can experience directly through one of the five senses. We call these words concrete words. Other words refer to meanings that cannot be experienced directly but which we know because the meanings can be defined </w:t>
+      </w:r>
+      <w:r>
+        <w:rPr>
+          <w:rFonts w:ascii="Arial" w:eastAsia="Arial" w:hAnsi="Arial" w:cs="Arial"/>
+          <w:sz w:val="22"/>
+          <w:szCs w:val="22"/>
+        </w:rPr>
+        <w:lastRenderedPageBreak/>
+        <w:t>by other words. These are abstract words. Still other words fall in-between the two extremes, because we can experience them to some extent; and in addition, we rely on language to understand them. We want you to indicate how concrete the meaning of each word is for you by using a 9-point rating scale going from abstract to concrete. A concrete word comes with a higher rating and refers to something that exists in reality; you can have immediate experience of it through your senses (smelling, tasting, touching, hearing, seeing) and the actions you do.</w:t>
       </w:r>
     </w:p>
     <w:p>
@@ -4124,16 +5530,7 @@
           <w:sz w:val="22"/>
           <w:szCs w:val="22"/>
         </w:rPr>
-        <w:t xml:space="preserve">The easiest way to explain a word is by pointing to it or by demonstrating it (e.g. To explain 'sweet' you could have someone eat sugar; To explain 'jump' you could simply jump up and down or show people a movie clip about someone jumping up and down; To explain 'couch', you could point to a couch or show a picture of a couch). An abstract word comes with a lower rating and refers to something you cannot experience directly through your senses or actions. </w:t>
-      </w:r>
-      <w:r>
-        <w:rPr>
-          <w:rFonts w:ascii="Arial" w:eastAsia="Arial" w:hAnsi="Arial" w:cs="Arial"/>
-          <w:sz w:val="22"/>
-          <w:szCs w:val="22"/>
-        </w:rPr>
-        <w:lastRenderedPageBreak/>
-        <w:t>Its meaning depends on language. The easiest way to explain it is by using other words (e.g. There is no simple way to demonstrate 'justice'; but we can explain the meaning of the word by using other words that capture parts of its meaning).</w:t>
+        <w:t>The easiest way to explain a word is by pointing to it or by demonstrating it (e.g. To explain 'sweet' you could have someone eat sugar; To explain 'jump' you could simply jump up and down or show people a movie clip about someone jumping up and down; To explain 'couch', you could point to a couch or show a picture of a couch). An abstract word comes with a lower rating and refers to something you cannot experience directly through your senses or actions. Its meaning depends on language. The easiest way to explain it is by using other words (e.g. There is no simple way to demonstrate 'justice'; but we can explain the meaning of the word by using other words that capture parts of its meaning).</w:t>
       </w:r>
     </w:p>
     <w:p>
@@ -4162,22 +5559,6 @@
           <w:szCs w:val="22"/>
         </w:rPr>
         <w:t>Always think of how concrete (experience based) the meaning of the word is to you. In all likelihood, you will encounter several words you do not know well enough to give a useful rating. This is informative to us too, as in our research we only want to use words known to people. We may also include one or two fake words which cannot be known by you. If you do not know the word, please select the letter X for unknown.</w:t>
-      </w:r>
-      <w:proofErr w:type="gramStart"/>
-      <w:r>
-        <w:rPr>
-          <w:rFonts w:ascii="Arial" w:eastAsia="Arial" w:hAnsi="Arial" w:cs="Arial"/>
-          <w:sz w:val="22"/>
-          <w:szCs w:val="22"/>
-        </w:rPr>
-      </w:r>
-      <w:proofErr w:type="gramEnd"/>
-      <w:r>
-        <w:rPr>
-          <w:rFonts w:ascii="Arial" w:eastAsia="Arial" w:hAnsi="Arial" w:cs="Arial"/>
-          <w:sz w:val="22"/>
-          <w:szCs w:val="22"/>
-        </w:rPr>
       </w:r>
     </w:p>
     <w:p>
@@ -4303,6 +5684,7 @@
           <w:sz w:val="22"/>
           <w:szCs w:val="22"/>
         </w:rPr>
+        <w:lastRenderedPageBreak/>
         <w:t>The study being conducted today is investigating emotion, and how people respond to different types of words.</w:t>
       </w:r>
     </w:p>
@@ -4533,89 +5915,89 @@
           <w:sz w:val="22"/>
           <w:szCs w:val="22"/>
         </w:rPr>
+        <w:t>At one extreme of this scale you would feel completely relaxed, calm, sluggish, dull, sleepy, or unaroused. Indicate feeling calm by selecting the 1 on the left. Now look at the other end of the calm-excited scale, which is the completely opposite feeling. You would feel stimulated, excited, frenzied, jittery, wide-awake, or aroused. When you feel completely aroused, select the 9 on the right. The figures also allow you to describe intermediate feelings of calmness or excitedness by selecting any other number. If you are not excited nor at all calm, select the 4 in the middle.</w:t>
+      </w:r>
+    </w:p>
+    <w:p>
+      <w:pPr>
+        <w:jc w:val="both"/>
+        <w:rPr>
+          <w:rFonts w:ascii="Arial" w:eastAsia="Arial" w:hAnsi="Arial" w:cs="Arial"/>
+          <w:sz w:val="22"/>
+          <w:szCs w:val="22"/>
+        </w:rPr>
+      </w:pPr>
+    </w:p>
+    <w:p>
+      <w:pPr>
+        <w:jc w:val="both"/>
+        <w:rPr>
+          <w:rFonts w:ascii="Arial" w:eastAsia="Arial" w:hAnsi="Arial" w:cs="Arial"/>
+          <w:sz w:val="22"/>
+          <w:szCs w:val="22"/>
+        </w:rPr>
+      </w:pPr>
+      <w:r>
+        <w:rPr>
+          <w:rFonts w:ascii="Arial" w:eastAsia="Arial" w:hAnsi="Arial" w:cs="Arial"/>
+          <w:sz w:val="22"/>
+          <w:szCs w:val="22"/>
+        </w:rPr>
+        <w:t>Please work at a rapid place and don't spend too much time thinking about each word. Rather, make your ratings based on your first and immediate reaction as you read each word. If you do not know the word, please select the letter X.</w:t>
+      </w:r>
+    </w:p>
+    <w:p>
+      <w:pPr>
+        <w:jc w:val="both"/>
+        <w:rPr>
+          <w:rFonts w:ascii="Arial" w:eastAsia="Arial" w:hAnsi="Arial" w:cs="Arial"/>
+          <w:sz w:val="22"/>
+          <w:szCs w:val="22"/>
+        </w:rPr>
+      </w:pPr>
+    </w:p>
+    <w:p>
+      <w:pPr>
+        <w:jc w:val="both"/>
+        <w:rPr>
+          <w:rFonts w:ascii="Arial" w:eastAsia="Arial" w:hAnsi="Arial" w:cs="Arial"/>
+          <w:sz w:val="22"/>
+          <w:szCs w:val="22"/>
+        </w:rPr>
+      </w:pPr>
+      <w:r>
+        <w:rPr>
+          <w:rFonts w:ascii="Arial" w:eastAsia="Arial" w:hAnsi="Arial" w:cs="Arial"/>
+          <w:sz w:val="22"/>
+          <w:szCs w:val="22"/>
+        </w:rPr>
+        <w:t>For each word, rate arousal (1 = very calm/relaxed, 9 = very excited/activated). If you do not know the word, leave the rating blank and mark X below.</w:t>
+      </w:r>
+    </w:p>
+    <w:p>
+      <w:pPr>
+        <w:jc w:val="both"/>
+        <w:rPr>
+          <w:rFonts w:ascii="Arial" w:eastAsia="Arial" w:hAnsi="Arial" w:cs="Arial"/>
+          <w:b/>
+          <w:sz w:val="22"/>
+          <w:szCs w:val="22"/>
+        </w:rPr>
+      </w:pPr>
+    </w:p>
+    <w:p>
+      <w:pPr>
+        <w:pStyle w:val="Heading3"/>
+        <w:rPr>
+          <w:rFonts w:ascii="Arial" w:hAnsi="Arial" w:cs="Arial"/>
+        </w:rPr>
+      </w:pPr>
+      <w:bookmarkStart w:id="16" w:name="_Toc225617964"/>
+      <w:r>
+        <w:rPr>
+          <w:rFonts w:ascii="Arial" w:hAnsi="Arial" w:cs="Arial"/>
+        </w:rPr>
         <w:lastRenderedPageBreak/>
-        <w:t>At one extreme of this scale you would feel completely relaxed, calm, sluggish, dull, sleepy, or unaroused. Indicate feeling calm by selecting the 1 on the left. Now look at the other end of the calm-excited scale, which is the completely opposite feeling. You would feel stimulated, excited, frenzied, jittery, wide-awake, or aroused. When you feel completely aroused, select the 9 on the right. The figures also allow you to describe intermediate feelings of calmness or excitedness by selecting any other number. If you are not excited nor at all calm, select the 4 in the middle.</w:t>
-      </w:r>
-    </w:p>
-    <w:p>
-      <w:pPr>
-        <w:jc w:val="both"/>
-        <w:rPr>
-          <w:rFonts w:ascii="Arial" w:eastAsia="Arial" w:hAnsi="Arial" w:cs="Arial"/>
-          <w:sz w:val="22"/>
-          <w:szCs w:val="22"/>
-        </w:rPr>
-      </w:pPr>
-    </w:p>
-    <w:p>
-      <w:pPr>
-        <w:jc w:val="both"/>
-        <w:rPr>
-          <w:rFonts w:ascii="Arial" w:eastAsia="Arial" w:hAnsi="Arial" w:cs="Arial"/>
-          <w:sz w:val="22"/>
-          <w:szCs w:val="22"/>
-        </w:rPr>
-      </w:pPr>
-      <w:r>
-        <w:rPr>
-          <w:rFonts w:ascii="Arial" w:eastAsia="Arial" w:hAnsi="Arial" w:cs="Arial"/>
-          <w:sz w:val="22"/>
-          <w:szCs w:val="22"/>
-        </w:rPr>
-        <w:t>Please work at a rapid place and don't spend too much time thinking about each word. Rather, make your ratings based on your first and immediate reaction as you read each word. If you do not know the word, please select the letter X.</w:t>
-      </w:r>
-    </w:p>
-    <w:p>
-      <w:pPr>
-        <w:jc w:val="both"/>
-        <w:rPr>
-          <w:rFonts w:ascii="Arial" w:eastAsia="Arial" w:hAnsi="Arial" w:cs="Arial"/>
-          <w:sz w:val="22"/>
-          <w:szCs w:val="22"/>
-        </w:rPr>
-      </w:pPr>
-    </w:p>
-    <w:p>
-      <w:pPr>
-        <w:jc w:val="both"/>
-        <w:rPr>
-          <w:rFonts w:ascii="Arial" w:eastAsia="Arial" w:hAnsi="Arial" w:cs="Arial"/>
-          <w:sz w:val="22"/>
-          <w:szCs w:val="22"/>
-        </w:rPr>
-      </w:pPr>
-      <w:r>
-        <w:rPr>
-          <w:rFonts w:ascii="Arial" w:eastAsia="Arial" w:hAnsi="Arial" w:cs="Arial"/>
-          <w:sz w:val="22"/>
-          <w:szCs w:val="22"/>
-        </w:rPr>
-        <w:t>For each word, rate arousal (1 = very calm/relaxed, 9 = very excited/activated). If you do not know the word, leave the rating blank and mark X below.</w:t>
-      </w:r>
-    </w:p>
-    <w:p>
-      <w:pPr>
-        <w:jc w:val="both"/>
-        <w:rPr>
-          <w:rFonts w:ascii="Arial" w:eastAsia="Arial" w:hAnsi="Arial" w:cs="Arial"/>
-          <w:b/>
-          <w:sz w:val="22"/>
-          <w:szCs w:val="22"/>
-        </w:rPr>
-      </w:pPr>
-    </w:p>
-    <w:p>
-      <w:pPr>
-        <w:pStyle w:val="Heading3"/>
-        <w:rPr>
-          <w:rFonts w:ascii="Arial" w:hAnsi="Arial" w:cs="Arial"/>
-        </w:rPr>
-      </w:pPr>
-      <w:bookmarkStart w:id="16" w:name="_Toc225617964"/>
-      <w:r>
-        <w:rPr>
-          <w:rFonts w:ascii="Arial" w:hAnsi="Arial" w:cs="Arial"/>
-        </w:rPr>
         <w:t>Familiarity task: (</w:t>
       </w:r>
       <w:r>
@@ -4902,7 +6284,6 @@
     </w:p>
     <w:p>
       <w:pPr>
-        <w:jc w:val="both"/>
         <w:rPr>
           <w:rFonts w:ascii="Arial" w:eastAsia="Arial" w:hAnsi="Arial" w:cs="Arial"/>
           <w:sz w:val="22"/>
@@ -4920,7 +6301,6 @@
     </w:p>
     <w:p>
       <w:pPr>
-        <w:jc w:val="both"/>
         <w:rPr>
           <w:rFonts w:ascii="Arial" w:eastAsia="Arial" w:hAnsi="Arial" w:cs="Arial"/>
           <w:sz w:val="22"/>
@@ -4938,7 +6318,6 @@
     </w:p>
     <w:p>
       <w:pPr>
-        <w:jc w:val="both"/>
         <w:rPr>
           <w:rFonts w:ascii="Arial" w:eastAsia="Arial" w:hAnsi="Arial" w:cs="Arial"/>
           <w:sz w:val="22"/>
@@ -4956,7 +6335,6 @@
     </w:p>
     <w:p>
       <w:pPr>
-        <w:jc w:val="both"/>
         <w:rPr>
           <w:rFonts w:ascii="Arial" w:eastAsia="Arial" w:hAnsi="Arial" w:cs="Arial"/>
           <w:sz w:val="22"/>
@@ -4974,7 +6352,6 @@
     </w:p>
     <w:p>
       <w:pPr>
-        <w:jc w:val="both"/>
         <w:rPr>
           <w:rFonts w:ascii="Arial" w:hAnsi="Arial" w:cs="Arial"/>
         </w:rPr>
@@ -4982,7 +6359,6 @@
     </w:p>
     <w:p>
       <w:pPr>
-        <w:jc w:val="both"/>
         <w:rPr>
           <w:rFonts w:ascii="Arial" w:eastAsia="Arial" w:hAnsi="Arial" w:cs="Arial"/>
           <w:b/>
@@ -5004,7 +6380,6 @@
     </w:p>
     <w:p>
       <w:pPr>
-        <w:jc w:val="both"/>
         <w:rPr>
           <w:rFonts w:ascii="Arial" w:eastAsia="Arial" w:hAnsi="Arial" w:cs="Arial"/>
           <w:sz w:val="22"/>
@@ -5022,7 +6397,6 @@
     </w:p>
     <w:p>
       <w:pPr>
-        <w:jc w:val="both"/>
         <w:rPr>
           <w:rFonts w:ascii="Arial" w:eastAsia="Arial" w:hAnsi="Arial" w:cs="Arial"/>
           <w:sz w:val="22"/>
@@ -5040,7 +6414,6 @@
     </w:p>
     <w:p>
       <w:pPr>
-        <w:jc w:val="both"/>
         <w:rPr>
           <w:rFonts w:ascii="Arial" w:eastAsia="Arial" w:hAnsi="Arial" w:cs="Arial"/>
           <w:b/>
@@ -5062,7 +6435,6 @@
     </w:p>
     <w:p>
       <w:pPr>
-        <w:jc w:val="both"/>
         <w:rPr>
           <w:rFonts w:ascii="Arial" w:eastAsia="Arial" w:hAnsi="Arial" w:cs="Arial"/>
           <w:sz w:val="22"/>
@@ -5080,7 +6452,6 @@
     </w:p>
     <w:p>
       <w:pPr>
-        <w:jc w:val="both"/>
         <w:rPr>
           <w:rFonts w:ascii="Arial" w:hAnsi="Arial" w:cs="Arial"/>
         </w:rPr>
@@ -5088,7 +6459,6 @@
     </w:p>
     <w:p>
       <w:pPr>
-        <w:jc w:val="both"/>
         <w:rPr>
           <w:rFonts w:ascii="Arial" w:eastAsia="Arial" w:hAnsi="Arial" w:cs="Arial"/>
           <w:b/>
@@ -5110,7 +6480,6 @@
     </w:p>
     <w:p>
       <w:pPr>
-        <w:jc w:val="both"/>
         <w:rPr>
           <w:rFonts w:ascii="Arial" w:eastAsia="Arial" w:hAnsi="Arial" w:cs="Arial"/>
           <w:sz w:val="22"/>
@@ -5146,25 +6515,24 @@
     </w:p>
     <w:p>
       <w:pPr>
-        <w:jc w:val="both"/>
-        <w:rPr>
-          <w:rFonts w:ascii="Arial" w:eastAsia="Arial" w:hAnsi="Arial" w:cs="Arial"/>
-          <w:sz w:val="22"/>
-          <w:szCs w:val="22"/>
-        </w:rPr>
-      </w:pPr>
-      <w:r>
-        <w:rPr>
-          <w:rFonts w:ascii="Arial" w:eastAsia="Arial" w:hAnsi="Arial" w:cs="Arial"/>
-          <w:sz w:val="22"/>
-          <w:szCs w:val="22"/>
-        </w:rPr>
+        <w:rPr>
+          <w:rFonts w:ascii="Arial" w:eastAsia="Arial" w:hAnsi="Arial" w:cs="Arial"/>
+          <w:sz w:val="22"/>
+          <w:szCs w:val="22"/>
+        </w:rPr>
+      </w:pPr>
+      <w:r>
+        <w:rPr>
+          <w:rFonts w:ascii="Arial" w:eastAsia="Arial" w:hAnsi="Arial" w:cs="Arial"/>
+          <w:sz w:val="22"/>
+          <w:szCs w:val="22"/>
+        </w:rPr>
+        <w:lastRenderedPageBreak/>
         <w:t xml:space="preserve"> </w:t>
       </w:r>
     </w:p>
     <w:p>
       <w:pPr>
-        <w:jc w:val="both"/>
         <w:rPr>
           <w:rFonts w:ascii="Arial" w:eastAsia="Arial" w:hAnsi="Arial" w:cs="Arial"/>
           <w:sz w:val="22"/>
@@ -5182,7 +6550,6 @@
     </w:p>
     <w:p>
       <w:pPr>
-        <w:jc w:val="both"/>
         <w:rPr>
           <w:rFonts w:ascii="Arial" w:eastAsia="Arial" w:hAnsi="Arial" w:cs="Arial"/>
           <w:sz w:val="22"/>
@@ -5200,7 +6567,6 @@
     </w:p>
     <w:p>
       <w:pPr>
-        <w:jc w:val="both"/>
         <w:rPr>
           <w:rFonts w:ascii="Arial" w:eastAsia="Arial" w:hAnsi="Arial" w:cs="Arial"/>
           <w:b/>
@@ -5222,7 +6588,6 @@
     </w:p>
     <w:p>
       <w:pPr>
-        <w:jc w:val="both"/>
         <w:rPr>
           <w:rFonts w:ascii="Arial" w:eastAsia="Arial" w:hAnsi="Arial" w:cs="Arial"/>
           <w:sz w:val="22"/>
@@ -5240,7 +6605,6 @@
     </w:p>
     <w:p>
       <w:pPr>
-        <w:jc w:val="both"/>
         <w:rPr>
           <w:rFonts w:ascii="Arial" w:eastAsia="Arial" w:hAnsi="Arial" w:cs="Arial"/>
           <w:sz w:val="22"/>
@@ -5258,7 +6622,6 @@
     </w:p>
     <w:p>
       <w:pPr>
-        <w:jc w:val="both"/>
         <w:rPr>
           <w:rFonts w:ascii="Arial" w:eastAsia="Arial" w:hAnsi="Arial" w:cs="Arial"/>
           <w:b/>
@@ -5280,7 +6643,6 @@
     </w:p>
     <w:p>
       <w:pPr>
-        <w:jc w:val="both"/>
         <w:rPr>
           <w:rFonts w:ascii="Arial" w:eastAsia="Arial" w:hAnsi="Arial" w:cs="Arial"/>
           <w:sz w:val="22"/>
@@ -5317,7 +6679,6 @@
     <w:p>
       <w:pPr>
         <w:shd w:val="clear" w:color="auto" w:fill="FFFFFF"/>
-        <w:jc w:val="both"/>
         <w:rPr>
           <w:rFonts w:ascii="Arial" w:eastAsia="Arial" w:hAnsi="Arial" w:cs="Arial"/>
           <w:sz w:val="22"/>
@@ -5328,34 +6689,24 @@
     <w:p>
       <w:pPr>
         <w:shd w:val="clear" w:color="auto" w:fill="FFFFFF"/>
-        <w:jc w:val="both"/>
-        <w:rPr>
-          <w:rFonts w:ascii="Arial" w:eastAsia="Arial" w:hAnsi="Arial" w:cs="Arial"/>
-          <w:sz w:val="22"/>
-          <w:szCs w:val="22"/>
-        </w:rPr>
-      </w:pPr>
-      <w:r>
-        <w:rPr>
-          <w:rFonts w:ascii="Arial" w:eastAsia="Arial" w:hAnsi="Arial" w:cs="Arial"/>
-          <w:sz w:val="22"/>
-          <w:szCs w:val="22"/>
-        </w:rPr>
-        <w:t xml:space="preserve">Before your data are shared outside the research team, any potentially identifying information will be removed. The anonymous data may be used by the research team or shared with other researchers, for both related and unrelated research purposes in the future. Your anonymous data may also be made available in online data repositories such as the Open Science Framework (which are free data repositories that require registration to have access), which allow other researchers and interested parties to access </w:t>
-      </w:r>
-      <w:r>
-        <w:rPr>
-          <w:rFonts w:ascii="Arial" w:eastAsia="Arial" w:hAnsi="Arial" w:cs="Arial"/>
-          <w:sz w:val="22"/>
-          <w:szCs w:val="22"/>
-        </w:rPr>
-        <w:t>the data for further analysis.</w:t>
+        <w:rPr>
+          <w:rFonts w:ascii="Arial" w:eastAsia="Arial" w:hAnsi="Arial" w:cs="Arial"/>
+          <w:sz w:val="22"/>
+          <w:szCs w:val="22"/>
+        </w:rPr>
+      </w:pPr>
+      <w:r>
+        <w:rPr>
+          <w:rFonts w:ascii="Arial" w:eastAsia="Arial" w:hAnsi="Arial" w:cs="Arial"/>
+          <w:sz w:val="22"/>
+          <w:szCs w:val="22"/>
+        </w:rPr>
+        <w:t>Before your data are shared outside the research team, any potentially identifying information will be removed. The anonymous data may be used by the research team or shared with other researchers, for both related and unrelated research purposes in the future. Your anonymous data may also be made available in online data repositories such as the Open Science Framework (which are free data repositories that require registration to have access), which allow other researchers and interested parties to access the data for further analysis.</w:t>
       </w:r>
     </w:p>
     <w:p>
       <w:pPr>
         <w:shd w:val="clear" w:color="auto" w:fill="FFFFFF"/>
-        <w:jc w:val="both"/>
         <w:rPr>
           <w:rFonts w:ascii="Arial" w:eastAsia="Arial" w:hAnsi="Arial" w:cs="Arial"/>
           <w:sz w:val="22"/>
@@ -5366,7 +6717,6 @@
     <w:p>
       <w:pPr>
         <w:shd w:val="clear" w:color="auto" w:fill="FFFFFF"/>
-        <w:jc w:val="both"/>
         <w:rPr>
           <w:rFonts w:ascii="Arial" w:eastAsia="Arial" w:hAnsi="Arial" w:cs="Arial"/>
           <w:b/>
@@ -5386,7 +6736,6 @@
     </w:p>
     <w:p>
       <w:pPr>
-        <w:jc w:val="both"/>
         <w:rPr>
           <w:rFonts w:ascii="Arial" w:eastAsia="Arial" w:hAnsi="Arial" w:cs="Arial"/>
           <w:sz w:val="22"/>
@@ -5404,7 +6753,6 @@
     </w:p>
     <w:p>
       <w:pPr>
-        <w:jc w:val="both"/>
         <w:rPr>
           <w:rFonts w:ascii="Arial" w:eastAsia="Arial" w:hAnsi="Arial" w:cs="Arial"/>
           <w:b/>
@@ -5426,7 +6774,6 @@
     </w:p>
     <w:p>
       <w:pPr>
-        <w:jc w:val="both"/>
         <w:rPr>
           <w:rFonts w:ascii="Arial" w:eastAsia="Arial" w:hAnsi="Arial" w:cs="Arial"/>
           <w:b/>
@@ -5446,7 +6793,6 @@
     </w:p>
     <w:p>
       <w:pPr>
-        <w:jc w:val="both"/>
         <w:rPr>
           <w:rFonts w:ascii="Arial" w:eastAsia="Arial" w:hAnsi="Arial" w:cs="Arial"/>
           <w:sz w:val="22"/>
@@ -5464,7 +6810,6 @@
     </w:p>
     <w:p>
       <w:pPr>
-        <w:jc w:val="both"/>
         <w:rPr>
           <w:rFonts w:ascii="Arial" w:eastAsia="Arial" w:hAnsi="Arial" w:cs="Arial"/>
           <w:sz w:val="22"/>
@@ -5482,7 +6827,6 @@
     </w:p>
     <w:p>
       <w:pPr>
-        <w:jc w:val="both"/>
         <w:rPr>
           <w:rFonts w:ascii="Arial" w:eastAsia="Arial" w:hAnsi="Arial" w:cs="Arial"/>
           <w:b/>
@@ -5504,7 +6848,6 @@
     </w:p>
     <w:p>
       <w:pPr>
-        <w:jc w:val="both"/>
         <w:rPr>
           <w:rFonts w:ascii="Arial" w:eastAsia="Arial" w:hAnsi="Arial" w:cs="Arial"/>
           <w:sz w:val="22"/>
@@ -5558,7 +6901,6 @@
     </w:p>
     <w:p>
       <w:pPr>
-        <w:jc w:val="both"/>
         <w:rPr>
           <w:rFonts w:ascii="Arial" w:eastAsia="Arial" w:hAnsi="Arial" w:cs="Arial"/>
           <w:sz w:val="22"/>
@@ -5576,7 +6918,6 @@
     </w:p>
     <w:p>
       <w:pPr>
-        <w:jc w:val="both"/>
         <w:rPr>
           <w:rFonts w:ascii="Arial" w:eastAsia="Arial" w:hAnsi="Arial" w:cs="Arial"/>
           <w:b/>
@@ -5598,26 +6939,23 @@
     </w:p>
     <w:p>
       <w:pPr>
-        <w:jc w:val="both"/>
-        <w:rPr>
-          <w:rFonts w:ascii="Arial" w:eastAsia="Arial" w:hAnsi="Arial" w:cs="Arial"/>
-          <w:sz w:val="22"/>
-          <w:szCs w:val="22"/>
-        </w:rPr>
-      </w:pPr>
-      <w:r>
-        <w:rPr>
-          <w:rFonts w:ascii="Arial" w:eastAsia="Arial" w:hAnsi="Arial" w:cs="Arial"/>
-          <w:sz w:val="22"/>
-          <w:szCs w:val="22"/>
-        </w:rPr>
-        <w:lastRenderedPageBreak/>
+        <w:rPr>
+          <w:rFonts w:ascii="Arial" w:eastAsia="Arial" w:hAnsi="Arial" w:cs="Arial"/>
+          <w:sz w:val="22"/>
+          <w:szCs w:val="22"/>
+        </w:rPr>
+      </w:pPr>
+      <w:r>
+        <w:rPr>
+          <w:rFonts w:ascii="Arial" w:eastAsia="Arial" w:hAnsi="Arial" w:cs="Arial"/>
+          <w:sz w:val="22"/>
+          <w:szCs w:val="22"/>
+        </w:rPr>
         <w:t xml:space="preserve">This study has been reviewed by Harrisburg University of Science and Technology’s Institutional Review Board (IRB).  The IRB has determined that this study fulfills the human research subject protections obligations required by state and federal law and University policies. </w:t>
       </w:r>
     </w:p>
     <w:p>
       <w:pPr>
-        <w:jc w:val="both"/>
         <w:rPr>
           <w:rFonts w:ascii="Arial" w:eastAsia="Arial" w:hAnsi="Arial" w:cs="Arial"/>
           <w:sz w:val="22"/>
@@ -5635,7 +6973,6 @@
     </w:p>
     <w:p>
       <w:pPr>
-        <w:jc w:val="both"/>
         <w:rPr>
           <w:rFonts w:ascii="Arial" w:eastAsia="Arial" w:hAnsi="Arial" w:cs="Arial"/>
           <w:b/>
@@ -5674,8 +7011,97 @@
 </file>
 
 <file path=word/numbering.xml><?xml version="1.0" encoding="utf-8"?>
-<w:numbering xmlns:wpc="http://schemas.microsoft.com/office/word/2010/wordprocessingCanvas" xmlns:cx="http://schemas.microsoft.com/office/drawing/2014/chartex" xmlns:cx1="http://schemas.microsoft.com/office/drawing/2015/9/8/chartex" xmlns:cx2="http://schemas.microsoft.com/office/drawing/2015/10/21/chartex" xmlns:cx3="http://schemas.microsoft.com/office/drawing/2016/5/9/chartex" xmlns:cx4="http://schemas.microsoft.com/office/drawing/2016/5/10/chartex" xmlns:cx5="http://schemas.microsoft.com/office/drawing/2016/5/11/chartex" xmlns:cx6="http://schemas.microsoft.com/office/drawing/2016/5/12/chartex" xmlns:cx7="http://schemas.microsoft.com/office/drawing/2016/5/13/chartex" xmlns:cx8="http://schemas.microsoft.com/office/drawing/2016/5/14/chartex" xmlns:mc="http://schemas.openxmlformats.org/markup-compatibility/2006" xmlns:aink="http://schemas.microsoft.com/office/drawing/2016/ink" xmlns:am3d="http://schemas.microsoft.com/office/drawing/2017/model3d" xmlns:o="urn:schemas-microsoft-com:office:office" xmlns:oel="http://schemas.microsoft.com/office/2019/extlst" xmlns:r="http://schemas.openxmlformats.org/officeDocument/2006/relationships" xmlns:m="http://schemas.openxmlformats.org/officeDocument/2006/math" xmlns:v="urn:schemas-microsoft-com:vml" xmlns:wp14="http://schemas.microsoft.com/office/word/2010/wordprocessingDrawing" xmlns:wp="http://schemas.openxmlformats.org/drawingml/2006/wordprocessingDrawing" xmlns:w10="urn:schemas-microsoft-com:office:word" xmlns:w="http://schemas.openxmlformats.org/wordprocessingml/2006/main" xmlns:w14="http://schemas.microsoft.com/office/word/2010/wordml" xmlns:w15="http://schemas.microsoft.com/office/word/2012/wordml" xmlns:w16cex="http://schemas.microsoft.com/office/word/2018/wordml/cex" xmlns:w16cid="http://schemas.microsoft.com/office/word/2016/wordml/cid" xmlns:w16="http://schemas.microsoft.com/office/word/2018/wordml" xmlns:w16du="http://schemas.microsoft.com/office/word/2023/wordml/word16du" xmlns:w16sdtdh="http://schemas.microsoft.com/office/word/2020/wordml/sdtdatahash" xmlns:w16sdtfl="http://schemas.microsoft.com/office/word/2024/wordml/sdtformatlock" xmlns:w16se="http://schemas.microsoft.com/office/word/2015/wordml/symex" xmlns:wpg="http://schemas.microsoft.com/office/word/2010/wordprocessingGroup" xmlns:wpi="http://schemas.microsoft.com/office/word/2010/wordprocessingInk" xmlns:wne="http://schemas.microsoft.com/office/word/2006/wordml" xmlns:wps="http://schemas.microsoft.com/office/word/2010/wordprocessingShape" mc:Ignorable="w14 w15 w16se w16cid w16 w16cex w16sdtdh w16sdtfl w16du wp14">
+<w:numbering xmlns:wpc="http://schemas.microsoft.com/office/word/2010/wordprocessingCanvas" xmlns:cx="http://schemas.microsoft.com/office/drawing/2014/chartex" xmlns:cx1="http://schemas.microsoft.com/office/drawing/2015/9/8/chartex" xmlns:cx2="http://schemas.microsoft.com/office/drawing/2015/10/21/chartex" xmlns:cx3="http://schemas.microsoft.com/office/drawing/2016/5/9/chartex" xmlns:cx4="http://schemas.microsoft.com/office/drawing/2016/5/10/chartex" xmlns:cx5="http://schemas.microsoft.com/office/drawing/2016/5/11/chartex" xmlns:cx6="http://schemas.microsoft.com/office/drawing/2016/5/12/chartex" xmlns:cx7="http://schemas.microsoft.com/office/drawing/2016/5/13/chartex" xmlns:cx8="http://schemas.microsoft.com/office/drawing/2016/5/14/chartex" xmlns:mc="http://schemas.openxmlformats.org/markup-compatibility/2006" xmlns:m="http://schemas.openxmlformats.org/officeDocument/2006/math" xmlns:aink="http://schemas.microsoft.com/office/drawing/2016/ink" xmlns:am3d="http://schemas.microsoft.com/office/drawing/2017/model3d" xmlns:oel="http://schemas.microsoft.com/office/2019/extlst" xmlns:r="http://schemas.openxmlformats.org/officeDocument/2006/relationships" xmlns:wp14="http://schemas.microsoft.com/office/word/2010/wordprocessingDrawing" xmlns:wp="http://schemas.openxmlformats.org/drawingml/2006/wordprocessingDrawing" xmlns:wpg="http://schemas.microsoft.com/office/word/2010/wordprocessingGroup" xmlns:wpi="http://schemas.microsoft.com/office/word/2010/wordprocessingInk" xmlns:wps="http://schemas.microsoft.com/office/word/2010/wordprocessingShape" xmlns:o="urn:schemas-microsoft-com:office:office" xmlns:v="urn:schemas-microsoft-com:vml" xmlns:w10="urn:schemas-microsoft-com:office:word" xmlns:w="http://schemas.openxmlformats.org/wordprocessingml/2006/main" xmlns:w14="http://schemas.microsoft.com/office/word/2010/wordml" xmlns:w15="http://schemas.microsoft.com/office/word/2012/wordml" xmlns:w16cei="http://schemas.microsoft.com/office/word/2026/wordml/cei" xmlns:w16cex="http://schemas.microsoft.com/office/word/2018/wordml/cex" xmlns:w16cid="http://schemas.microsoft.com/office/word/2016/wordml/cid" xmlns:w16="http://schemas.microsoft.com/office/word/2018/wordml" xmlns:w16sdtdh="http://schemas.microsoft.com/office/word/2020/wordml/sdtdatahash" xmlns:w16sdtfl="http://schemas.microsoft.com/office/word/2024/wordml/sdtformatlock" xmlns:w16se="http://schemas.microsoft.com/office/word/2015/wordml/symex" xmlns:w16du="http://schemas.microsoft.com/office/word/2023/wordml/word16du" xmlns:wne="http://schemas.microsoft.com/office/word/2006/wordml" mc:Ignorable="w14 w15 w16se w16cid w16 w16cex w16sdtdh w16sdtfl w16du wp14">
   <w:abstractNum w:abstractNumId="0" w15:restartNumberingAfterBreak="0">
+    <w:nsid w:val="3F3D3F67"/>
+    <w:multiLevelType w:val="hybridMultilevel"/>
+    <w:tmpl w:val="C45CA074"/>
+    <w:lvl w:ilvl="0" w:tplc="0409000F">
+      <w:start w:val="1"/>
+      <w:numFmt w:val="decimal"/>
+      <w:lvlText w:val="%1."/>
+      <w:lvlJc w:val="left"/>
+      <w:pPr>
+        <w:ind w:left="720" w:hanging="360"/>
+      </w:pPr>
+      <w:rPr>
+        <w:rFonts w:hint="default"/>
+      </w:rPr>
+    </w:lvl>
+    <w:lvl w:ilvl="1" w:tplc="04090019" w:tentative="1">
+      <w:start w:val="1"/>
+      <w:numFmt w:val="lowerLetter"/>
+      <w:lvlText w:val="%2."/>
+      <w:lvlJc w:val="left"/>
+      <w:pPr>
+        <w:ind w:left="1440" w:hanging="360"/>
+      </w:pPr>
+    </w:lvl>
+    <w:lvl w:ilvl="2" w:tplc="0409001B" w:tentative="1">
+      <w:start w:val="1"/>
+      <w:numFmt w:val="lowerRoman"/>
+      <w:lvlText w:val="%3."/>
+      <w:lvlJc w:val="right"/>
+      <w:pPr>
+        <w:ind w:left="2160" w:hanging="180"/>
+      </w:pPr>
+    </w:lvl>
+    <w:lvl w:ilvl="3" w:tplc="0409000F" w:tentative="1">
+      <w:start w:val="1"/>
+      <w:numFmt w:val="decimal"/>
+      <w:lvlText w:val="%4."/>
+      <w:lvlJc w:val="left"/>
+      <w:pPr>
+        <w:ind w:left="2880" w:hanging="360"/>
+      </w:pPr>
+    </w:lvl>
+    <w:lvl w:ilvl="4" w:tplc="04090019" w:tentative="1">
+      <w:start w:val="1"/>
+      <w:numFmt w:val="lowerLetter"/>
+      <w:lvlText w:val="%5."/>
+      <w:lvlJc w:val="left"/>
+      <w:pPr>
+        <w:ind w:left="3600" w:hanging="360"/>
+      </w:pPr>
+    </w:lvl>
+    <w:lvl w:ilvl="5" w:tplc="0409001B" w:tentative="1">
+      <w:start w:val="1"/>
+      <w:numFmt w:val="lowerRoman"/>
+      <w:lvlText w:val="%6."/>
+      <w:lvlJc w:val="right"/>
+      <w:pPr>
+        <w:ind w:left="4320" w:hanging="180"/>
+      </w:pPr>
+    </w:lvl>
+    <w:lvl w:ilvl="6" w:tplc="0409000F" w:tentative="1">
+      <w:start w:val="1"/>
+      <w:numFmt w:val="decimal"/>
+      <w:lvlText w:val="%7."/>
+      <w:lvlJc w:val="left"/>
+      <w:pPr>
+        <w:ind w:left="5040" w:hanging="360"/>
+      </w:pPr>
+    </w:lvl>
+    <w:lvl w:ilvl="7" w:tplc="04090019" w:tentative="1">
+      <w:start w:val="1"/>
+      <w:numFmt w:val="lowerLetter"/>
+      <w:lvlText w:val="%8."/>
+      <w:lvlJc w:val="left"/>
+      <w:pPr>
+        <w:ind w:left="5760" w:hanging="360"/>
+      </w:pPr>
+    </w:lvl>
+    <w:lvl w:ilvl="8" w:tplc="0409001B" w:tentative="1">
+      <w:start w:val="1"/>
+      <w:numFmt w:val="lowerRoman"/>
+      <w:lvlText w:val="%9."/>
+      <w:lvlJc w:val="right"/>
+      <w:pPr>
+        <w:ind w:left="6480" w:hanging="180"/>
+      </w:pPr>
+    </w:lvl>
+  </w:abstractNum>
+  <w:abstractNum w:abstractNumId="1" w15:restartNumberingAfterBreak="0">
     <w:nsid w:val="6F630856"/>
     <w:multiLevelType w:val="multilevel"/>
     <w:tmpl w:val="1868D08C"/>
@@ -5789,13 +7215,16 @@
     </w:lvl>
   </w:abstractNum>
   <w:num w:numId="1" w16cid:durableId="1402479508">
+    <w:abstractNumId w:val="1"/>
+  </w:num>
+  <w:num w:numId="2" w16cid:durableId="484010273">
     <w:abstractNumId w:val="0"/>
   </w:num>
 </w:numbering>
 </file>
 
 <file path=word/styles.xml><?xml version="1.0" encoding="utf-8"?>
-<w:styles xmlns:mc="http://schemas.openxmlformats.org/markup-compatibility/2006" xmlns:r="http://schemas.openxmlformats.org/officeDocument/2006/relationships" xmlns:w="http://schemas.openxmlformats.org/wordprocessingml/2006/main" xmlns:w14="http://schemas.microsoft.com/office/word/2010/wordml" xmlns:w15="http://schemas.microsoft.com/office/word/2012/wordml" xmlns:w16cex="http://schemas.microsoft.com/office/word/2018/wordml/cex" xmlns:w16cid="http://schemas.microsoft.com/office/word/2016/wordml/cid" xmlns:w16="http://schemas.microsoft.com/office/word/2018/wordml" xmlns:w16du="http://schemas.microsoft.com/office/word/2023/wordml/word16du" xmlns:w16sdtdh="http://schemas.microsoft.com/office/word/2020/wordml/sdtdatahash" xmlns:w16sdtfl="http://schemas.microsoft.com/office/word/2024/wordml/sdtformatlock" xmlns:w16se="http://schemas.microsoft.com/office/word/2015/wordml/symex" mc:Ignorable="w14 w15 w16se w16cid w16 w16cex w16sdtdh w16sdtfl w16du">
+<w:styles xmlns:mc="http://schemas.openxmlformats.org/markup-compatibility/2006" xmlns:r="http://schemas.openxmlformats.org/officeDocument/2006/relationships" xmlns:w="http://schemas.openxmlformats.org/wordprocessingml/2006/main" xmlns:w14="http://schemas.microsoft.com/office/word/2010/wordml" xmlns:w15="http://schemas.microsoft.com/office/word/2012/wordml" xmlns:w16cex="http://schemas.microsoft.com/office/word/2018/wordml/cex" xmlns:w16cid="http://schemas.microsoft.com/office/word/2016/wordml/cid" xmlns:w16="http://schemas.microsoft.com/office/word/2018/wordml" xmlns:w16sdtdh="http://schemas.microsoft.com/office/word/2020/wordml/sdtdatahash" xmlns:w16sdtfl="http://schemas.microsoft.com/office/word/2024/wordml/sdtformatlock" xmlns:w16se="http://schemas.microsoft.com/office/word/2015/wordml/symex" xmlns:w16du="http://schemas.microsoft.com/office/word/2023/wordml/word16du" mc:Ignorable="w14 w15 w16se w16cid w16 w16cex w16sdtdh w16sdtfl w16du">
   <w:docDefaults>
     <w:rPrDefault>
       <w:rPr>
@@ -6517,6 +7946,45 @@
       <w:bCs/>
     </w:rPr>
   </w:style>
+  <w:style w:type="paragraph" w:customStyle="1" w:styleId="font-claude-response-body">
+    <w:name w:val="font-claude-response-body"/>
+    <w:basedOn w:val="Normal"/>
+    <w:rsid w:val="0093218B"/>
+    <w:pPr>
+      <w:spacing w:before="100" w:beforeAutospacing="1" w:after="100" w:afterAutospacing="1"/>
+    </w:pPr>
+    <w:rPr>
+      <w:rFonts w:ascii="Times New Roman" w:eastAsia="Times New Roman" w:hAnsi="Times New Roman" w:cs="Times New Roman"/>
+    </w:rPr>
+  </w:style>
+  <w:style w:type="character" w:styleId="FollowedHyperlink">
+    <w:name w:val="FollowedHyperlink"/>
+    <w:basedOn w:val="DefaultParagraphFont"/>
+    <w:uiPriority w:val="99"/>
+    <w:semiHidden/>
+    <w:unhideWhenUsed/>
+    <w:rsid w:val="007B2AC3"/>
+    <w:rPr>
+      <w:color w:val="800080" w:themeColor="followedHyperlink"/>
+      <w:u w:val="single"/>
+    </w:rPr>
+  </w:style>
+  <w:style w:type="character" w:customStyle="1" w:styleId="text-format-content">
+    <w:name w:val="text-format-content"/>
+    <w:basedOn w:val="DefaultParagraphFont"/>
+    <w:rsid w:val="007B2AC3"/>
+  </w:style>
+  <w:style w:type="paragraph" w:styleId="ListParagraph">
+    <w:name w:val="List Paragraph"/>
+    <w:basedOn w:val="Normal"/>
+    <w:uiPriority w:val="34"/>
+    <w:qFormat/>
+    <w:rsid w:val="00FC2BFE"/>
+    <w:pPr>
+      <w:ind w:left="720"/>
+      <w:contextualSpacing/>
+    </w:pPr>
+  </w:style>
 </w:styles>
 </file>
 

</xml_diff>